<commit_message>
manuscript: fix caption spacing
</commit_message>
<xml_diff>
--- a/paper/manuscript.docx
+++ b/paper/manuscript.docx
@@ -6147,7 +6147,7 @@
     </w:p>
     <w:p>
       <w:pPr>
-        <w:spacing w:after="60" w:before="60" w:line="240"/>
+        <w:spacing w:after="60" w:before="60" w:line="480"/>
       </w:pPr>
       <w:r>
         <w:rPr>
@@ -6172,7 +6172,7 @@
     </w:p>
     <w:p>
       <w:pPr>
-        <w:spacing w:after="180" w:before="0" w:line="240"/>
+        <w:spacing w:after="180" w:before="0" w:line="480"/>
         <w:jc w:val="both"/>
       </w:pPr>
       <w:r>
@@ -6242,7 +6242,7 @@
     </w:p>
     <w:p>
       <w:pPr>
-        <w:spacing w:after="60" w:before="60" w:line="240"/>
+        <w:spacing w:after="60" w:before="60" w:line="480"/>
       </w:pPr>
       <w:r>
         <w:rPr>
@@ -6267,7 +6267,7 @@
     </w:p>
     <w:p>
       <w:pPr>
-        <w:spacing w:after="180" w:before="0" w:line="240"/>
+        <w:spacing w:after="180" w:before="0" w:line="480"/>
         <w:jc w:val="both"/>
       </w:pPr>
       <w:r>
@@ -6351,7 +6351,7 @@
     </w:p>
     <w:p>
       <w:pPr>
-        <w:spacing w:after="60" w:before="60" w:line="240"/>
+        <w:spacing w:after="60" w:before="60" w:line="480"/>
       </w:pPr>
       <w:r>
         <w:rPr>
@@ -6376,7 +6376,7 @@
     </w:p>
     <w:p>
       <w:pPr>
-        <w:spacing w:after="180" w:before="0" w:line="240"/>
+        <w:spacing w:after="180" w:before="0" w:line="480"/>
         <w:jc w:val="both"/>
       </w:pPr>
       <w:r>
@@ -6502,7 +6502,7 @@
     </w:p>
     <w:p>
       <w:pPr>
-        <w:spacing w:after="60" w:before="60" w:line="240"/>
+        <w:spacing w:after="60" w:before="60" w:line="480"/>
       </w:pPr>
       <w:r>
         <w:rPr>
@@ -7661,7 +7661,7 @@
     </w:tbl>
     <w:p>
       <w:pPr>
-        <w:spacing w:after="180" w:before="0" w:line="240"/>
+        <w:spacing w:after="180" w:before="0" w:line="480"/>
         <w:jc w:val="both"/>
       </w:pPr>
       <w:r>
@@ -7771,7 +7771,7 @@
     </w:p>
     <w:p>
       <w:pPr>
-        <w:spacing w:after="60" w:before="60" w:line="240"/>
+        <w:spacing w:after="60" w:before="60" w:line="480"/>
       </w:pPr>
       <w:r>
         <w:rPr>
@@ -8616,7 +8616,7 @@
     </w:tbl>
     <w:p>
       <w:pPr>
-        <w:spacing w:after="180" w:before="0" w:line="240"/>
+        <w:spacing w:after="180" w:before="0" w:line="480"/>
         <w:jc w:val="both"/>
       </w:pPr>
       <w:r>

</xml_diff>

<commit_message>
tighten the prose and justify the lag order
</commit_message>
<xml_diff>
--- a/paper/manuscript.docx
+++ b/paper/manuscript.docx
@@ -169,7 +169,7 @@
           <w:sz w:val="24"/>
           <w:szCs w:val="24"/>
         </w:rPr>
-        <w:t xml:space="preserve">A common implicit model in mood-intervention research is that affect improves when beneficial inputs are added: better sleep, less stress, optimized nutrition, pharmacological support. Mood becomes a passive output of external conditions, and intervention becomes a question of which conditions to optimize. That frame is productive at the population level, and the present study does not contest it there. What it contests is the assumption that the same frame should organize an individual person’s account of her own affective dynamics.</w:t>
+        <w:t>A common implicit model in mood-intervention research is that affect improves when beneficial inputs are added: better sleep, less stress, optimized nutrition, pharmacological support. Mood becomes a passive output of external conditions, and intervention becomes a question of which conditions to optimize. What this study contests is the assumption that the same frame should organize an individual person’s account of her own affective dynamics.</w:t>
       </w:r>
     </w:p>
     <w:p>
@@ -241,7 +241,7 @@
           <w:sz w:val="24"/>
           <w:szCs w:val="24"/>
         </w:rPr>
-        <w:t xml:space="preserve">The first is that perceived agency, the felt sense of intentional goal-directed action, is a primary internal driver of affective state. This draws on Bandura’s (1989, 2001, 2006) social cognitive theory of human agency, in which persons exercise causal influence over their own functioning through intentional, self-regulating action, and on Carver and Scheier’s (1990, 1998) control-process model, which specifies that affect is generated by the perceived rate of progress toward active goals.</w:t>
+        <w:t>The first is that perceived agency, the felt sense of intentional goal-directed action, is a primary internal driver of affective state. This draws on Bandura’s (1989, 2001, 2006) social cognitive theory of human agency, in which persons exercise causal influence over their own functioning through intentional, self-regulating action. It also draws on Carver and Scheier’s (1990, 1998) control-process model, which specifies that affect is generated by the perceived rate of progress toward active goals.</w:t>
       </w:r>
     </w:p>
     <w:p>
@@ -269,7 +269,7 @@
           <w:sz w:val="24"/>
           <w:szCs w:val="24"/>
         </w:rPr>
-        <w:t xml:space="preserve">Both constructs carry divergent meanings across traditions, so their scope here is delimited. Agency is used only as the participant’s moment-to-moment phenomenological sense of intentional progress toward immediate task goals, a signal the system tracks and reports. It is not used in its sociological sense of acting within social structure (Giddens, 1984), nor in the philosophical sense concerning the veridicality of felt authorship (Wegner, 2002; Synofzik et al., 2008). Metacognition is likewise restricted to in-the-moment self-monitoring in the Nelson and Narens sense.</w:t>
+        <w:t>Both constructs carry divergent meanings across traditions, so their scope here is delimited. Agency is used only as the participant’s moment-to-moment phenomenological sense of intentional progress toward immediate task goals, a signal the system tracks and reports. Metacognition is likewise restricted to in-the-moment self-monitoring in the Nelson and Narens sense.</w:t>
       </w:r>
     </w:p>
     <w:p>
@@ -341,7 +341,7 @@
           <w:sz w:val="24"/>
           <w:szCs w:val="24"/>
         </w:rPr>
-        <w:t xml:space="preserve">This carries a methodological consequence that matters for how the results below should be read. A small or non-significant probe effect is a system-identification result, not a design failure. The conventional reading, that the design lacked power, presupposes a framework in which the intervention is a treatment whose efficacy is being assayed. That is not the framework here. The evidential question is where this system is sensitive and where it is not, and a probe that moves nothing on the mean has located one of those boundaries, provided the bound itself is estimated. Section 2.5.11 states how that bound was obtained. The control-theoretic vocabulary used here, including the language of system identification, is intended in an analytic and conceptual sense, as a way of organizing dynamical questions about a single person across time. It is not a claim that these analyses estimate engineering transfer functions or recover a closed-form physical plant model.</w:t>
+        <w:t xml:space="preserve">This carries a methodological consequence that matters for how the results below should be read. The conventional reading, that the design lacked power, presupposes a framework in which the intervention is a treatment whose efficacy is being assayed. That is not the framework here. The evidential question is where this system is sensitive and where it is not, and a probe that moves nothing on the mean has located one of those boundaries, provided the bound itself is estimated. Section 2.5.11 states how that bound was obtained. The control-theoretic vocabulary used here, including the language of system identification, is intended in an analytic and conceptual sense, as a way of organizing dynamical questions about a single person across time. </w:t>
       </w:r>
     </w:p>
     <w:p>
@@ -549,7 +549,7 @@
           <w:sz w:val="24"/>
           <w:szCs w:val="24"/>
         </w:rPr>
-        <w:t xml:space="preserve">The participant has been taking a continuous hormonal contraceptive (drospirenone/ethinyl estradiol; trade name YAZ) for an extended period prior to and throughout the study, prescribed for the management of premenstrual mood symptoms. This pharmacological background creates a stable hormonal regime, suppressing the cyclical affective fluctuation associated with the natural menstrual cycle. This stabilization is not an intervention in the present study. It is a fixed background parameter that reduces baseline affective noise, increasing the signal-to-noise ratio for detecting effects of the primary manipulation.</w:t>
+        <w:t>The participant has been taking a continuous hormonal contraceptive (drospirenone/ethinyl estradiol; trade name YAZ) for an extended period prior to and throughout the study, prescribed for the management of premenstrual mood symptoms. This pharmacological background creates a stable hormonal regime, suppressing the cyclical affective fluctuation associated with the natural menstrual cycle. It is a fixed background parameter that reduces baseline affective noise, increasing the signal-to-noise ratio for detecting effects of the primary manipulation.</w:t>
       </w:r>
     </w:p>
     <w:p>
@@ -984,6 +984,36 @@
         </w:rPr>
         <w:t>The autoregressive coefficient φ estimates day-to-day emotional inertia: the degree to which mood persists across consecutive days. Each β estimates the marginal contribution of its predictor over and above the system’s own carryover. Models M1 and M2 were fit on the Day 18–70 subsample (n = 53 days) to ensure that all three models were estimated on identical data, permitting incremental-R² comparison.</w:t>
       </w:r>
+      <w:r>
+        <w:rPr>
+          <w:i w:val="0"/>
+        </w:rPr>
+        <w:t xml:space="preserve"> A second autoregressive lag added no explanatory value at the daily level (AR(2) φ₂ = 0.13, 95% CI [−0.12, 0.38]; likelihood-ratio test χ²(1) = 1.05, </w:t>
+      </w:r>
+      <w:r>
+        <w:rPr>
+          <w:i/>
+        </w:rPr>
+        <w:t>p</w:t>
+      </w:r>
+      <w:r>
+        <w:rPr>
+          <w:i w:val="0"/>
+        </w:rPr>
+        <w:t xml:space="preserve"> = .305; AIC and BIC both favored the first-order model), and a Ljung-Box test found no residual autocorrelation in the AR(1) residuals (lag 10, </w:t>
+      </w:r>
+      <w:r>
+        <w:rPr>
+          <w:i/>
+        </w:rPr>
+        <w:t>p</w:t>
+      </w:r>
+      <w:r>
+        <w:rPr>
+          <w:i w:val="0"/>
+        </w:rPr>
+        <w:t xml:space="preserve"> = .675), supporting the first-order specification.</w:t>
+      </w:r>
     </w:p>
     <w:p>
       <w:pPr>
@@ -1283,7 +1313,7 @@
           <w:sz w:val="24"/>
           <w:szCs w:val="24"/>
         </w:rPr>
-        <w:t xml:space="preserve">In addition to the mean-shift analyses above, three indices of mood variability were computed by condition: (a) the standard deviation of daily mood within each condition; (b) the mean squared successive difference (MSSD; Jahng, Wood, &amp; Trull, 2008), computed within contiguous within-condition runs of EMA observations and averaged across runs; and (c) the Brown–Forsythe Levene test of homogeneity of variance across conditions. A complementary heteroskedasticity model was fit by regressing the log-squared residuals from M2 on the melatonin indicator: log(ε²ₜ) = α₀ + α₁ · melatoninₜ + uₜ. A negative α₁ coefficient indicates that the model’s residual variance is smaller on melatonin days than on control days, consistent with a stability-enhancing rather than level-shifting effect of the probe.</w:t>
+        <w:t>In addition to the mean-shift analyses above, three indices of mood variability were computed by condition: (a) the standard deviation of daily mood within each condition; (b) the mean squared successive difference (MSSD; Jahng, Wood, &amp; Trull, 2008), computed within contiguous within-condition runs of EMA observations and averaged across runs. The third was (c) the Brown–Forsythe Levene test of homogeneity of variance across conditions. A complementary heteroskedasticity model was fit by regressing the log-squared residuals from M2 on the melatonin indicator: log(ε²ₜ) = α₀ + α₁ · melatoninₜ + uₜ. A negative α₁ coefficient indicates that the model’s residual variance is smaller on melatonin days than on control days, consistent with a stability-enhancing rather than level-shifting effect of the probe.</w:t>
       </w:r>
     </w:p>
     <w:p>
@@ -1346,7 +1376,7 @@
           <w:sz w:val="24"/>
           <w:szCs w:val="24"/>
         </w:rPr>
-        <w:t xml:space="preserve">The implied φ in each condition is then φ₀ (control) and φ₀ + δ (melatonin). A negative δ would indicate that perturbations decay faster on melatonin days, that is, that the system recovers more quickly. Given the limited sample size for an interaction of this kind, this analysis is reported as a sensitivity check rather than a primary test.</w:t>
+        <w:t>The implied φ in each condition is then φ₀ (control) and φ₀ + δ (melatonin). A negative δ would indicate that perturbations decay faster on melatonin days, that is, that the system recovers more quickly. This analysis is reported as a sensitivity check rather than a primary test.</w:t>
       </w:r>
     </w:p>
     <w:p>
@@ -1410,7 +1440,7 @@
           <w:sz w:val="24"/>
           <w:szCs w:val="24"/>
         </w:rPr>
-        <w:t xml:space="preserve">As a robustness check, the primary M2 regression (Section 2.5.1) was re-estimated in a Bayesian framework using brms (Bürkner, 2017) in R, with Stan used for MCMC posterior sampling. Continuous variables (mood, lagged mood, agency, metacognitive awareness) were standardized prior to fitting; the melatonin indicator was retained on its original 0/1 scale. Weakly informative priors were placed on the regression coefficients (Normal(0, 1)), the intercept (Student-t(3, 0, 2.5)), and the residual standard deviation (Exponential(1)). Four chains were run for 4,000 iterations each with 1,000 warmup iterations and adapt_delta = 0.95, yielding 12,000 post-warmup posterior draws per parameter. A secondary Bayesian model additionally included a melatonin × metacognition interaction to provide a Bayesian counterpart of the metacontrol test (Section 2.5.5; Appendix C). This analysis is not a replacement for the primary frequentist results; it is a robustness check evaluating whether the posterior pattern reproduces the main conclusion that internal behavioral drivers account for substantially more daily mood variation than the external melatonin probe.</w:t>
+        <w:t>As a robustness check, the primary M2 regression (Section 2.5.1) was re-estimated in a Bayesian framework using brms (Bürkner, 2017) in R, with Stan used for MCMC posterior sampling. Continuous variables (mood, lagged mood, agency, metacognitive awareness) were standardized prior to fitting; the melatonin indicator was retained on its original 0/1 scale. Weakly informative priors (Normal(0, 1) coefficients, Student-t(3, 0, 2.5) intercept, Exponential(1) residual SD) were used, with four chains of 4,000 iterations (1,000 warmup, adapt_delta = 0.95) yielding 12,000 post-warmup draws per parameter. A secondary Bayesian model additionally included a melatonin × metacognition interaction to provide a Bayesian counterpart of the metacontrol test (Section 2.5.5; Appendix C). It serves as a robustness check on the same conclusion: that internal behavioral drivers account for substantially more daily mood variation than the external probe.</w:t>
       </w:r>
     </w:p>
     <w:p>
@@ -1934,7 +1964,7 @@
           <w:sz w:val="24"/>
           <w:szCs w:val="24"/>
         </w:rPr>
-        <w:t>In the full M2 model, agency emerged as a strong positive predictor of daily mood (β = 0.53, 95% CI [0.32, 0.73], p &lt; .001), as did metacognition (β = 0.45, 95% CI [0.22, 0.69], p &lt; .001). The melatonin coefficient was estimated near zero (β = −0.07, 95% CI [−1.37, 1.24], p = .919). The autoregressive coefficient flipped sign in the full model and was no longer reliably distinguishable from zero (β = −0.14, 95% CI [−0.36, 0.07], p = .181), suggesting that the apparent emotional inertia detected by M0 was substantially absorbed by the two internal drivers once they were included as predictors. Collinearity diagnostics rule out variance inflation as an alternative account of that change: variance inflation factors in M2 stayed below 1.8 for every predictor (highest 1.76, for metacognition), and the condition number of the standardized predictor matrix was 2.25.</w:t>
+        <w:t>In the full M2 model, agency emerged as a strong positive predictor of daily mood (β = 0.53, 95% CI [0.32, 0.73], p &lt; .001), as did metacognition (β = 0.45, 95% CI [0.22, 0.69], p &lt; .001). The melatonin coefficient was estimated near zero (β = −0.07, 95% CI [−1.37, 1.24], p = .919). The autoregressive coefficient flipped sign in the full model and was no longer reliably distinguishable from zero (β = −0.14, 95% CI [−0.36, 0.07], p = .181). This suggests that the apparent emotional inertia detected by M0 was substantially absorbed by the two internal drivers once they were included as predictors. Collinearity diagnostics rule out variance inflation as an alternative account of that change: variance inflation factors in M2 stayed below 1.8 for every predictor (highest 1.76, for metacognition), and the condition number of the standardized predictor matrix was 2.25.</w:t>
       </w:r>
     </w:p>
     <w:p>
@@ -4246,7 +4276,7 @@
           <w:sz w:val="24"/>
           <w:szCs w:val="24"/>
         </w:rPr>
-        <w:t xml:space="preserve">The primary comparison was reproduced under two alternative estimation frameworks, reported in full in Appendix B. A supplementary Bayesian regression with weakly informative priors placed the agency and metacognition coefficients clearly above zero (posterior probabilities of essentially 1) and the melatonin coefficient at approximately zero with a credible interval spanning it (Table B1). A multilevel re-analysis of all 144 momentary observations, without daily aggregation, again placed both internal drivers far above the probe (agency β = 0.34, metacognition β = 0.48, both p &lt; .001; melatonin β = 0.04, p = .946; Table B2). The two internal drivers exchange rank at this resolution, with metacognition the larger of the pair, so the ordering that holds throughout is between the internal block and the probe rather than within the block. An unconditional model placed approximately 32% of the variance in momentary mood between days (ICC = .32 in the full sample, .26 in the analysis window), so the three daily prompts are not independent observations and require either aggregation or an explicit nesting term; the within-day variance that daily aggregation sets aside is the larger share.</w:t>
+        <w:t>The primary comparison was reproduced under two alternative estimation frameworks, reported in full in Appendix B. A supplementary Bayesian regression with weakly informative priors placed the agency and metacognition coefficients clearly above zero (posterior probabilities of essentially 1) and the melatonin coefficient at approximately zero with a credible interval spanning it (Table B1). A multilevel re-analysis of all 144 momentary observations, without daily aggregation, again placed both internal drivers far above the probe (agency β = 0.34, metacognition β = 0.48, both p &lt; .001; melatonin β = 0.04, p = .946; Table B2). The two internal drivers exchange rank at this resolution, with metacognition the larger of the pair, so the ordering that holds throughout is between the internal block and the probe rather than within the block. An unconditional model placed approximately 32% of the variance in momentary mood between days (ICC = .32 in the full sample, .26 in the analysis window). The three daily prompts are therefore not independent observations and require either aggregation or an explicit nesting term; the within-day variance that daily aggregation sets aside is the larger share.</w:t>
       </w:r>
     </w:p>
     <w:p>
@@ -4392,7 +4422,7 @@
           <w:sz w:val="24"/>
           <w:szCs w:val="24"/>
         </w:rPr>
-        <w:t xml:space="preserve">The most direct empirical question, whether melatonin shifts average daily mood, yielded a small and statistically non-significant mean difference. Within a hypothesis-testing framework this would be an inconclusive result. The present analysis, however, does not read melatonin as a treatment under test. Section 2.3 states the probe framing adopted in the reframing described in Section 1.5: an input of known presence and absence, applied to characterize the system’s response. On that framing the evidential question is how the probe’s contribution compares in magnitude with the system’s endogenous drivers, and the drop-one decomposition in Section 3.2 answers it directly: agency’s unique contribution was 19.7% of daily-mood variance, and the probe’s was 0.01%, indistinguishable from zero.</w:t>
+        <w:t>The most direct empirical question, whether melatonin shifts average daily mood, yielded a small and statistically non-significant mean difference. Within a hypothesis-testing framework this would be an inconclusive result. Section 2.3 states the probe framing adopted in the reframing described in Section 1.5: an input of known presence and absence, applied to characterize the system’s response. On that framing the evidential question is how the probe’s contribution compares in magnitude with the system’s endogenous drivers, and the drop-one decomposition in Section 3.2 answers it directly: agency’s unique contribution was 19.7% of daily-mood variance, and the probe’s was 0.01%, indistinguishable from zero.</w:t>
       </w:r>
     </w:p>
     <w:p>
@@ -4478,21 +4508,21 @@
           <w:sz w:val="24"/>
           <w:szCs w:val="24"/>
         </w:rPr>
-        <w:t xml:space="preserve">Measurement and design impose further constraints. Mood, agency and metacognitive awareness were single-item self-reports collected at the same EMA prompt; single-item momentary measures carry non-trivial measurement error (Dejonckheere et al., 2022). The three internal variables also share an instrument, a reporter, and a response scale that the probe does not, so common-method variance may inflate their apparent contribution, and thrice-daily self-monitoring may itself have heightened the salience of these internal states (Barta et al., 2012; Conner &amp; Reid, 2012). The Day-18 amendment restricts the internal-driver analyses to 53 days, which limits power for interaction tests. Blinding was partial, since the participant knew when she had taken melatonin, and complete blinding is not achievable in self-administered N-of-1 designs. The 3 mg dose was not titrated, and EMA timing was approximate, with delayed responses retained within one hour of the scheduled prompt.</w:t>
-      </w:r>
-    </w:p>
-    <w:p>
-      <w:pPr>
-        <w:spacing w:after="120" w:before="0" w:line="480"/>
-        <w:jc w:val="both"/>
-      </w:pPr>
-      <w:r>
-        <w:rPr>
-          <w:rFonts w:ascii="Times New Roman" w:cs="Times New Roman" w:eastAsia="Times New Roman" w:hAnsi="Times New Roman"/>
-          <w:sz w:val="24"/>
-          <w:szCs w:val="24"/>
-        </w:rPr>
-        <w:t xml:space="preserve">Two inferential limits deserve emphasis because they bear on the central comparison. First, the autoregressive lag in M2 does not resolve contemporaneous endogeneity between mood and the internal drivers. Because the protocol measures all three at the same prompt, the design cannot construct a cross-lagged identification, and the causal direction between affect and the felt sense of intentional progress is untestable here. The estimates are predictive, and they are not causal.</w:t>
+        <w:t>Measurement and design impose further constraints. Mood, agency and metacognitive awareness were single-item self-reports collected at the same EMA prompt; single-item momentary measures carry non-trivial measurement error (Dejonckheere et al., 2022). The three internal variables also share an instrument, a reporter, and a response scale that the probe does not. Common-method variance may therefore inflate their apparent contribution, and thrice-daily self-monitoring may itself have heightened the salience of these internal states (Barta et al., 2012; Conner &amp; Reid, 2012). The Day-18 amendment restricts the internal-driver analyses to 53 days, which limits power for interaction tests. Blinding was partial, since the participant knew when she had taken melatonin, and complete blinding is not achievable in self-administered N-of-1 designs. The 3 mg dose was not titrated, and EMA timing was approximate, with delayed responses retained within one hour of the scheduled prompt.</w:t>
+      </w:r>
+    </w:p>
+    <w:p>
+      <w:pPr>
+        <w:spacing w:after="120" w:before="0" w:line="480"/>
+        <w:jc w:val="both"/>
+      </w:pPr>
+      <w:r>
+        <w:rPr>
+          <w:rFonts w:ascii="Times New Roman" w:cs="Times New Roman" w:eastAsia="Times New Roman" w:hAnsi="Times New Roman"/>
+          <w:sz w:val="24"/>
+          <w:szCs w:val="24"/>
+        </w:rPr>
+        <w:t xml:space="preserve">Two inferential limits deserve emphasis because they bear on the central comparison. First, the autoregressive lag in M2 does not resolve contemporaneous endogeneity between mood and the internal drivers. Because the protocol measures all three at the same prompt, the design cannot construct a cross-lagged identification, and the causal direction between affect and the felt sense of intentional progress is untestable here. </w:t>
       </w:r>
     </w:p>
     <w:p>
@@ -5334,7 +5364,7 @@
           <w:sz w:val="24"/>
           <w:szCs w:val="24"/>
         </w:rPr>
-        <w:t xml:space="preserve">Giddens, A. (1984). </w:t>
+        <w:t xml:space="preserve">Hamaker, E. L. (2012). Why researchers should think “within-person”: A paradigmatic rationale. In M. R. Mehl &amp; T. S. Conner (Eds.), </w:t>
       </w:r>
       <w:r>
         <w:rPr>
@@ -5344,15 +5374,15 @@
           <w:sz w:val="24"/>
           <w:szCs w:val="24"/>
         </w:rPr>
-        <w:t xml:space="preserve">The constitution of society: Outline of the theory of structuration</w:t>
-      </w:r>
-      <w:r>
-        <w:rPr>
-          <w:rFonts w:ascii="Times New Roman" w:cs="Times New Roman" w:eastAsia="Times New Roman" w:hAnsi="Times New Roman"/>
-          <w:sz w:val="24"/>
-          <w:szCs w:val="24"/>
-        </w:rPr>
-        <w:t xml:space="preserve">. University of California Press.</w:t>
+        <w:t xml:space="preserve">Handbook of research methods for studying daily life</w:t>
+      </w:r>
+      <w:r>
+        <w:rPr>
+          <w:rFonts w:ascii="Times New Roman" w:cs="Times New Roman" w:eastAsia="Times New Roman" w:hAnsi="Times New Roman"/>
+          <w:sz w:val="24"/>
+          <w:szCs w:val="24"/>
+        </w:rPr>
+        <w:t xml:space="preserve"> (pp. 43–61). Guilford Press.</w:t>
       </w:r>
     </w:p>
     <w:p>
@@ -5366,7 +5396,7 @@
           <w:sz w:val="24"/>
           <w:szCs w:val="24"/>
         </w:rPr>
-        <w:t xml:space="preserve">Hamaker, E. L. (2012). Why researchers should think “within-person”: A paradigmatic rationale. In M. R. Mehl &amp; T. S. Conner (Eds.), </w:t>
+        <w:t xml:space="preserve">Houben, M., Van Den Noortgate, W., &amp; Kuppens, P. (2015). The relation between short-term emotion dynamics and psychological well-being: A meta-analysis. </w:t>
       </w:r>
       <w:r>
         <w:rPr>
@@ -5376,15 +5406,25 @@
           <w:sz w:val="24"/>
           <w:szCs w:val="24"/>
         </w:rPr>
-        <w:t xml:space="preserve">Handbook of research methods for studying daily life</w:t>
-      </w:r>
-      <w:r>
-        <w:rPr>
-          <w:rFonts w:ascii="Times New Roman" w:cs="Times New Roman" w:eastAsia="Times New Roman" w:hAnsi="Times New Roman"/>
-          <w:sz w:val="24"/>
-          <w:szCs w:val="24"/>
-        </w:rPr>
-        <w:t xml:space="preserve"> (pp. 43–61). Guilford Press.</w:t>
+        <w:t xml:space="preserve">Psychological Bulletin, 141</w:t>
+      </w:r>
+      <w:r>
+        <w:rPr>
+          <w:rFonts w:ascii="Times New Roman" w:cs="Times New Roman" w:eastAsia="Times New Roman" w:hAnsi="Times New Roman"/>
+          <w:sz w:val="24"/>
+          <w:szCs w:val="24"/>
+        </w:rPr>
+        <w:t xml:space="preserve">(4), 901–930.</w:t>
+      </w:r>
+      <w:r>
+        <w:rPr>
+          <w:rFonts w:ascii="Times New Roman" w:cs="Times New Roman" w:eastAsia="Times New Roman" w:hAnsi="Times New Roman"/>
+          <w:color w:val="1A56DB"/>
+          <w:sz w:val="24"/>
+          <w:szCs w:val="24"/>
+          <w:u w:val="single"/>
+        </w:rPr>
+        <w:t xml:space="preserve"> https://doi.org/10.1037/a0038822</w:t>
       </w:r>
     </w:p>
     <w:p>
@@ -5398,7 +5438,7 @@
           <w:sz w:val="24"/>
           <w:szCs w:val="24"/>
         </w:rPr>
-        <w:t xml:space="preserve">Houben, M., Van Den Noortgate, W., &amp; Kuppens, P. (2015). The relation between short-term emotion dynamics and psychological well-being: A meta-analysis. </w:t>
+        <w:t xml:space="preserve">Jahng, S., Wood, P. K., &amp; Trull, T. J. (2008). Analysis of affective instability in ecological momentary assessment: Indices using successive difference and group comparison via multilevel modeling. </w:t>
       </w:r>
       <w:r>
         <w:rPr>
@@ -5408,15 +5448,15 @@
           <w:sz w:val="24"/>
           <w:szCs w:val="24"/>
         </w:rPr>
-        <w:t xml:space="preserve">Psychological Bulletin, 141</w:t>
-      </w:r>
-      <w:r>
-        <w:rPr>
-          <w:rFonts w:ascii="Times New Roman" w:cs="Times New Roman" w:eastAsia="Times New Roman" w:hAnsi="Times New Roman"/>
-          <w:sz w:val="24"/>
-          <w:szCs w:val="24"/>
-        </w:rPr>
-        <w:t xml:space="preserve">(4), 901–930.</w:t>
+        <w:t xml:space="preserve">Psychological Methods, 13</w:t>
+      </w:r>
+      <w:r>
+        <w:rPr>
+          <w:rFonts w:ascii="Times New Roman" w:cs="Times New Roman" w:eastAsia="Times New Roman" w:hAnsi="Times New Roman"/>
+          <w:sz w:val="24"/>
+          <w:szCs w:val="24"/>
+        </w:rPr>
+        <w:t xml:space="preserve">(4), 354–375.</w:t>
       </w:r>
       <w:r>
         <w:rPr>
@@ -5426,7 +5466,7 @@
           <w:szCs w:val="24"/>
           <w:u w:val="single"/>
         </w:rPr>
-        <w:t xml:space="preserve"> https://doi.org/10.1037/a0038822</w:t>
+        <w:t xml:space="preserve"> https://doi.org/10.1037/a0014173</w:t>
       </w:r>
     </w:p>
     <w:p>
@@ -5440,7 +5480,21 @@
           <w:sz w:val="24"/>
           <w:szCs w:val="24"/>
         </w:rPr>
-        <w:t xml:space="preserve">Jahng, S., Wood, P. K., &amp; Trull, T. J. (2008). Analysis of affective instability in ecological momentary assessment: Indices using successive difference and group comparison via multilevel modeling. </w:t>
+        <w:t xml:space="preserve">Knapen, S. E., Snippe, E., Smit, A. C., Schoevers, R. A., &amp; Riemersma-van der Lek, R. F. (2025). Sleep disturbances in the prodromal phase of mood episodes in patients with bipolar disorder: A replicated single-case design. Journal for Person-Oriented Research, 11(3), 142-168. https://doi.org/10.17505/jpor.2025.28202</w:t>
+      </w:r>
+    </w:p>
+    <w:p>
+      <w:pPr>
+        <w:spacing w:after="120" w:before="0" w:line="480"/>
+        <w:ind w:left="720" w:hanging="720"/>
+      </w:pPr>
+      <w:r>
+        <w:rPr>
+          <w:rFonts w:ascii="Times New Roman" w:cs="Times New Roman" w:eastAsia="Times New Roman" w:hAnsi="Times New Roman"/>
+          <w:sz w:val="24"/>
+          <w:szCs w:val="24"/>
+        </w:rPr>
+        <w:t xml:space="preserve">Koval, P., &amp; Kuppens, P. (2012). Changing emotion dynamics: Individual differences in the effect of anticipatory social stress on emotional inertia. </w:t>
       </w:r>
       <w:r>
         <w:rPr>
@@ -5450,15 +5504,15 @@
           <w:sz w:val="24"/>
           <w:szCs w:val="24"/>
         </w:rPr>
-        <w:t xml:space="preserve">Psychological Methods, 13</w:t>
-      </w:r>
-      <w:r>
-        <w:rPr>
-          <w:rFonts w:ascii="Times New Roman" w:cs="Times New Roman" w:eastAsia="Times New Roman" w:hAnsi="Times New Roman"/>
-          <w:sz w:val="24"/>
-          <w:szCs w:val="24"/>
-        </w:rPr>
-        <w:t xml:space="preserve">(4), 354–375.</w:t>
+        <w:t xml:space="preserve">Emotion, 12</w:t>
+      </w:r>
+      <w:r>
+        <w:rPr>
+          <w:rFonts w:ascii="Times New Roman" w:cs="Times New Roman" w:eastAsia="Times New Roman" w:hAnsi="Times New Roman"/>
+          <w:sz w:val="24"/>
+          <w:szCs w:val="24"/>
+        </w:rPr>
+        <w:t xml:space="preserve">(2), 256–267.</w:t>
       </w:r>
       <w:r>
         <w:rPr>
@@ -5468,7 +5522,7 @@
           <w:szCs w:val="24"/>
           <w:u w:val="single"/>
         </w:rPr>
-        <w:t xml:space="preserve"> https://doi.org/10.1037/a0014173</w:t>
+        <w:t xml:space="preserve"> https://doi.org/10.1037/a0024756</w:t>
       </w:r>
     </w:p>
     <w:p>
@@ -5482,21 +5536,7 @@
           <w:sz w:val="24"/>
           <w:szCs w:val="24"/>
         </w:rPr>
-        <w:t xml:space="preserve">Knapen, S. E., Snippe, E., Smit, A. C., Schoevers, R. A., &amp; Riemersma-van der Lek, R. F. (2025). Sleep disturbances in the prodromal phase of mood episodes in patients with bipolar disorder: A replicated single-case design. Journal for Person-Oriented Research, 11(3), 142-168. https://doi.org/10.17505/jpor.2025.28202</w:t>
-      </w:r>
-    </w:p>
-    <w:p>
-      <w:pPr>
-        <w:spacing w:after="120" w:before="0" w:line="480"/>
-        <w:ind w:left="720" w:hanging="720"/>
-      </w:pPr>
-      <w:r>
-        <w:rPr>
-          <w:rFonts w:ascii="Times New Roman" w:cs="Times New Roman" w:eastAsia="Times New Roman" w:hAnsi="Times New Roman"/>
-          <w:sz w:val="24"/>
-          <w:szCs w:val="24"/>
-        </w:rPr>
-        <w:t xml:space="preserve">Koval, P., &amp; Kuppens, P. (2012). Changing emotion dynamics: Individual differences in the effect of anticipatory social stress on emotional inertia. </w:t>
+        <w:t xml:space="preserve">Kuppens, P., Allen, N. B., &amp; Sheeber, L. B. (2010). Emotional inertia and psychological maladjustment. </w:t>
       </w:r>
       <w:r>
         <w:rPr>
@@ -5506,15 +5546,15 @@
           <w:sz w:val="24"/>
           <w:szCs w:val="24"/>
         </w:rPr>
-        <w:t xml:space="preserve">Emotion, 12</w:t>
-      </w:r>
-      <w:r>
-        <w:rPr>
-          <w:rFonts w:ascii="Times New Roman" w:cs="Times New Roman" w:eastAsia="Times New Roman" w:hAnsi="Times New Roman"/>
-          <w:sz w:val="24"/>
-          <w:szCs w:val="24"/>
-        </w:rPr>
-        <w:t xml:space="preserve">(2), 256–267.</w:t>
+        <w:t xml:space="preserve">Psychological Science, 21</w:t>
+      </w:r>
+      <w:r>
+        <w:rPr>
+          <w:rFonts w:ascii="Times New Roman" w:cs="Times New Roman" w:eastAsia="Times New Roman" w:hAnsi="Times New Roman"/>
+          <w:sz w:val="24"/>
+          <w:szCs w:val="24"/>
+        </w:rPr>
+        <w:t xml:space="preserve">(7), 984–991.</w:t>
       </w:r>
       <w:r>
         <w:rPr>
@@ -5524,21 +5564,21 @@
           <w:szCs w:val="24"/>
           <w:u w:val="single"/>
         </w:rPr>
-        <w:t xml:space="preserve"> https://doi.org/10.1037/a0024756</w:t>
-      </w:r>
-    </w:p>
-    <w:p>
-      <w:pPr>
-        <w:spacing w:after="120" w:before="0" w:line="480"/>
-        <w:ind w:left="720" w:hanging="720"/>
-      </w:pPr>
-      <w:r>
-        <w:rPr>
-          <w:rFonts w:ascii="Times New Roman" w:cs="Times New Roman" w:eastAsia="Times New Roman" w:hAnsi="Times New Roman"/>
-          <w:sz w:val="24"/>
-          <w:szCs w:val="24"/>
-        </w:rPr>
-        <w:t xml:space="preserve">Kuppens, P., Allen, N. B., &amp; Sheeber, L. B. (2010). Emotional inertia and psychological maladjustment. </w:t>
+        <w:t xml:space="preserve"> https://doi.org/10.1177/0956797610372634</w:t>
+      </w:r>
+    </w:p>
+    <w:p>
+      <w:pPr>
+        <w:spacing w:after="120" w:before="0" w:line="480"/>
+        <w:jc w:val="both"/>
+      </w:pPr>
+      <w:r>
+        <w:rPr>
+          <w:rFonts w:ascii="Times New Roman" w:cs="Times New Roman" w:eastAsia="Times New Roman" w:hAnsi="Times New Roman"/>
+          <w:sz w:val="24"/>
+          <w:szCs w:val="24"/>
+        </w:rPr>
+        <w:t xml:space="preserve">Kuznetsova, A., Brockhoff, P. B., &amp; Christensen, R. H. B. (2017). lmerTest package: Tests in linear mixed effects models. </w:t>
       </w:r>
       <w:r>
         <w:rPr>
@@ -5548,39 +5588,29 @@
           <w:sz w:val="24"/>
           <w:szCs w:val="24"/>
         </w:rPr>
-        <w:t xml:space="preserve">Psychological Science, 21</w:t>
-      </w:r>
-      <w:r>
-        <w:rPr>
-          <w:rFonts w:ascii="Times New Roman" w:cs="Times New Roman" w:eastAsia="Times New Roman" w:hAnsi="Times New Roman"/>
-          <w:sz w:val="24"/>
-          <w:szCs w:val="24"/>
-        </w:rPr>
-        <w:t xml:space="preserve">(7), 984–991.</w:t>
-      </w:r>
-      <w:r>
-        <w:rPr>
-          <w:rFonts w:ascii="Times New Roman" w:cs="Times New Roman" w:eastAsia="Times New Roman" w:hAnsi="Times New Roman"/>
-          <w:color w:val="1A56DB"/>
-          <w:sz w:val="24"/>
-          <w:szCs w:val="24"/>
-          <w:u w:val="single"/>
-        </w:rPr>
-        <w:t xml:space="preserve"> https://doi.org/10.1177/0956797610372634</w:t>
-      </w:r>
-    </w:p>
-    <w:p>
-      <w:pPr>
-        <w:spacing w:after="120" w:before="0" w:line="480"/>
-        <w:jc w:val="both"/>
-      </w:pPr>
-      <w:r>
-        <w:rPr>
-          <w:rFonts w:ascii="Times New Roman" w:cs="Times New Roman" w:eastAsia="Times New Roman" w:hAnsi="Times New Roman"/>
-          <w:sz w:val="24"/>
-          <w:szCs w:val="24"/>
-        </w:rPr>
-        <w:t xml:space="preserve">Kuznetsova, A., Brockhoff, P. B., &amp; Christensen, R. H. B. (2017). lmerTest package: Tests in linear mixed effects models. </w:t>
+        <w:t xml:space="preserve">Journal of Statistical Software, 82</w:t>
+      </w:r>
+      <w:r>
+        <w:rPr>
+          <w:rFonts w:ascii="Times New Roman" w:cs="Times New Roman" w:eastAsia="Times New Roman" w:hAnsi="Times New Roman"/>
+          <w:sz w:val="24"/>
+          <w:szCs w:val="24"/>
+        </w:rPr>
+        <w:t xml:space="preserve">(13), 1–26. https://doi.org/10.18637/jss.v082.i13</w:t>
+      </w:r>
+    </w:p>
+    <w:p>
+      <w:pPr>
+        <w:spacing w:after="120" w:before="0" w:line="480"/>
+        <w:ind w:left="720" w:hanging="720"/>
+      </w:pPr>
+      <w:r>
+        <w:rPr>
+          <w:rFonts w:ascii="Times New Roman" w:cs="Times New Roman" w:eastAsia="Times New Roman" w:hAnsi="Times New Roman"/>
+          <w:sz w:val="24"/>
+          <w:szCs w:val="24"/>
+        </w:rPr>
+        <w:t xml:space="preserve">Lakens, D. (2017). Equivalence tests: A practical primer for </w:t>
       </w:r>
       <w:r>
         <w:rPr>
@@ -5590,29 +5620,15 @@
           <w:sz w:val="24"/>
           <w:szCs w:val="24"/>
         </w:rPr>
-        <w:t xml:space="preserve">Journal of Statistical Software, 82</w:t>
-      </w:r>
-      <w:r>
-        <w:rPr>
-          <w:rFonts w:ascii="Times New Roman" w:cs="Times New Roman" w:eastAsia="Times New Roman" w:hAnsi="Times New Roman"/>
-          <w:sz w:val="24"/>
-          <w:szCs w:val="24"/>
-        </w:rPr>
-        <w:t xml:space="preserve">(13), 1–26. https://doi.org/10.18637/jss.v082.i13</w:t>
-      </w:r>
-    </w:p>
-    <w:p>
-      <w:pPr>
-        <w:spacing w:after="120" w:before="0" w:line="480"/>
-        <w:ind w:left="720" w:hanging="720"/>
-      </w:pPr>
-      <w:r>
-        <w:rPr>
-          <w:rFonts w:ascii="Times New Roman" w:cs="Times New Roman" w:eastAsia="Times New Roman" w:hAnsi="Times New Roman"/>
-          <w:sz w:val="24"/>
-          <w:szCs w:val="24"/>
-        </w:rPr>
-        <w:t xml:space="preserve">Lakens, D. (2017). Equivalence tests: A practical primer for </w:t>
+        <w:t xml:space="preserve">t</w:t>
+      </w:r>
+      <w:r>
+        <w:rPr>
+          <w:rFonts w:ascii="Times New Roman" w:cs="Times New Roman" w:eastAsia="Times New Roman" w:hAnsi="Times New Roman"/>
+          <w:sz w:val="24"/>
+          <w:szCs w:val="24"/>
+        </w:rPr>
+        <w:t xml:space="preserve"> tests, correlations, and meta-analyses. </w:t>
       </w:r>
       <w:r>
         <w:rPr>
@@ -5622,15 +5638,39 @@
           <w:sz w:val="24"/>
           <w:szCs w:val="24"/>
         </w:rPr>
-        <w:t xml:space="preserve">t</w:t>
-      </w:r>
-      <w:r>
-        <w:rPr>
-          <w:rFonts w:ascii="Times New Roman" w:cs="Times New Roman" w:eastAsia="Times New Roman" w:hAnsi="Times New Roman"/>
-          <w:sz w:val="24"/>
-          <w:szCs w:val="24"/>
-        </w:rPr>
-        <w:t xml:space="preserve"> tests, correlations, and meta-analyses. </w:t>
+        <w:t xml:space="preserve">Social Psychological and Personality Science, 8</w:t>
+      </w:r>
+      <w:r>
+        <w:rPr>
+          <w:rFonts w:ascii="Times New Roman" w:cs="Times New Roman" w:eastAsia="Times New Roman" w:hAnsi="Times New Roman"/>
+          <w:sz w:val="24"/>
+          <w:szCs w:val="24"/>
+        </w:rPr>
+        <w:t xml:space="preserve">(4), 355–362.</w:t>
+      </w:r>
+      <w:r>
+        <w:rPr>
+          <w:rFonts w:ascii="Times New Roman" w:cs="Times New Roman" w:eastAsia="Times New Roman" w:hAnsi="Times New Roman"/>
+          <w:color w:val="1A56DB"/>
+          <w:sz w:val="24"/>
+          <w:szCs w:val="24"/>
+          <w:u w:val="single"/>
+        </w:rPr>
+        <w:t xml:space="preserve"> https://doi.org/10.1177/1948550617697177</w:t>
+      </w:r>
+    </w:p>
+    <w:p>
+      <w:pPr>
+        <w:spacing w:after="120" w:before="0" w:line="480"/>
+        <w:ind w:left="720" w:hanging="720"/>
+      </w:pPr>
+      <w:r>
+        <w:rPr>
+          <w:rFonts w:ascii="Times New Roman" w:cs="Times New Roman" w:eastAsia="Times New Roman" w:hAnsi="Times New Roman"/>
+          <w:sz w:val="24"/>
+          <w:szCs w:val="24"/>
+        </w:rPr>
+        <w:t xml:space="preserve">Metcalfe, J., &amp; Greene, M. J. (2007). Metacognition of agency. </w:t>
       </w:r>
       <w:r>
         <w:rPr>
@@ -5640,15 +5680,15 @@
           <w:sz w:val="24"/>
           <w:szCs w:val="24"/>
         </w:rPr>
-        <w:t xml:space="preserve">Social Psychological and Personality Science, 8</w:t>
-      </w:r>
-      <w:r>
-        <w:rPr>
-          <w:rFonts w:ascii="Times New Roman" w:cs="Times New Roman" w:eastAsia="Times New Roman" w:hAnsi="Times New Roman"/>
-          <w:sz w:val="24"/>
-          <w:szCs w:val="24"/>
-        </w:rPr>
-        <w:t xml:space="preserve">(4), 355–362.</w:t>
+        <w:t xml:space="preserve">Journal of Experimental Psychology: General, 136</w:t>
+      </w:r>
+      <w:r>
+        <w:rPr>
+          <w:rFonts w:ascii="Times New Roman" w:cs="Times New Roman" w:eastAsia="Times New Roman" w:hAnsi="Times New Roman"/>
+          <w:sz w:val="24"/>
+          <w:szCs w:val="24"/>
+        </w:rPr>
+        <w:t xml:space="preserve">(2), 184–199.</w:t>
       </w:r>
       <w:r>
         <w:rPr>
@@ -5658,7 +5698,7 @@
           <w:szCs w:val="24"/>
           <w:u w:val="single"/>
         </w:rPr>
-        <w:t xml:space="preserve"> https://doi.org/10.1177/1948550617697177</w:t>
+        <w:t xml:space="preserve"> https://doi.org/10.1037/0096-3445.136.2.184</w:t>
       </w:r>
     </w:p>
     <w:p>
@@ -5672,7 +5712,7 @@
           <w:sz w:val="24"/>
           <w:szCs w:val="24"/>
         </w:rPr>
-        <w:t xml:space="preserve">Metcalfe, J., &amp; Greene, M. J. (2007). Metacognition of agency. </w:t>
+        <w:t xml:space="preserve">Molenaar, P. C. M. (2004). A manifesto on psychology as idiographic science: Bringing the person back into scientific psychology, this time forever. </w:t>
       </w:r>
       <w:r>
         <w:rPr>
@@ -5682,15 +5722,15 @@
           <w:sz w:val="24"/>
           <w:szCs w:val="24"/>
         </w:rPr>
-        <w:t xml:space="preserve">Journal of Experimental Psychology: General, 136</w:t>
-      </w:r>
-      <w:r>
-        <w:rPr>
-          <w:rFonts w:ascii="Times New Roman" w:cs="Times New Roman" w:eastAsia="Times New Roman" w:hAnsi="Times New Roman"/>
-          <w:sz w:val="24"/>
-          <w:szCs w:val="24"/>
-        </w:rPr>
-        <w:t xml:space="preserve">(2), 184–199.</w:t>
+        <w:t xml:space="preserve">Measurement: Interdisciplinary Research and Perspectives, 2</w:t>
+      </w:r>
+      <w:r>
+        <w:rPr>
+          <w:rFonts w:ascii="Times New Roman" w:cs="Times New Roman" w:eastAsia="Times New Roman" w:hAnsi="Times New Roman"/>
+          <w:sz w:val="24"/>
+          <w:szCs w:val="24"/>
+        </w:rPr>
+        <w:t xml:space="preserve">(4), 201–218.</w:t>
       </w:r>
       <w:r>
         <w:rPr>
@@ -5700,7 +5740,7 @@
           <w:szCs w:val="24"/>
           <w:u w:val="single"/>
         </w:rPr>
-        <w:t xml:space="preserve"> https://doi.org/10.1037/0096-3445.136.2.184</w:t>
+        <w:t xml:space="preserve"> https://doi.org/10.1207/s15366359mea0204_1</w:t>
       </w:r>
     </w:p>
     <w:p>
@@ -5714,7 +5754,7 @@
           <w:sz w:val="24"/>
           <w:szCs w:val="24"/>
         </w:rPr>
-        <w:t xml:space="preserve">Molenaar, P. C. M. (2004). A manifesto on psychology as idiographic science: Bringing the person back into scientific psychology, this time forever. </w:t>
+        <w:t xml:space="preserve">Molenaar, P. C. M., &amp; Campbell, C. G. (2009). The new person-specific paradigm in psychology. </w:t>
       </w:r>
       <w:r>
         <w:rPr>
@@ -5724,15 +5764,15 @@
           <w:sz w:val="24"/>
           <w:szCs w:val="24"/>
         </w:rPr>
-        <w:t xml:space="preserve">Measurement: Interdisciplinary Research and Perspectives, 2</w:t>
-      </w:r>
-      <w:r>
-        <w:rPr>
-          <w:rFonts w:ascii="Times New Roman" w:cs="Times New Roman" w:eastAsia="Times New Roman" w:hAnsi="Times New Roman"/>
-          <w:sz w:val="24"/>
-          <w:szCs w:val="24"/>
-        </w:rPr>
-        <w:t xml:space="preserve">(4), 201–218.</w:t>
+        <w:t xml:space="preserve">Current Directions in Psychological Science, 18</w:t>
+      </w:r>
+      <w:r>
+        <w:rPr>
+          <w:rFonts w:ascii="Times New Roman" w:cs="Times New Roman" w:eastAsia="Times New Roman" w:hAnsi="Times New Roman"/>
+          <w:sz w:val="24"/>
+          <w:szCs w:val="24"/>
+        </w:rPr>
+        <w:t xml:space="preserve">(2), 112–117.</w:t>
       </w:r>
       <w:r>
         <w:rPr>
@@ -5742,7 +5782,7 @@
           <w:szCs w:val="24"/>
           <w:u w:val="single"/>
         </w:rPr>
-        <w:t xml:space="preserve"> https://doi.org/10.1207/s15366359mea0204_1</w:t>
+        <w:t xml:space="preserve"> https://doi.org/10.1111/j.1467-8721.2009.01619.x</w:t>
       </w:r>
     </w:p>
     <w:p>
@@ -5756,7 +5796,7 @@
           <w:sz w:val="24"/>
           <w:szCs w:val="24"/>
         </w:rPr>
-        <w:t xml:space="preserve">Molenaar, P. C. M., &amp; Campbell, C. G. (2009). The new person-specific paradigm in psychology. </w:t>
+        <w:t xml:space="preserve">Myin-Germeys, I., &amp; Kuppens, P. (Eds.). (2022). </w:t>
       </w:r>
       <w:r>
         <w:rPr>
@@ -5766,25 +5806,15 @@
           <w:sz w:val="24"/>
           <w:szCs w:val="24"/>
         </w:rPr>
-        <w:t xml:space="preserve">Current Directions in Psychological Science, 18</w:t>
-      </w:r>
-      <w:r>
-        <w:rPr>
-          <w:rFonts w:ascii="Times New Roman" w:cs="Times New Roman" w:eastAsia="Times New Roman" w:hAnsi="Times New Roman"/>
-          <w:sz w:val="24"/>
-          <w:szCs w:val="24"/>
-        </w:rPr>
-        <w:t xml:space="preserve">(2), 112–117.</w:t>
-      </w:r>
-      <w:r>
-        <w:rPr>
-          <w:rFonts w:ascii="Times New Roman" w:cs="Times New Roman" w:eastAsia="Times New Roman" w:hAnsi="Times New Roman"/>
-          <w:color w:val="1A56DB"/>
-          <w:sz w:val="24"/>
-          <w:szCs w:val="24"/>
-          <w:u w:val="single"/>
-        </w:rPr>
-        <w:t xml:space="preserve"> https://doi.org/10.1111/j.1467-8721.2009.01619.x</w:t>
+        <w:t xml:space="preserve">The open handbook of experience sampling methodology</w:t>
+      </w:r>
+      <w:r>
+        <w:rPr>
+          <w:rFonts w:ascii="Times New Roman" w:cs="Times New Roman" w:eastAsia="Times New Roman" w:hAnsi="Times New Roman"/>
+          <w:sz w:val="24"/>
+          <w:szCs w:val="24"/>
+        </w:rPr>
+        <w:t xml:space="preserve"> (2nd ed.). Center for Research on Experience Sampling and Ambulatory Methods Leuven.</w:t>
       </w:r>
     </w:p>
     <w:p>
@@ -5798,7 +5828,7 @@
           <w:sz w:val="24"/>
           <w:szCs w:val="24"/>
         </w:rPr>
-        <w:t xml:space="preserve">Myin-Germeys, I., &amp; Kuppens, P. (Eds.). (2022). </w:t>
+        <w:t xml:space="preserve">Nelson, T. O., &amp; Narens, L. (1990). Metamemory: A theoretical framework and new findings. In G. H. Bower (Ed.), </w:t>
       </w:r>
       <w:r>
         <w:rPr>
@@ -5808,15 +5838,15 @@
           <w:sz w:val="24"/>
           <w:szCs w:val="24"/>
         </w:rPr>
-        <w:t xml:space="preserve">The open handbook of experience sampling methodology</w:t>
-      </w:r>
-      <w:r>
-        <w:rPr>
-          <w:rFonts w:ascii="Times New Roman" w:cs="Times New Roman" w:eastAsia="Times New Roman" w:hAnsi="Times New Roman"/>
-          <w:sz w:val="24"/>
-          <w:szCs w:val="24"/>
-        </w:rPr>
-        <w:t xml:space="preserve"> (2nd ed.). Center for Research on Experience Sampling and Ambulatory Methods Leuven.</w:t>
+        <w:t xml:space="preserve">The psychology of learning and motivation</w:t>
+      </w:r>
+      <w:r>
+        <w:rPr>
+          <w:rFonts w:ascii="Times New Roman" w:cs="Times New Roman" w:eastAsia="Times New Roman" w:hAnsi="Times New Roman"/>
+          <w:sz w:val="24"/>
+          <w:szCs w:val="24"/>
+        </w:rPr>
+        <w:t xml:space="preserve"> (Vol. 26, pp. 125–173). Academic Press.</w:t>
       </w:r>
     </w:p>
     <w:p>
@@ -5830,7 +5860,7 @@
           <w:sz w:val="24"/>
           <w:szCs w:val="24"/>
         </w:rPr>
-        <w:t xml:space="preserve">Nelson, T. O., &amp; Narens, L. (1990). Metamemory: A theoretical framework and new findings. In G. H. Bower (Ed.), </w:t>
+        <w:t xml:space="preserve">Seabold, S., &amp; Perktold, J. (2010). statsmodels: Econometric and statistical modeling with Python. In </w:t>
       </w:r>
       <w:r>
         <w:rPr>
@@ -5840,38 +5870,6 @@
           <w:sz w:val="24"/>
           <w:szCs w:val="24"/>
         </w:rPr>
-        <w:t xml:space="preserve">The psychology of learning and motivation</w:t>
-      </w:r>
-      <w:r>
-        <w:rPr>
-          <w:rFonts w:ascii="Times New Roman" w:cs="Times New Roman" w:eastAsia="Times New Roman" w:hAnsi="Times New Roman"/>
-          <w:sz w:val="24"/>
-          <w:szCs w:val="24"/>
-        </w:rPr>
-        <w:t xml:space="preserve"> (Vol. 26, pp. 125–173). Academic Press.</w:t>
-      </w:r>
-    </w:p>
-    <w:p>
-      <w:pPr>
-        <w:spacing w:after="120" w:before="0" w:line="480"/>
-        <w:ind w:left="720" w:hanging="720"/>
-      </w:pPr>
-      <w:r>
-        <w:rPr>
-          <w:rFonts w:ascii="Times New Roman" w:cs="Times New Roman" w:eastAsia="Times New Roman" w:hAnsi="Times New Roman"/>
-          <w:sz w:val="24"/>
-          <w:szCs w:val="24"/>
-        </w:rPr>
-        <w:t xml:space="preserve">Seabold, S., &amp; Perktold, J. (2010). statsmodels: Econometric and statistical modeling with Python. In </w:t>
-      </w:r>
-      <w:r>
-        <w:rPr>
-          <w:rFonts w:ascii="Times New Roman" w:cs="Times New Roman" w:eastAsia="Times New Roman" w:hAnsi="Times New Roman"/>
-          <w:i/>
-          <w:iCs/>
-          <w:sz w:val="24"/>
-          <w:szCs w:val="24"/>
-        </w:rPr>
         <w:t xml:space="preserve">Proceedings of the 9th Python in Science Conference</w:t>
       </w:r>
       <w:r>
@@ -5881,80 +5879,6 @@
           <w:szCs w:val="24"/>
         </w:rPr>
         <w:t xml:space="preserve"> (pp. 92–96).</w:t>
-      </w:r>
-    </w:p>
-    <w:p>
-      <w:pPr>
-        <w:spacing w:after="120" w:before="0" w:line="480"/>
-        <w:ind w:left="720" w:hanging="720"/>
-      </w:pPr>
-      <w:r>
-        <w:rPr>
-          <w:rFonts w:ascii="Times New Roman" w:cs="Times New Roman" w:eastAsia="Times New Roman" w:hAnsi="Times New Roman"/>
-          <w:sz w:val="24"/>
-          <w:szCs w:val="24"/>
-        </w:rPr>
-        <w:t xml:space="preserve">Synofzik, M., Vosgerau, G., &amp; Newen, A. (2008). Beyond the comparator model: A multifactorial two-step account of agency. </w:t>
-      </w:r>
-      <w:r>
-        <w:rPr>
-          <w:rFonts w:ascii="Times New Roman" w:cs="Times New Roman" w:eastAsia="Times New Roman" w:hAnsi="Times New Roman"/>
-          <w:i/>
-          <w:iCs/>
-          <w:sz w:val="24"/>
-          <w:szCs w:val="24"/>
-        </w:rPr>
-        <w:t xml:space="preserve">Consciousness and Cognition, 17</w:t>
-      </w:r>
-      <w:r>
-        <w:rPr>
-          <w:rFonts w:ascii="Times New Roman" w:cs="Times New Roman" w:eastAsia="Times New Roman" w:hAnsi="Times New Roman"/>
-          <w:sz w:val="24"/>
-          <w:szCs w:val="24"/>
-        </w:rPr>
-        <w:t xml:space="preserve">(1), 219–239.</w:t>
-      </w:r>
-      <w:r>
-        <w:rPr>
-          <w:rFonts w:ascii="Times New Roman" w:cs="Times New Roman" w:eastAsia="Times New Roman" w:hAnsi="Times New Roman"/>
-          <w:color w:val="1A56DB"/>
-          <w:sz w:val="24"/>
-          <w:szCs w:val="24"/>
-          <w:u w:val="single"/>
-        </w:rPr>
-        <w:t xml:space="preserve"> https://doi.org/10.1016/j.concog.2007.03.010</w:t>
-      </w:r>
-    </w:p>
-    <w:p>
-      <w:pPr>
-        <w:spacing w:after="120" w:before="0" w:line="480"/>
-        <w:ind w:left="720" w:hanging="720"/>
-      </w:pPr>
-      <w:r>
-        <w:rPr>
-          <w:rFonts w:ascii="Times New Roman" w:cs="Times New Roman" w:eastAsia="Times New Roman" w:hAnsi="Times New Roman"/>
-          <w:sz w:val="24"/>
-          <w:szCs w:val="24"/>
-        </w:rPr>
-        <w:t xml:space="preserve">Wegner, D. M. (2002). </w:t>
-      </w:r>
-      <w:r>
-        <w:rPr>
-          <w:rFonts w:ascii="Times New Roman" w:cs="Times New Roman" w:eastAsia="Times New Roman" w:hAnsi="Times New Roman"/>
-          <w:i/>
-          <w:iCs/>
-          <w:sz w:val="24"/>
-          <w:szCs w:val="24"/>
-        </w:rPr>
-        <w:t xml:space="preserve">The illusion of conscious will</w:t>
-      </w:r>
-      <w:r>
-        <w:rPr>
-          <w:rFonts w:ascii="Times New Roman" w:cs="Times New Roman" w:eastAsia="Times New Roman" w:hAnsi="Times New Roman"/>
-          <w:sz w:val="24"/>
-          <w:szCs w:val="24"/>
-        </w:rPr>
-        <w:t xml:space="preserve">. MIT Press.</w:t>
       </w:r>
     </w:p>
     <w:p>
@@ -6097,6 +6021,9 @@
           <w:szCs w:val="24"/>
         </w:rPr>
         <w:t xml:space="preserve">Three estimates of emotional inertia were computed. At the observation level (n = 194 lag-1 pairs across the full 195-observation sample), AR(1) estimation yielded φ_obs = 0.23, 95% CI [0.09, 0.37], p = .001. At the daily level on the full 70-day sample (n = 69 lag-1 pairs), φ_day ≈ 0.42 (OLS point estimate 0.4204). On the Day 18–70 subsample used for the nested-model comparison in Section 3.2 (n = 53), the daily-level coefficient was φ = 0.34 (M0 in Table 1). The two daily-level estimates differ because of the sample window: the first 17 days of mood-only data contribute early variability that the nested-model subsample excludes. The system’s typical daily inertia is best characterized by the full-sample estimate, and the smaller nested-model coefficient should be read as a within-window estimate constrained by data availability.</w:t>
+      </w:r>
+      <w:r>
+        <w:t xml:space="preserve"> At the observation level a second autoregressive lag was significant (φ₂ = 0.36, 95% CI [0.23, 0.50]), consistent with within-day structure that no single first-order process captures, reinforcing the resolution-specific reading in Section 3.4.</w:t>
       </w:r>
     </w:p>
     <w:p>

</xml_diff>

<commit_message>
break up the longest sentences
</commit_message>
<xml_diff>
--- a/paper/manuscript.docx
+++ b/paper/manuscript.docx
@@ -99,7 +99,7 @@
           <w:sz w:val="24"/>
           <w:szCs w:val="24"/>
         </w:rPr>
-        <w:t>Over 70 days, one adult recorded momentary emotional valence, perceived agency, and metacognitive awareness three times a day, and took 3 mg of melatonin on the nights assigned by a pre-generated randomized schedule, giving 195 observations at 92.9% compliance across 35 control and 35 melatonin days. Melatonin left mean daily mood essentially unchanged: the difference was +0.92 points on a 0 to 100 scale, d = 0.17, and an equivalence test placed it inside a pre-specified bound of five points, which gives the null a stated width. What moved with mood was the person’s own regulatory state. Perceived agency and metacognitive awareness together accounted for a further 51.5% of daily-mood variance beyond autoregressive carryover and the probe, lifting model R² from .125 to .641, and the same ordering held under Bayesian and multilevel re-estimation. The comparison is between predictors of different kinds: agency and metacognition were self-reported alongside mood, while melatonin acts on it only indirectly through sleep. One signal ran the other way, though only suggestively: residual variance was smaller on melatonin nights, compatible with a chronobiotic effect on stability while level is untouched. The individual is modeled here as a dynamical system and melatonin as a probe, used to map where that system responds and where it does not. The estimates are idiographic and are not offered as population effects. The procedure transfers even where the numbers do not: any variable that can be sampled repeatedly can take the place of the ones used here.</w:t>
+        <w:t>Over 70 days, one adult recorded momentary emotional valence, perceived agency, and metacognitive awareness three times a day, and took 3 mg of melatonin on the nights assigned by a pre-generated randomized schedule. This yielded 195 observations at 92.9% compliance across 35 control and 35 melatonin days. Melatonin left mean daily mood essentially unchanged: the difference was +0.92 points on a 0 to 100 scale, d = 0.17, and an equivalence test placed it inside a pre-specified bound of five points, which gives the null a stated width. What moved with mood was the person’s own regulatory state. Perceived agency and metacognitive awareness together accounted for a further 51.5% of daily-mood variance beyond autoregressive carryover and the probe, lifting model R² from .125 to .641, and the same ordering held under Bayesian and multilevel re-estimation. The comparison is between predictors of different kinds: agency and metacognition were self-reported alongside mood, while melatonin acts on it only indirectly through sleep. One signal ran the other way, though only suggestively: residual variance was smaller on melatonin nights, compatible with a chronobiotic effect on stability while level is untouched. The individual is modeled here as a dynamical system and melatonin as a probe, used to map where that system responds and where it does not. The estimates are idiographic and are not offered as population effects. The procedure transfers even where the numbers do not: any variable that can be sampled repeatedly can take the place of the ones used here.</w:t>
       </w:r>
     </w:p>
     <w:p>
@@ -197,7 +197,7 @@
           <w:sz w:val="24"/>
           <w:szCs w:val="24"/>
         </w:rPr>
-        <w:t xml:space="preserve">This study puts them side by side in a single individual sampled three times daily for 70 days, with a nightly melatonin probe delivered on a pre-generated randomized schedule. The prediction that follows from the internal-dynamics account is parsimonious: the affective trajectory should be more strongly predicted by moment-to-moment variation in agency and metacognitive awareness than by the external probe. The account does not predict that external probes do nothing. It predicts that their effect is small relative to the system’s own self-regulatory machinery, and that whatever effect exists may appear in features of the trajectory other than its mean level.</w:t>
+        <w:t>This study puts them side by side in a single individual sampled three times daily for 70 days, with a nightly melatonin probe delivered on a pre-generated randomized schedule. The prediction that follows from the internal-dynamics account is parsimonious: the affective trajectory should be more strongly predicted by moment-to-moment variation in agency and metacognitive awareness than by the external probe. The account predicts that their effect is small relative to the system’s own self-regulatory machinery, and that whatever effect exists may appear in features of the trajectory other than its mean level.</w:t>
       </w:r>
     </w:p>
     <w:p>
@@ -327,7 +327,7 @@
           <w:sz w:val="24"/>
           <w:szCs w:val="24"/>
         </w:rPr>
-        <w:t xml:space="preserve">The second is what the melatonin is for. Standard intervention logic treats an external input as a lever: pull it, observe the outcome, read the effect size as the lever’s causal force. Dynamical systems accounts of affect describe something different. An external input perturbs a self-organizing system, which then responds according to its own internal structure, its inertia, its attractor states, and its sensitivity to inputs of particular magnitude and timing (Bringmann et al., 2013, 2022; Hamaker, 2012; Wichers, 2014). The response is informative primarily about the system, and only secondarily about the perturbation. Affective dynamics research gives this specificity: day-to-day mood variation is partly organized by autoregressive carryover, often termed emotional inertia, and the capacity of a system to be perturbed at all is itself a meaningful individual difference (Houben, Van Den Noortgate, &amp; Kuppens, 2015; Koval &amp; Kuppens, 2012; Kuppens, Allen, &amp; Sheeber, 2010).</w:t>
+        <w:t>The second is what the melatonin is for. Standard intervention logic treats an external input as a lever: pull it, observe the outcome, read the effect size as the lever’s causal force. Dynamical systems accounts of affect describe something different. An external input perturbs a self-organizing system, which then responds according to its own internal structure, its inertia, its attractor states, and its sensitivity to inputs of particular magnitude and timing (Bringmann et al., 2013, 2022; Hamaker, 2012; Wichers, 2014). The response is informative primarily about the system, and only secondarily about the perturbation. Affective dynamics research gives this specificity: day-to-day mood variation is partly organized by autoregressive carryover, often termed emotional inertia. The capacity of a system to be perturbed at all is itself a meaningful individual difference (Houben, Van Den Noortgate, &amp; Kuppens, 2015; Koval &amp; Kuppens, 2012; Kuppens, Allen, &amp; Sheeber, 2010).</w:t>
       </w:r>
     </w:p>
     <w:p>
@@ -593,7 +593,7 @@
           <w:sz w:val="24"/>
           <w:szCs w:val="24"/>
         </w:rPr>
-        <w:t xml:space="preserve">In the present study, melatonin is conceptualized not as a treatment under test but as an analytic probe: a perturbation input of known presence/absence, applied to an otherwise free-running system in order to characterize the system’s response function. The absolute magnitude of the melatonin effect on average mood is not the primary inferential target. The primary targets are (a) the fraction of variance in the system’s affective trajectory accounted for by the probe relative to the system’s endogenous drivers, and (b) whether the probe’s effect appears in features of the trajectory other than the mean, such as variability or decay rate (cf. Section 1.3).</w:t>
+        <w:t>In the present study, melatonin is conceptualized not as a treatment under test but as an analytic probe: a perturbation input of known presence/absence, applied to an otherwise free-running system in order to characterize the system’s response function. The absolute magnitude of the melatonin effect on average mood is not the primary inferential target. The primary targets are (a) the fraction of variance in the system’s affective trajectory accounted for by the probe relative to the system’s endogenous drivers. Target (b) is whether the probe’s effect appears in features of the trajectory other than the mean, such as variability or decay rate (cf. Section 1.3).</w:t>
       </w:r>
     </w:p>
     <w:p>
@@ -809,7 +809,7 @@
           <w:sz w:val="24"/>
           <w:szCs w:val="24"/>
         </w:rPr>
-        <w:t>Of the four substantive measures, mood and the melatonin manipulation check were collected from Day 1 of data collection (2026-02-18). Agency and metacognition items were added on Day 18 (2026-03-07) following an interim review of the protocol, in which the participant determined that the original mood-only design was insufficient to test the internal-versus-external research questions formulated in Section 1.4. All analyses involving agency or metacognition are restricted to Days 18–70. Within this window, the randomized schedule yielded 53 daily aggregates (27 control and 26 melatonin days) and 144 momentary observations; the AR(1) model with lag-1 alignment uses 53 days, with the first day in the window (Day 18) using Day 17's mood as its lag-1 predecessor. Mood-only analyses (descriptive statistics, between-condition mean comparison, and the observation-level AR(1) inertia estimate) use the full 195-observation sample.</w:t>
+        <w:t>Of the four substantive measures, mood and the melatonin manipulation check were collected from Day 1 of data collection (2026-02-18). Agency and metacognition items were added on Day 18 (2026-03-07) following an interim review of the protocol, in which the participant determined that the original mood-only design was insufficient to test the internal-versus-external research questions formulated in Section 1.4. All analyses involving agency or metacognition are restricted to Days 18–70. Within this window, the randomized schedule yielded 53 daily aggregates (27 control and 26 melatonin days) and 144 momentary observations. The AR(1) model with lag-1 alignment uses 53 days, with the first day in the window (Day 18) using Day 17's mood as its lag-1 predecessor. Mood-only analyses (descriptive statistics, between-condition mean comparison, and the observation-level AR(1) inertia estimate) use the full 195-observation sample.</w:t>
       </w:r>
     </w:p>
     <w:p>
@@ -1000,7 +1000,7 @@
         <w:rPr>
           <w:i w:val="0"/>
         </w:rPr>
-        <w:t xml:space="preserve"> = .305; AIC and BIC both favored the first-order model), and a Ljung-Box test found no residual autocorrelation in the AR(1) residuals (lag 10, </w:t>
+        <w:t xml:space="preserve"> = .305; AIC and BIC both favored the first-order model). A Ljung-Box test found no residual autocorrelation in the AR(1) residuals (lag 10, </w:t>
       </w:r>
       <w:r>
         <w:rPr>
@@ -1313,7 +1313,7 @@
           <w:sz w:val="24"/>
           <w:szCs w:val="24"/>
         </w:rPr>
-        <w:t>In addition to the mean-shift analyses above, three indices of mood variability were computed by condition: (a) the standard deviation of daily mood within each condition; (b) the mean squared successive difference (MSSD; Jahng, Wood, &amp; Trull, 2008), computed within contiguous within-condition runs of EMA observations and averaged across runs. The third was (c) the Brown–Forsythe Levene test of homogeneity of variance across conditions. A complementary heteroskedasticity model was fit by regressing the log-squared residuals from M2 on the melatonin indicator: log(ε²ₜ) = α₀ + α₁ · melatoninₜ + uₜ. A negative α₁ coefficient indicates that the model’s residual variance is smaller on melatonin days than on control days, consistent with a stability-enhancing rather than level-shifting effect of the probe.</w:t>
+        <w:t>In addition to the mean-shift analyses above, three indices of mood variability were computed by condition: (a) the standard deviation of daily mood within each condition; (b) the mean squared successive difference (MSSD; Jahng, Wood, &amp; Trull, 2008). The MSSD was computed within contiguous within-condition runs of EMA observations and averaged across runs. The third was (c) the Brown–Forsythe Levene test of homogeneity of variance across conditions. A complementary heteroskedasticity model was fit by regressing the log-squared residuals from M2 on the melatonin indicator: log(ε²ₜ) = α₀ + α₁ · melatoninₜ + uₜ. A negative α₁ coefficient indicates that the model’s residual variance is smaller on melatonin days than on control days, consistent with a stability-enhancing rather than level-shifting effect of the probe.</w:t>
       </w:r>
     </w:p>
     <w:p>
@@ -4422,7 +4422,7 @@
           <w:sz w:val="24"/>
           <w:szCs w:val="24"/>
         </w:rPr>
-        <w:t>The most direct empirical question, whether melatonin shifts average daily mood, yielded a small and statistically non-significant mean difference. Within a hypothesis-testing framework this would be an inconclusive result. Section 2.3 states the probe framing adopted in the reframing described in Section 1.5: an input of known presence and absence, applied to characterize the system’s response. On that framing the evidential question is how the probe’s contribution compares in magnitude with the system’s endogenous drivers, and the drop-one decomposition in Section 3.2 answers it directly: agency’s unique contribution was 19.7% of daily-mood variance, and the probe’s was 0.01%, indistinguishable from zero.</w:t>
+        <w:t>The most direct empirical question, whether melatonin shifts average daily mood, yielded a small and statistically non-significant mean difference. Within a hypothesis-testing framework this would be an inconclusive result. Section 2.3 states the probe framing adopted in the reframing described in Section 1.5: an input of known presence and absence, applied to characterize the system’s response. On that framing the evidential question is how the probe’s contribution compares in magnitude with the system’s endogenous drivers. The drop-one decomposition in Section 3.2 answers it directly: agency’s unique contribution was 19.7% of daily-mood variance, and the probe’s was 0.01%, indistinguishable from zero.</w:t>
       </w:r>
     </w:p>
     <w:p>

</xml_diff>

<commit_message>
credit the tools this study produced, and redraw the incremental R2 figure
</commit_message>
<xml_diff>
--- a/paper/manuscript.docx
+++ b/paper/manuscript.docx
@@ -54,6 +54,16 @@
       </w:r>
     </w:p>
     <w:p>
+      <w:r>
+        <w:t>Graduate School of Education, University of Pennsylvania, Philadelphia, Pennsylvania, United States</w:t>
+      </w:r>
+    </w:p>
+    <w:p>
+      <w:r>
+        <w:t>Correspondence: Miura Meng, Graduate School of Education, University of Pennsylvania, 3700 Walnut Street, Philadelphia, PA 19104, United States. Email: meng10@upenn.edu. Telephone: +1 (773) 406-8649.</w:t>
+      </w:r>
+    </w:p>
+    <w:p>
       <w:pPr>
         <w:spacing w:after="120" w:line="480"/>
         <w:jc w:val="center"/>
@@ -99,7 +109,7 @@
           <w:sz w:val="24"/>
           <w:szCs w:val="24"/>
         </w:rPr>
-        <w:t>Over 70 days, one adult recorded momentary emotional valence, perceived agency, and metacognitive awareness three times a day, and took 3 mg of melatonin on the nights assigned by a pre-generated randomized schedule. This yielded 195 observations at 92.9% compliance across 35 control and 35 melatonin days. Melatonin left mean daily mood essentially unchanged: the difference was +0.92 points on a 0 to 100 scale, d = 0.17, and an equivalence test placed it inside a pre-specified bound of five points, which gives the null a stated width. What moved with mood was the person’s own regulatory state. Perceived agency and metacognitive awareness together accounted for a further 51.5% of daily-mood variance beyond autoregressive carryover and the probe, lifting model R² from .125 to .641, and the same ordering held under Bayesian and multilevel re-estimation. The comparison is between predictors of different kinds: agency and metacognition were self-reported alongside mood, while melatonin acts on it only indirectly through sleep. One signal ran the other way, though only suggestively: residual variance was smaller on melatonin nights, compatible with a chronobiotic effect on stability while level is untouched. The individual is modeled here as a dynamical system and melatonin as a probe, used to map where that system responds and where it does not. The estimates are idiographic and are not offered as population effects. The procedure transfers even where the numbers do not: any variable that can be sampled repeatedly can take the place of the ones used here.</w:t>
+        <w:t>Over 70 days, one adult recorded momentary emotional valence, perceived agency, and metacognitive awareness three times a day, and took 3 mg of melatonin on the nights assigned by a pre-generated randomized schedule. This yielded 195 observations at 92.9% compliance across 35 control and 35 melatonin days. Melatonin left mean daily mood essentially unchanged: the difference was +0.92 points on a 0 to 100 scale, d = 0.17, and an equivalence test placed it inside a pre-specified bound of five points, which gives the null a stated width. What moved with mood was the person’s own regulatory state. Perceived agency and metacognitive awareness together accounted for a further 51.5% of daily-mood variance beyond autoregressive carryover and the probe, lifting model R² from .125 to .641, and the same ordering held under multilevel re-estimation. The comparison is between predictors of different kinds: agency and metacognition were self-reported alongside mood, while melatonin acts on it only indirectly through sleep. One signal ran the other way, though only suggestively: residual variance was smaller on melatonin nights, compatible with a chronobiotic effect on stability while level is untouched. The individual is modeled here as a dynamical system and melatonin as a probe, used to map where that system responds and where it does not. The estimates are idiographic and are not offered as population effects. The procedure transfers even where the numbers do not: any variable that can be sampled repeatedly can take the place of the ones used here.</w:t>
       </w:r>
     </w:p>
     <w:p>
@@ -341,7 +351,7 @@
           <w:sz w:val="24"/>
           <w:szCs w:val="24"/>
         </w:rPr>
-        <w:t xml:space="preserve">This carries a methodological consequence that matters for how the results below should be read. The conventional reading, that the design lacked power, presupposes a framework in which the intervention is a treatment whose efficacy is being assayed. That is not the framework here. The evidential question is where this system is sensitive and where it is not, and a probe that moves nothing on the mean has located one of those boundaries, provided the bound itself is estimated. Section 2.5.11 states how that bound was obtained. The control-theoretic vocabulary used here, including the language of system identification, is intended in an analytic and conceptual sense, as a way of organizing dynamical questions about a single person across time. </w:t>
+        <w:t>The control-theoretic vocabulary used here, including the language of system identification, is intended in an analytic and conceptual sense, as a way of organizing dynamical questions about a single person across time. On this framing the evidential question is where the system is sensitive and where it is not. A probe that moves nothing on the mean has located one of those boundaries, provided the bound itself is estimated. Section 2.5.10 states how that bound was obtained.</w:t>
       </w:r>
     </w:p>
     <w:p>
@@ -579,21 +589,21 @@
           <w:sz w:val="24"/>
           <w:szCs w:val="24"/>
         </w:rPr>
-        <w:t xml:space="preserve">Melatonin (3 mg, standard over-the-counter formulation) was administered before sleep on a schedule generated by a pre-specified randomization algorithm. The 70-day schedule was constrained to produce 35 active and 35 control days with no runs longer than two consecutive days in either condition, ensuring within-person crossover for time-series analysis and reducing the risk of carry-over effects from extended runs. The schedule was generated and stored in a JSON protocol file before data collection began and was not accessible to the participant during the EMA logging process; the daily condition was confirmed only after the corresponding evening’s EMA prompt had been completed.</w:t>
-      </w:r>
-    </w:p>
-    <w:p>
-      <w:pPr>
-        <w:spacing w:after="120" w:before="0" w:line="480"/>
-        <w:jc w:val="both"/>
-      </w:pPr>
-      <w:r>
-        <w:rPr>
-          <w:rFonts w:ascii="Times New Roman" w:cs="Times New Roman" w:eastAsia="Times New Roman" w:hAnsi="Times New Roman"/>
-          <w:sz w:val="24"/>
-          <w:szCs w:val="24"/>
-        </w:rPr>
-        <w:t>In the present study, melatonin is conceptualized not as a treatment under test but as an analytic probe: a perturbation input of known presence/absence, applied to an otherwise free-running system in order to characterize the system’s response function. The absolute magnitude of the melatonin effect on average mood is not the primary inferential target. The primary targets are (a) the fraction of variance in the system’s affective trajectory accounted for by the probe relative to the system’s endogenous drivers. Target (b) is whether the probe’s effect appears in features of the trajectory other than the mean, such as variability or decay rate (cf. Section 1.3).</w:t>
+        <w:t>Melatonin (3 mg, standard over-the-counter formulation) was administered before sleep on a schedule generated by a pre-specified randomization algorithm. The constrained-randomization procedure used to generate the schedule was later incorporated into the R package nof1kit (Version 0.1.0; Meng, 2026). The 70-day schedule was constrained to produce 35 active and 35 control days with no runs longer than two consecutive days in either condition, ensuring within-person crossover for time-series analysis and reducing the risk of carry-over effects from extended runs. The schedule was generated and stored in a JSON protocol file before data collection began and was not accessible to the participant during the EMA logging process; the daily condition was confirmed only after the corresponding evening’s EMA prompt had been completed.</w:t>
+      </w:r>
+    </w:p>
+    <w:p>
+      <w:pPr>
+        <w:spacing w:after="120" w:before="0" w:line="480"/>
+        <w:jc w:val="both"/>
+      </w:pPr>
+      <w:r>
+        <w:rPr>
+          <w:rFonts w:ascii="Times New Roman" w:cs="Times New Roman" w:eastAsia="Times New Roman" w:hAnsi="Times New Roman"/>
+          <w:sz w:val="24"/>
+          <w:szCs w:val="24"/>
+        </w:rPr>
+        <w:t>Melatonin functions here as an analytic probe: a perturbation input of known presence and absence, applied to an otherwise free-running system in order to characterize the system's response function. The primary targets are (a) the fraction of variance in the system's affective trajectory accounted for by the probe relative to the system's endogenous drivers, and (b) whether the probe's effect appears in features of the trajectory other than the mean, such as variability or decay rate (cf. Section 1.3).</w:t>
       </w:r>
     </w:p>
     <w:p>
@@ -841,7 +851,7 @@
           <w:sz w:val="24"/>
           <w:szCs w:val="24"/>
         </w:rPr>
-        <w:t xml:space="preserve">The data collection pipeline was implemented in iOS Shortcuts as a conditional programming environment, with control flow (variables, conditionals, dictionaries, file I/O) treated as equivalent to any lightweight scripting language. This implementation was developed because standard EMA platforms (Qualtrics, REDCap) introduced too much per-entry friction for a high-frequency, three-times-daily protocol over a 70-day window. Each prompt took approximately 8–12 seconds to complete and appended one row to a CSV file with an ISO-8601 timestamp. A Python validation layer ran after each new entry, performing range checks (mood, agency, and metacognition within 0–100), completeness checks (no required field missing), and duplicate-timestamp checks. Responses were typically completed within minutes of the scheduled prompt and, when delayed, within one hour. Because all entries were timestamped and the primary analyses were conducted either on daily means or on timestamp-ordered observations, these minor response latencies were retained as part of the natural EMA sampling process rather than treated as a separate manual-entry condition. Full pipeline source and validation code are available in the project repository (Section 5).</w:t>
+        <w:t>The data collection pipeline was implemented in iOS Shortcuts as a conditional programming environment, with control flow (variables, conditionals, dictionaries, file I/O) treated as equivalent to any lightweight scripting language. This implementation was developed because standard EMA platforms (Qualtrics, REDCap) introduced too much per-entry friction for a high-frequency, three-times-daily protocol over a 70-day window. Each prompt took approximately 8–12 seconds to complete and appended one row to a CSV file with an ISO-8601 timestamp. A Python validation layer ran after each new entry, performing range checks (mood, agency, and metacognition within 0–100), completeness checks (no required field missing), and duplicate-timestamp checks. Responses were typically completed within minutes of the scheduled prompt and, when delayed, within one hour. Because all entries were timestamped and the primary analyses were conducted either on daily means or on timestamp-ordered observations, these minor response latencies were retained as part of the natural EMA sampling process rather than treated as a separate manual-entry condition. Documentation and an installable copy of the Shortcut used in this study, together with the Python validation code, are available in the repositories described in Section 9.</w:t>
       </w:r>
     </w:p>
     <w:p>
@@ -862,6 +872,22 @@
     </w:p>
     <w:p>
       <w:pPr>
+        <w:spacing w:after="120" w:before="0" w:line="480"/>
+        <w:jc w:val="both"/>
+      </w:pPr>
+      <w:r>
+        <w:rPr>
+          <w:rFonts w:ascii="Times New Roman" w:cs="Times New Roman" w:eastAsia="Times New Roman" w:hAnsi="Times New Roman"/>
+          <w:b w:val="0"/>
+          <w:i w:val="0"/>
+          <w:sz w:val="24"/>
+          <w:szCs w:val="24"/>
+        </w:rPr>
+        <w:t>The analyses are organized in three tiers. The primary inference runs through the nested autoregressive models, their incremental-R² decomposition, and the equivalence test that bounds the probe's mean effect (Sections 2.5.1, 2.5.4, and 2.5.10); the state-space model and the impulse-response functions (Sections 2.5.2 and 2.5.3) characterize the dynamics that frame that comparison. The remaining sections are sensitivity, exploratory, and robustness analyses: the metacontrol and decay interactions, the variability indices, and a multilevel re-estimation that repeats the primary comparison without daily aggregation (Sections 2.5.5 through 2.5.9).</w:t>
+      </w:r>
+    </w:p>
+    <w:p>
+      <w:pPr>
         <w:pStyle w:val="Heading3"/>
         <w:spacing w:after="60" w:before="180" w:line="480"/>
       </w:pPr>
@@ -889,7 +915,7 @@
           <w:sz w:val="24"/>
           <w:szCs w:val="24"/>
         </w:rPr>
-        <w:t xml:space="preserve">Three nested autoregressive models were fit to daily mean mood. The baseline model (M0) is a first-order autoregression:</w:t>
+        <w:t>Three nested autoregressive models were fit to daily mean mood, estimated as regressions with lagged mood as a predictor. The state-space model reported separately in Section 2.5.2 characterizes the latent daily trajectory and is not part of this nested comparison. The baseline model (M0) is a first-order autoregression:</w:t>
       </w:r>
     </w:p>
     <w:p>
@@ -1250,7 +1276,7 @@
           <w:sz w:val="24"/>
           <w:szCs w:val="24"/>
         </w:rPr>
-        <w:t xml:space="preserve">The metacontrol hypothesis, that metacognitive awareness moderates the system’s responsiveness to external perturbation, was tested by adding a melatonin × metacognition interaction term, with metacognition mean-centered:</w:t>
+        <w:t>The metacontrol hypothesis holds that metacognitive awareness moderates the system’s responsiveness to external perturbation. It was tested by adding a melatonin × metacognition interaction term, with metacognition mean-centered:</w:t>
       </w:r>
     </w:p>
     <w:p>
@@ -1426,21 +1452,49 @@
           <w:sz w:val="24"/>
           <w:szCs w:val="24"/>
         </w:rPr>
-        <w:t xml:space="preserve">2.5.9 Bayesian robustness analysis</w:t>
-      </w:r>
-    </w:p>
-    <w:p>
-      <w:pPr>
-        <w:spacing w:after="120" w:before="0" w:line="480"/>
-        <w:jc w:val="both"/>
-      </w:pPr>
-      <w:r>
-        <w:rPr>
-          <w:rFonts w:ascii="Times New Roman" w:cs="Times New Roman" w:eastAsia="Times New Roman" w:hAnsi="Times New Roman"/>
-          <w:sz w:val="24"/>
-          <w:szCs w:val="24"/>
-        </w:rPr>
-        <w:t>As a robustness check, the primary M2 regression (Section 2.5.1) was re-estimated in a Bayesian framework using brms (Bürkner, 2017) in R, with Stan used for MCMC posterior sampling. Continuous variables (mood, lagged mood, agency, metacognitive awareness) were standardized prior to fitting; the melatonin indicator was retained on its original 0/1 scale. Weakly informative priors (Normal(0, 1) coefficients, Student-t(3, 0, 2.5) intercept, Exponential(1) residual SD) were used, with four chains of 4,000 iterations (1,000 warmup, adapt_delta = 0.95) yielding 12,000 post-warmup draws per parameter. A secondary Bayesian model additionally included a melatonin × metacognition interaction to provide a Bayesian counterpart of the metacontrol test (Section 2.5.5; Appendix C). It serves as a robustness check on the same conclusion: that internal behavioral drivers account for substantially more daily mood variation than the external probe.</w:t>
+        <w:t>2.5.9 Multilevel (mixed-effects) robustness analysis</w:t>
+      </w:r>
+    </w:p>
+    <w:p>
+      <w:pPr>
+        <w:spacing w:after="120" w:before="0" w:line="480"/>
+        <w:jc w:val="both"/>
+      </w:pPr>
+      <w:r>
+        <w:rPr>
+          <w:rFonts w:ascii="Times New Roman" w:cs="Times New Roman" w:eastAsia="Times New Roman" w:hAnsi="Times New Roman"/>
+          <w:sz w:val="24"/>
+          <w:szCs w:val="24"/>
+        </w:rPr>
+        <w:t>The primary models in Section 2.5.1 were fit to daily mean mood, collapsing the up-to-three momentary observations recorded each day into a single value. Although this aggregation stabilizes daily estimates, it discards within-day variation and treats each day as a single observation. The comparison was therefore re-estimated at the momentary level. A linear mixed-effects model retained every EMA observation and accounted for its nesting within days. Momentary mood was regressed on momentary agency and momentary metacognitive awareness (both grand-mean-centered) and the day’s melatonin indicator, with a random intercept for day:</w:t>
+      </w:r>
+    </w:p>
+    <w:p>
+      <w:pPr>
+        <w:spacing w:after="120" w:before="0" w:line="480"/>
+        <w:jc w:val="center"/>
+      </w:pPr>
+      <w:r>
+        <w:rPr>
+          <w:rFonts w:ascii="Times New Roman" w:cs="Times New Roman" w:eastAsia="Times New Roman" w:hAnsi="Times New Roman"/>
+          <w:sz w:val="24"/>
+          <w:szCs w:val="24"/>
+        </w:rPr>
+        <w:t xml:space="preserve">moodᵢⱼ = γ₀₀ + γ₁₀ · agencyᵢⱼ + γ₂₀ · metacognitionᵢⱼ + γ₃₀ · melatoninⱼ + u₀ⱼ + eᵢⱼ ,</w:t>
+      </w:r>
+    </w:p>
+    <w:p>
+      <w:pPr>
+        <w:spacing w:after="120" w:before="0" w:line="480"/>
+        <w:jc w:val="both"/>
+      </w:pPr>
+      <w:r>
+        <w:rPr>
+          <w:rFonts w:ascii="Times New Roman" w:cs="Times New Roman" w:eastAsia="Times New Roman" w:hAnsi="Times New Roman"/>
+          <w:sz w:val="24"/>
+          <w:szCs w:val="24"/>
+        </w:rPr>
+        <w:t>where i indexes the momentary observation within day j, u₀ⱼ ~ N(0, τ₀₀) is the day-level random intercept, and eᵢⱼ ~ N(0, σ²) is the within-day residual. The random intercept absorbs the between-day dependence that daily aggregation had otherwise handled by collapsing each day to its mean. Models were fit by restricted maximum likelihood in R 4.5 using lme4 (Bates, Mächler, Bolker, &amp; Walker, 2015), with Satterthwaite-approximated p-values from lmerTest (Kuznetsova, Brockhoff, &amp; Christensen, 2017). Between-day clustering was summarized by the intraclass correlation (ICC) from an unconditional model; variance explained was summarized by marginal R² (fixed effects only) and conditional R² (fixed effects plus random intercept). This analysis is restricted to the Day 18–70 window in which agency and metacognition were collected.</w:t>
       </w:r>
     </w:p>
     <w:p>
@@ -1458,49 +1512,21 @@
           <w:sz w:val="24"/>
           <w:szCs w:val="24"/>
         </w:rPr>
-        <w:t xml:space="preserve">2.5.10 Multilevel (mixed-effects) robustness analysis</w:t>
-      </w:r>
-    </w:p>
-    <w:p>
-      <w:pPr>
-        <w:spacing w:after="120" w:before="0" w:line="480"/>
-        <w:jc w:val="both"/>
-      </w:pPr>
-      <w:r>
-        <w:rPr>
-          <w:rFonts w:ascii="Times New Roman" w:cs="Times New Roman" w:eastAsia="Times New Roman" w:hAnsi="Times New Roman"/>
-          <w:sz w:val="24"/>
-          <w:szCs w:val="24"/>
-        </w:rPr>
-        <w:t xml:space="preserve">The primary models in Section 2.5.1 were fit to daily mean mood, collapsing the up-to-three momentary observations recorded each day into a single value. Although this aggregation stabilizes daily estimates, it discards within-day variation and treats each day as a single observation. As a robustness check on the internal-versus-external comparison, the relation among the internal drivers, the external probe, and mood was therefore re-estimated at the momentary level using a linear mixed-effects model that retained every EMA observation and accounted for its nesting within days. Momentary mood was regressed on momentary agency and momentary metacognitive awareness (both grand-mean-centered) and the day’s melatonin indicator, with a random intercept for day:</w:t>
-      </w:r>
-    </w:p>
-    <w:p>
-      <w:pPr>
-        <w:spacing w:after="120" w:before="0" w:line="480"/>
-        <w:jc w:val="center"/>
-      </w:pPr>
-      <w:r>
-        <w:rPr>
-          <w:rFonts w:ascii="Times New Roman" w:cs="Times New Roman" w:eastAsia="Times New Roman" w:hAnsi="Times New Roman"/>
-          <w:sz w:val="24"/>
-          <w:szCs w:val="24"/>
-        </w:rPr>
-        <w:t xml:space="preserve">moodᵢⱼ = γ₀₀ + γ₁₀ · agencyᵢⱼ + γ₂₀ · metacognitionᵢⱼ + γ₃₀ · melatoninⱼ + u₀ⱼ + eᵢⱼ ,</w:t>
-      </w:r>
-    </w:p>
-    <w:p>
-      <w:pPr>
-        <w:spacing w:after="120" w:before="0" w:line="480"/>
-        <w:jc w:val="both"/>
-      </w:pPr>
-      <w:r>
-        <w:rPr>
-          <w:rFonts w:ascii="Times New Roman" w:cs="Times New Roman" w:eastAsia="Times New Roman" w:hAnsi="Times New Roman"/>
-          <w:sz w:val="24"/>
-          <w:szCs w:val="24"/>
-        </w:rPr>
-        <w:t xml:space="preserve">where i indexes the momentary observation within day j, u₀ⱼ ~ N(0, τ₀₀) is the day-level random intercept, and eᵢⱼ ~ N(0, σ²) is the within-day residual. The random intercept absorbs the between-day dependence that daily aggregation had otherwise handled by collapsing each day to its mean. Models were fit by restricted maximum likelihood in R 4.5 using lme4 (Bates, Mächler, Bolker, &amp; Walker, 2015), with Satterthwaite-approximated p-values from lmerTest (Kuznetsova, Brockhoff, &amp; Christensen, 2017). Between-day clustering was summarized by the intraclass correlation (ICC) from an unconditional model; variance explained was summarized by marginal R² (fixed effects only) and conditional R² (fixed effects plus random intercept). This analysis is restricted to the Day 18–70 window in which agency and metacognition were collected.</w:t>
+        <w:t>2.5.10 Equivalence test for the melatonin mean effect</w:t>
+      </w:r>
+    </w:p>
+    <w:p>
+      <w:pPr>
+        <w:spacing w:after="120" w:before="0" w:line="480"/>
+        <w:jc w:val="both"/>
+      </w:pPr>
+      <w:r>
+        <w:rPr>
+          <w:rFonts w:ascii="Times New Roman" w:cs="Times New Roman" w:eastAsia="Times New Roman" w:hAnsi="Times New Roman"/>
+          <w:sz w:val="24"/>
+          <w:szCs w:val="24"/>
+        </w:rPr>
+        <w:t xml:space="preserve">Because a non-significant mean difference does not by itself establish the absence of a meaningful effect, the melatonin mean effect was also evaluated with a two one-sided tests (TOST) equivalence procedure (Lakens, 2017). A smallest effect size of interest (SESOI) of ±5 points on the 0–100 mood scale was specified as the smallest day-level mean shift judged practically meaningful for this individual, approximately 0.9 of the daily mood standard deviation. The TOST evaluates whether the observed effect is statistically closer to zero than to either equivalence bound, which is equivalent to testing whether the 90% confidence interval of the mean difference falls entirely within the bounds. A tighter ±3-point bound is reported alongside for comparison.</w:t>
       </w:r>
     </w:p>
     <w:p>
@@ -1518,38 +1544,6 @@
           <w:sz w:val="24"/>
           <w:szCs w:val="24"/>
         </w:rPr>
-        <w:t xml:space="preserve">2.5.11 Equivalence test for the melatonin mean effect</w:t>
-      </w:r>
-    </w:p>
-    <w:p>
-      <w:pPr>
-        <w:spacing w:after="120" w:before="0" w:line="480"/>
-        <w:jc w:val="both"/>
-      </w:pPr>
-      <w:r>
-        <w:rPr>
-          <w:rFonts w:ascii="Times New Roman" w:cs="Times New Roman" w:eastAsia="Times New Roman" w:hAnsi="Times New Roman"/>
-          <w:sz w:val="24"/>
-          <w:szCs w:val="24"/>
-        </w:rPr>
-        <w:t xml:space="preserve">Because a non-significant mean difference does not by itself establish the absence of a meaningful effect, the melatonin mean effect was also evaluated with a two one-sided tests (TOST) equivalence procedure (Lakens, 2017). A smallest effect size of interest (SESOI) of ±5 points on the 0–100 mood scale was specified as the smallest day-level mean shift judged practically meaningful for this individual, approximately 0.9 of the daily mood standard deviation. The TOST evaluates whether the observed effect is statistically closer to zero than to either equivalence bound, which is equivalent to testing whether the 90% confidence interval of the mean difference falls entirely within the bounds. A tighter ±3-point bound is reported alongside for comparison.</w:t>
-      </w:r>
-    </w:p>
-    <w:p>
-      <w:pPr>
-        <w:pStyle w:val="Heading3"/>
-        <w:spacing w:after="60" w:before="180" w:line="480"/>
-      </w:pPr>
-      <w:r>
-        <w:rPr>
-          <w:rFonts w:ascii="Times New Roman" w:cs="Times New Roman" w:eastAsia="Times New Roman" w:hAnsi="Times New Roman"/>
-          <w:b/>
-          <w:bCs/>
-          <w:i/>
-          <w:iCs/>
-          <w:sz w:val="24"/>
-          <w:szCs w:val="24"/>
-        </w:rPr>
         <w:t xml:space="preserve">Software</w:t>
       </w:r>
     </w:p>
@@ -1564,115 +1558,7 @@
           <w:sz w:val="24"/>
           <w:szCs w:val="24"/>
         </w:rPr>
-        <w:t xml:space="preserve">Primary analyses were performed in Python 3.11 using </w:t>
-      </w:r>
-      <w:r>
-        <w:rPr>
-          <w:rFonts w:ascii="Times New Roman" w:cs="Times New Roman" w:eastAsia="Times New Roman" w:hAnsi="Times New Roman"/>
-          <w:i/>
-          <w:iCs/>
-          <w:sz w:val="24"/>
-          <w:szCs w:val="24"/>
-        </w:rPr>
-        <w:t xml:space="preserve">statsmodels</w:t>
-      </w:r>
-      <w:r>
-        <w:rPr>
-          <w:rFonts w:ascii="Times New Roman" w:cs="Times New Roman" w:eastAsia="Times New Roman" w:hAnsi="Times New Roman"/>
-          <w:sz w:val="24"/>
-          <w:szCs w:val="24"/>
-        </w:rPr>
-        <w:t xml:space="preserve"> (Seabold &amp; Perktold, 2010) for OLS and state-space modeling, </w:t>
-      </w:r>
-      <w:r>
-        <w:rPr>
-          <w:rFonts w:ascii="Times New Roman" w:cs="Times New Roman" w:eastAsia="Times New Roman" w:hAnsi="Times New Roman"/>
-          <w:i/>
-          <w:iCs/>
-          <w:sz w:val="24"/>
-          <w:szCs w:val="24"/>
-        </w:rPr>
-        <w:t xml:space="preserve">scipy.stats</w:t>
-      </w:r>
-      <w:r>
-        <w:rPr>
-          <w:rFonts w:ascii="Times New Roman" w:cs="Times New Roman" w:eastAsia="Times New Roman" w:hAnsi="Times New Roman"/>
-          <w:sz w:val="24"/>
-          <w:szCs w:val="24"/>
-        </w:rPr>
-        <w:t xml:space="preserve"> for nonparametric tests, and </w:t>
-      </w:r>
-      <w:r>
-        <w:rPr>
-          <w:rFonts w:ascii="Times New Roman" w:cs="Times New Roman" w:eastAsia="Times New Roman" w:hAnsi="Times New Roman"/>
-          <w:i/>
-          <w:iCs/>
-          <w:sz w:val="24"/>
-          <w:szCs w:val="24"/>
-        </w:rPr>
-        <w:t xml:space="preserve">pandas</w:t>
-      </w:r>
-      <w:r>
-        <w:rPr>
-          <w:rFonts w:ascii="Times New Roman" w:cs="Times New Roman" w:eastAsia="Times New Roman" w:hAnsi="Times New Roman"/>
-          <w:sz w:val="24"/>
-          <w:szCs w:val="24"/>
-        </w:rPr>
-        <w:t xml:space="preserve"> and </w:t>
-      </w:r>
-      <w:r>
-        <w:rPr>
-          <w:rFonts w:ascii="Times New Roman" w:cs="Times New Roman" w:eastAsia="Times New Roman" w:hAnsi="Times New Roman"/>
-          <w:i/>
-          <w:iCs/>
-          <w:sz w:val="24"/>
-          <w:szCs w:val="24"/>
-        </w:rPr>
-        <w:t xml:space="preserve">NumPy</w:t>
-      </w:r>
-      <w:r>
-        <w:rPr>
-          <w:rFonts w:ascii="Times New Roman" w:cs="Times New Roman" w:eastAsia="Times New Roman" w:hAnsi="Times New Roman"/>
-          <w:sz w:val="24"/>
-          <w:szCs w:val="24"/>
-        </w:rPr>
-        <w:t xml:space="preserve"> for data handling. Figures were produced with </w:t>
-      </w:r>
-      <w:r>
-        <w:rPr>
-          <w:rFonts w:ascii="Times New Roman" w:cs="Times New Roman" w:eastAsia="Times New Roman" w:hAnsi="Times New Roman"/>
-          <w:i/>
-          <w:iCs/>
-          <w:sz w:val="24"/>
-          <w:szCs w:val="24"/>
-        </w:rPr>
-        <w:t xml:space="preserve">matplotlib</w:t>
-      </w:r>
-      <w:r>
-        <w:rPr>
-          <w:rFonts w:ascii="Times New Roman" w:cs="Times New Roman" w:eastAsia="Times New Roman" w:hAnsi="Times New Roman"/>
-          <w:sz w:val="24"/>
-          <w:szCs w:val="24"/>
-        </w:rPr>
-        <w:t xml:space="preserve">. Bayesian robustness models were fit in R 4.5 using </w:t>
-      </w:r>
-      <w:r>
-        <w:rPr>
-          <w:rFonts w:ascii="Times New Roman" w:cs="Times New Roman" w:eastAsia="Times New Roman" w:hAnsi="Times New Roman"/>
-          <w:i/>
-          <w:iCs/>
-          <w:sz w:val="24"/>
-          <w:szCs w:val="24"/>
-        </w:rPr>
-        <w:t xml:space="preserve">brms</w:t>
-      </w:r>
-      <w:r>
-        <w:rPr>
-          <w:rFonts w:ascii="Times New Roman" w:cs="Times New Roman" w:eastAsia="Times New Roman" w:hAnsi="Times New Roman"/>
-          <w:sz w:val="24"/>
-          <w:szCs w:val="24"/>
-        </w:rPr>
-        <w:t xml:space="preserve"> (Bürkner, 2017) with Stan used for MCMC posterior sampling. Analysis code is available in the project repository described in Section 5. The multilevel robustness models (Section 3.4; Appendix B) were fit in R 4.5 using lme4 (Bates et al., 2015) and lmerTest (Kuznetsova et al., 2017). The equivalence test (Section 2.5.11) was computed in R 4.5 using the TOSTER package (Lakens, 2017).</w:t>
+        <w:t>Primary analyses were performed in Python 3.11 using statsmodels (Seabold &amp; Perktold, 2010) for OLS and state-space modeling, scipy.stats for nonparametric tests, and pandas and NumPy for data handling. Figures were produced with matplotlib. Analysis code is available in the project repository described in Section 9. The multilevel robustness models (Section 3.4; Appendix B) were fit in R 4.5 using lme4 (Bates et al., 2015) and lmerTest (Kuznetsova et al., 2017). The equivalence test (Section 2.5.10) was computed in R 4.5 using the TOSTER package (Lakens, 2017).</w:t>
       </w:r>
     </w:p>
     <w:p>
@@ -4276,35 +4162,35 @@
           <w:sz w:val="24"/>
           <w:szCs w:val="24"/>
         </w:rPr>
-        <w:t>The primary comparison was reproduced under two alternative estimation frameworks, reported in full in Appendix B. A supplementary Bayesian regression with weakly informative priors placed the agency and metacognition coefficients clearly above zero (posterior probabilities of essentially 1) and the melatonin coefficient at approximately zero with a credible interval spanning it (Table B1). A multilevel re-analysis of all 144 momentary observations, without daily aggregation, again placed both internal drivers far above the probe (agency β = 0.34, metacognition β = 0.48, both p &lt; .001; melatonin β = 0.04, p = .946; Table B2). The two internal drivers exchange rank at this resolution, with metacognition the larger of the pair, so the ordering that holds throughout is between the internal block and the probe rather than within the block. An unconditional model placed approximately 32% of the variance in momentary mood between days (ICC = .32 in the full sample, .26 in the analysis window). The three daily prompts are therefore not independent observations and require either aggregation or an explicit nesting term; the within-day variance that daily aggregation sets aside is the larger share.</w:t>
-      </w:r>
-    </w:p>
-    <w:p>
-      <w:pPr>
-        <w:spacing w:after="120" w:before="0" w:line="480"/>
-        <w:jc w:val="both"/>
-      </w:pPr>
-      <w:r>
-        <w:rPr>
-          <w:rFonts w:ascii="Times New Roman" w:cs="Times New Roman" w:eastAsia="Times New Roman" w:hAnsi="Times New Roman"/>
-          <w:sz w:val="24"/>
-          <w:szCs w:val="24"/>
-        </w:rPr>
-        <w:t xml:space="preserve">Two further checks bear on the interpretation of the main result. The agency by melatonin interaction was indistinguishable from zero (β = −0.05, 95% CI [−0.41, +0.31], p = .791), so the agency to mood relation was statistically the same in both conditions and does not depend on the probe. The metacontrol interaction, treated here as exploratory, was negative as predicted but not reliably distinguishable from zero in either the frequentist or the Bayesian estimate; simple slopes and posterior summaries are in Appendix C.</w:t>
-      </w:r>
-    </w:p>
-    <w:p>
-      <w:pPr>
-        <w:spacing w:after="120" w:before="0" w:line="480"/>
-        <w:jc w:val="both"/>
-      </w:pPr>
-      <w:r>
-        <w:rPr>
-          <w:rFonts w:ascii="Times New Roman" w:cs="Times New Roman" w:eastAsia="Times New Roman" w:hAnsi="Times New Roman"/>
-          <w:sz w:val="24"/>
-          <w:szCs w:val="24"/>
-        </w:rPr>
-        <w:t xml:space="preserve">Emotional inertia was positive at both sampling resolutions, with an observation-level φ of 0.23, 95% CI [0.09, 0.37], and a daily-level φ of approximately 0.42 on the full sample (Figure A1). The two do not stand in the relation φ_day = φ_obs³ that a single first-order process would imply, so the AR(1) description should be read as resolution-specific. A local-level state-space decomposition of the daily series, the associated impulse response functions and half-lives, and the smoothed latent trajectory are reported in Appendix A (Figures A2 and A3).</w:t>
+        <w:t>The primary comparison was reproduced without daily aggregation. A multilevel re-analysis of all 144 momentary observations again placed both internal-state predictors far above the probe (agency β = 0.34, metacognition β = 0.48, both p &lt; .001; melatonin β = 0.04, p = .946; Table B.1). The two exchange rank at this resolution, with metacognition the larger of the pair, so the ordering that holds throughout is between the internal block and the probe rather than within the block. An unconditional model placed approximately 32% of the variance in momentary mood between days (ICC = .32 in the full sample, .26 in the analysis window). The three daily prompts are therefore not independent observations and require either aggregation or an explicit nesting term; the within-day variance that daily aggregation sets aside is the larger share. A Bayesian re-estimation of M2 with weakly informative priors, reported in the project repository (Section 9), reproduced the same ordering.</w:t>
+      </w:r>
+    </w:p>
+    <w:p>
+      <w:pPr>
+        <w:spacing w:after="120" w:before="0" w:line="480"/>
+        <w:jc w:val="both"/>
+      </w:pPr>
+      <w:r>
+        <w:rPr>
+          <w:rFonts w:ascii="Times New Roman" w:cs="Times New Roman" w:eastAsia="Times New Roman" w:hAnsi="Times New Roman"/>
+          <w:sz w:val="24"/>
+          <w:szCs w:val="24"/>
+        </w:rPr>
+        <w:t>Two further checks bear on the interpretation of the main result. The agency by melatonin interaction was indistinguishable from zero (β = −0.05, 95% CI [−0.41, +0.31], p = .791), so the agency to mood relation was statistically the same in both conditions and does not depend on the probe. The metacontrol interaction, treated here as exploratory, was negative as predicted but not reliably distinguishable from zero; simple slopes are in Appendix C.</w:t>
+      </w:r>
+    </w:p>
+    <w:p>
+      <w:pPr>
+        <w:spacing w:after="120" w:before="0" w:line="480"/>
+        <w:jc w:val="both"/>
+      </w:pPr>
+      <w:r>
+        <w:rPr>
+          <w:rFonts w:ascii="Times New Roman" w:cs="Times New Roman" w:eastAsia="Times New Roman" w:hAnsi="Times New Roman"/>
+          <w:sz w:val="24"/>
+          <w:szCs w:val="24"/>
+        </w:rPr>
+        <w:t>Emotional inertia was positive at both sampling resolutions, with an observation-level φ of 0.23, 95% CI [0.09, 0.37], and a daily-level φ of approximately 0.42 on the full sample (Figure A.1). The two do not stand in the relation φ_day = φ_obs³ that a single first-order process would imply, so the AR(1) description should be read as resolution-specific. A local-level state-space decomposition of the daily series, the associated impulse response functions and half-lives, and the smoothed latent trajectory are reported in Appendix A (Figures A.2 and A.3).</w:t>
       </w:r>
     </w:p>
     <w:p>
@@ -4350,7 +4236,7 @@
           <w:sz w:val="24"/>
           <w:szCs w:val="24"/>
         </w:rPr>
-        <w:t xml:space="preserve">The most informative finding in this study is the magnitude of the internal-driver contribution. Daily perceived agency contributed an incremental 19.7% of variance to the daily-mood model after accounting for emotional inertia, the external probe, and metacognitive awareness. Daily metacognition contributed an incremental 11.0% under the same controls. Both effects were estimated with narrow confidence intervals and were reliably distinguishable from zero, and the same ordering survived a Bayesian re-estimation and a multilevel re-analysis that did not aggregate to days.</w:t>
+        <w:t>The most informative finding in this study is the magnitude of the internal-driver contribution. Daily perceived agency contributed an incremental 19.7% of variance to the daily-mood model after accounting for emotional inertia, the external probe, and metacognitive awareness. Daily metacognition contributed an incremental 11.0% under the same controls. Both effects were estimated with narrow confidence intervals and were reliably distinguishable from zero, and the same ordering survived a multilevel re-analysis that did not aggregate to days.</w:t>
       </w:r>
     </w:p>
     <w:p>
@@ -4392,7 +4278,7 @@
           <w:sz w:val="24"/>
           <w:szCs w:val="24"/>
         </w:rPr>
-        <w:t xml:space="preserve">Metacognition behaved more simply than predicted. As a main-effect predictor it contributed reliably to daily mood, suggesting that the system’s read-out of its own state is bound up with that state. The metacontrol prediction, that higher metacognition would buffer the system against external perturbation, was direction-consistent in both the frequentist and Bayesian estimates and reached significance in neither. It is reported here as exploratory, and the estimates are in Appendix C.</w:t>
+        <w:t>Metacognition behaved more simply than predicted. As a main-effect predictor it contributed reliably to daily mood, suggesting that the system’s read-out of its own state is bound up with that state. The metacontrol prediction, that higher metacognition would buffer the system against external perturbation, was direction-consistent but did not reach significance. It is reported here as exploratory, and the estimates are in Appendix C.</w:t>
       </w:r>
     </w:p>
     <w:p>
@@ -4422,7 +4308,7 @@
           <w:sz w:val="24"/>
           <w:szCs w:val="24"/>
         </w:rPr>
-        <w:t>The most direct empirical question, whether melatonin shifts average daily mood, yielded a small and statistically non-significant mean difference. Within a hypothesis-testing framework this would be an inconclusive result. Section 2.3 states the probe framing adopted in the reframing described in Section 1.5: an input of known presence and absence, applied to characterize the system’s response. On that framing the evidential question is how the probe’s contribution compares in magnitude with the system’s endogenous drivers. The drop-one decomposition in Section 3.2 answers it directly: agency’s unique contribution was 19.7% of daily-mood variance, and the probe’s was 0.01%, indistinguishable from zero.</w:t>
+        <w:t>The most direct empirical question, whether melatonin shifts average daily mood, yielded a small and statistically non-significant mean difference. The evidential question set out in Section 2.3 is how the probe's contribution compares in magnitude with the system's endogenous drivers. The drop-one decomposition in Section 3.2 answers it directly: agency's unique contribution was 19.7% of daily-mood variance, and the probe's was 0.01%, indistinguishable from zero.</w:t>
       </w:r>
     </w:p>
     <w:p>
@@ -4566,7 +4452,7 @@
           <w:sz w:val="24"/>
           <w:szCs w:val="24"/>
         </w:rPr>
-        <w:t xml:space="preserve">What this study adds is an individual-level test of a claim usually argued at the population level. In one densely sampled person, the affective trajectory was organized far more by her own moment-to-moment sense of agency and self-monitoring than by a nightly pharmacological input, and the equivalence interval placed an upper bound on the input’s mean effect. The same design that produced that bound also produced a stability signal that a level-only analysis would have missed, which is an argument for testing pharmacological effects on the dynamics of affective trajectories as well as on their levels.</w:t>
+        <w:t>What this study adds is an individual-level test of a claim usually argued at the population level. In one densely sampled person, the affective trajectory was far more strongly predicted by her own moment-to-moment sense of agency and self-monitoring than by a nightly pharmacological input, and the equivalence interval placed an upper bound on the input’s mean effect. The same design that produced that bound also produced a stability signal that a level-only analysis would have missed, which is an argument for testing pharmacological effects on the dynamics of affective trajectories as well as on their levels.</w:t>
       </w:r>
     </w:p>
     <w:p>
@@ -4610,39 +4496,21 @@
           <w:sz w:val="28"/>
           <w:szCs w:val="28"/>
         </w:rPr>
-        <w:t xml:space="preserve">5. Data and Code Availability</w:t>
-      </w:r>
-    </w:p>
-    <w:p>
-      <w:pPr>
-        <w:spacing w:after="120" w:before="0" w:line="480"/>
-        <w:jc w:val="both"/>
-      </w:pPr>
-      <w:r>
-        <w:rPr>
-          <w:rFonts w:ascii="Times New Roman" w:cs="Times New Roman" w:eastAsia="Times New Roman" w:hAnsi="Times New Roman"/>
-          <w:sz w:val="24"/>
-          <w:szCs w:val="24"/>
-        </w:rPr>
-        <w:t xml:space="preserve">Data and analysis code are available at: </w:t>
-      </w:r>
-      <w:r>
-        <w:rPr>
-          <w:rFonts w:ascii="Times New Roman" w:cs="Times New Roman" w:eastAsia="Times New Roman" w:hAnsi="Times New Roman"/>
-          <w:color w:val="1A56DB"/>
-          <w:sz w:val="24"/>
-          <w:szCs w:val="24"/>
-          <w:u w:val="single"/>
-        </w:rPr>
-        <w:t xml:space="preserve">https://github.com/haomeng797-ship-it/n-of-1-melatonin-study</w:t>
-      </w:r>
-      <w:r>
-        <w:rPr>
-          <w:rFonts w:ascii="Times New Roman" w:cs="Times New Roman" w:eastAsia="Times New Roman" w:hAnsi="Times New Roman"/>
-          <w:sz w:val="24"/>
-          <w:szCs w:val="24"/>
-        </w:rPr>
-        <w:t xml:space="preserve">. The repository includes the pre-specified randomization schedule, iOS Shortcuts data-collection pipeline, Python validation layer, cleaned EMA dataset, and reproducible scripts for the figures and statistical estimates reported in this manuscript.</w:t>
+        <w:t>5. Acknowledgments</w:t>
+      </w:r>
+    </w:p>
+    <w:p>
+      <w:pPr>
+        <w:spacing w:after="120" w:before="0" w:line="480"/>
+        <w:jc w:val="both"/>
+      </w:pPr>
+      <w:r>
+        <w:rPr>
+          <w:rFonts w:ascii="Times New Roman" w:cs="Times New Roman" w:eastAsia="Times New Roman" w:hAnsi="Times New Roman"/>
+          <w:sz w:val="24"/>
+          <w:szCs w:val="24"/>
+        </w:rPr>
+        <w:t>This manuscript grew out of a course taught by David Lydon-Staley at the University of Pennsylvania. I am grateful for his extensive comments on the interim report that preceded this manuscript, as well as for his recommendation of the Journal for Person-Oriented Research as a venue for this work. I am also deeply grateful to Michael Rovine, whose detailed comments on two earlier drafts substantially strengthened the present version.</w:t>
       </w:r>
     </w:p>
     <w:p>
@@ -4658,21 +4526,21 @@
           <w:sz w:val="28"/>
           <w:szCs w:val="28"/>
         </w:rPr>
-        <w:t xml:space="preserve">6. Author Contributions</w:t>
-      </w:r>
-    </w:p>
-    <w:p>
-      <w:pPr>
-        <w:spacing w:after="120" w:before="0" w:line="480"/>
-        <w:jc w:val="both"/>
-      </w:pPr>
-      <w:r>
-        <w:rPr>
-          <w:rFonts w:ascii="Times New Roman" w:cs="Times New Roman" w:eastAsia="Times New Roman" w:hAnsi="Times New Roman"/>
-          <w:sz w:val="24"/>
-          <w:szCs w:val="24"/>
-        </w:rPr>
-        <w:t xml:space="preserve">Miura Meng (MM) designed the study, collected the data, performed the statistical analyses, and wrote the manuscript.</w:t>
+        <w:t>6. Funding</w:t>
+      </w:r>
+    </w:p>
+    <w:p>
+      <w:pPr>
+        <w:spacing w:after="120" w:before="0" w:line="480"/>
+        <w:jc w:val="both"/>
+      </w:pPr>
+      <w:r>
+        <w:rPr>
+          <w:rFonts w:ascii="Times New Roman" w:cs="Times New Roman" w:eastAsia="Times New Roman" w:hAnsi="Times New Roman"/>
+          <w:sz w:val="24"/>
+          <w:szCs w:val="24"/>
+        </w:rPr>
+        <w:t>This research received no specific grant from any funding agency in the public, commercial, or not-for-profit sectors.</w:t>
       </w:r>
     </w:p>
     <w:p>
@@ -4688,21 +4556,21 @@
           <w:sz w:val="28"/>
           <w:szCs w:val="28"/>
         </w:rPr>
-        <w:t xml:space="preserve">7. Declaration of Interests</w:t>
-      </w:r>
-    </w:p>
-    <w:p>
-      <w:pPr>
-        <w:spacing w:after="120" w:before="0" w:line="480"/>
-        <w:jc w:val="both"/>
-      </w:pPr>
-      <w:r>
-        <w:rPr>
-          <w:rFonts w:ascii="Times New Roman" w:cs="Times New Roman" w:eastAsia="Times New Roman" w:hAnsi="Times New Roman"/>
-          <w:sz w:val="24"/>
-          <w:szCs w:val="24"/>
-        </w:rPr>
-        <w:t xml:space="preserve">The author declares no conflict of interest.</w:t>
+        <w:t>7. Author Contributions</w:t>
+      </w:r>
+    </w:p>
+    <w:p>
+      <w:pPr>
+        <w:spacing w:after="120" w:before="0" w:line="480"/>
+        <w:jc w:val="both"/>
+      </w:pPr>
+      <w:r>
+        <w:rPr>
+          <w:rFonts w:ascii="Times New Roman" w:cs="Times New Roman" w:eastAsia="Times New Roman" w:hAnsi="Times New Roman"/>
+          <w:sz w:val="24"/>
+          <w:szCs w:val="24"/>
+        </w:rPr>
+        <w:t>Miura Meng (MM) designed the study, collected the data, performed the statistical analyses, and wrote the manuscript. The author read and approved the final manuscript.</w:t>
       </w:r>
     </w:p>
     <w:p>
@@ -4718,21 +4586,22 @@
           <w:sz w:val="28"/>
           <w:szCs w:val="28"/>
         </w:rPr>
-        <w:t xml:space="preserve">8. Acknowledgments</w:t>
-      </w:r>
-    </w:p>
-    <w:p>
-      <w:pPr>
-        <w:spacing w:after="120" w:before="0" w:line="480"/>
-        <w:jc w:val="both"/>
-      </w:pPr>
-      <w:r>
-        <w:rPr>
-          <w:rFonts w:ascii="Times New Roman" w:cs="Times New Roman" w:eastAsia="Times New Roman" w:hAnsi="Times New Roman"/>
-          <w:sz w:val="24"/>
-          <w:szCs w:val="24"/>
-        </w:rPr>
-        <w:t xml:space="preserve">I thank David Lydon-Staley for recommending the Journal for Person-Oriented Research as a venue for this work.</w:t>
+        <w:t>8. Ethics Statement</w:t>
+      </w:r>
+    </w:p>
+    <w:p>
+      <w:pPr>
+        <w:spacing w:after="120" w:before="0" w:line="480"/>
+        <w:jc w:val="both"/>
+      </w:pPr>
+      <w:r>
+        <w:rPr>
+          <w:rFonts w:ascii="Times New Roman" w:cs="Times New Roman" w:eastAsia="Times New Roman" w:hAnsi="Times New Roman"/>
+          <w:i w:val="0"/>
+          <w:sz w:val="24"/>
+          <w:szCs w:val="24"/>
+        </w:rPr>
+        <w:t>The University of Pennsylvania Institutional Review Board reviewed this study and determined that it constitutes Not Human Subjects Research, so formal Institutional Review Board approval was not required (determination issued by email on May 13, 2026; determination reference [INSERT NUMBER]). As the sole investigator and sole participant, the author consented to her own participation.</w:t>
       </w:r>
     </w:p>
     <w:p>
@@ -4748,21 +4617,34 @@
           <w:sz w:val="28"/>
           <w:szCs w:val="28"/>
         </w:rPr>
-        <w:t xml:space="preserve">9. Funding</w:t>
-      </w:r>
-    </w:p>
-    <w:p>
-      <w:pPr>
-        <w:spacing w:after="120" w:before="0" w:line="480"/>
-        <w:jc w:val="both"/>
-      </w:pPr>
-      <w:r>
-        <w:rPr>
-          <w:rFonts w:ascii="Times New Roman" w:cs="Times New Roman" w:eastAsia="Times New Roman" w:hAnsi="Times New Roman"/>
-          <w:sz w:val="24"/>
-          <w:szCs w:val="24"/>
-        </w:rPr>
-        <w:t xml:space="preserve">This research received no specific grant from any funding agency in the public, commercial, or not-for-profit sectors.</w:t>
+        <w:t>9. Data and Code Availability</w:t>
+      </w:r>
+    </w:p>
+    <w:p>
+      <w:pPr>
+        <w:spacing w:after="120" w:before="0" w:line="480"/>
+        <w:jc w:val="both"/>
+      </w:pPr>
+      <w:r>
+        <w:rPr>
+          <w:rFonts w:ascii="Times New Roman" w:cs="Times New Roman" w:eastAsia="Times New Roman" w:hAnsi="Times New Roman"/>
+          <w:sz w:val="24"/>
+          <w:szCs w:val="24"/>
+        </w:rPr>
+        <w:t>Data and analysis code are available at https://github.com/haomeng797-ship-it/n-of-1-melatonin-study. The repository contains the pre-specified randomization schedule with a script that verifies it against the protocol constraints, the Python validation layer, the cleaned EMA data, and reproducible scripts for the figures and statistical estimates reported here. Documentation and an installable copy of the Shortcut used for data collection are available at https://github.com/haomeng797-ship-it/melatonin-ema-logger. The same repository also contains source code for a native iOS implementation developed after data collection; that application was not used in this study. The constrained-randomization procedure used to generate the schedule was later incorporated into nof1kit (Version 0.1.0; Meng, 2026).</w:t>
+      </w:r>
+    </w:p>
+    <w:p>
+      <w:pPr>
+        <w:pStyle w:val="Heading1"/>
+      </w:pPr>
+      <w:r>
+        <w:t>10. Declaration of Interests</w:t>
+      </w:r>
+    </w:p>
+    <w:p>
+      <w:r>
+        <w:t>The Author declares that there is no conflict of interest.</w:t>
       </w:r>
     </w:p>
     <w:p>
@@ -4778,7 +4660,7 @@
           <w:sz w:val="28"/>
           <w:szCs w:val="28"/>
         </w:rPr>
-        <w:t xml:space="preserve">10. References</w:t>
+        <w:t>11. References</w:t>
       </w:r>
     </w:p>
     <w:p>
@@ -5024,7 +4906,16 @@
           <w:sz w:val="24"/>
           <w:szCs w:val="24"/>
         </w:rPr>
-        <w:t xml:space="preserve">Bringmann, L. F., Albers, C., Bockting, C., Borsboom, D., Ceulemans, E., Cramer, A. O. J., ... &amp; Wichers, M. (2022). Psychopathological networks: Theory, methods and practice. Behaviour Research and Therapy, 149, 104011. https://doi.org/10.1016/j.brat.2021.104011</w:t>
+        <w:t xml:space="preserve">Bringmann, L. F., Albers, C., Bockting, C., Borsboom, D., Ceulemans, E., Cramer, A. O. J., Epskamp, S., Eronen, M. I., Hamaker, E., Kuppens, P., Lutz, W., McNally, R. J., Molenaar, P., Tio, P., Voelkle, M. C., &amp; Wichers, M. (2022). Psychopathological networks: Theory, methods and practice. </w:t>
+      </w:r>
+      <w:r>
+        <w:rPr>
+          <w:i/>
+        </w:rPr>
+        <w:t>Behaviour Research and Therapy, 149</w:t>
+      </w:r>
+      <w:r>
+        <w:t>, 104011. https://doi.org/10.1016/j.brat.2021.104011</w:t>
       </w:r>
     </w:p>
     <w:p>
@@ -5038,7 +4929,7 @@
           <w:sz w:val="24"/>
           <w:szCs w:val="24"/>
         </w:rPr>
-        <w:t xml:space="preserve">Bürkner, P.-C. (2017). brms: An R package for Bayesian multilevel models using Stan. </w:t>
+        <w:t xml:space="preserve">Carver, C. S., &amp; Scheier, M. F. (1990). Origins and functions of positive and negative affect: A control-process view. </w:t>
       </w:r>
       <w:r>
         <w:rPr>
@@ -5048,15 +4939,15 @@
           <w:sz w:val="24"/>
           <w:szCs w:val="24"/>
         </w:rPr>
-        <w:t xml:space="preserve">Journal of Statistical Software, 80</w:t>
-      </w:r>
-      <w:r>
-        <w:rPr>
-          <w:rFonts w:ascii="Times New Roman" w:cs="Times New Roman" w:eastAsia="Times New Roman" w:hAnsi="Times New Roman"/>
-          <w:sz w:val="24"/>
-          <w:szCs w:val="24"/>
-        </w:rPr>
-        <w:t xml:space="preserve">(1), 1–28.</w:t>
+        <w:t xml:space="preserve">Psychological Review, 97</w:t>
+      </w:r>
+      <w:r>
+        <w:rPr>
+          <w:rFonts w:ascii="Times New Roman" w:cs="Times New Roman" w:eastAsia="Times New Roman" w:hAnsi="Times New Roman"/>
+          <w:sz w:val="24"/>
+          <w:szCs w:val="24"/>
+        </w:rPr>
+        <w:t xml:space="preserve">(1), 19–35.</w:t>
       </w:r>
       <w:r>
         <w:rPr>
@@ -5066,7 +4957,7 @@
           <w:szCs w:val="24"/>
           <w:u w:val="single"/>
         </w:rPr>
-        <w:t xml:space="preserve"> https://doi.org/10.18637/jss.v080.i01</w:t>
+        <w:t xml:space="preserve"> https://doi.org/10.1037/0033-295X.97.1.19</w:t>
       </w:r>
     </w:p>
     <w:p>
@@ -5080,7 +4971,7 @@
           <w:sz w:val="24"/>
           <w:szCs w:val="24"/>
         </w:rPr>
-        <w:t xml:space="preserve">Carver, C. S., &amp; Scheier, M. F. (1990). Origins and functions of positive and negative affect: A control-process view. </w:t>
+        <w:t xml:space="preserve">Carver, C. S., &amp; Scheier, M. F. (1998). </w:t>
       </w:r>
       <w:r>
         <w:rPr>
@@ -5090,25 +4981,15 @@
           <w:sz w:val="24"/>
           <w:szCs w:val="24"/>
         </w:rPr>
-        <w:t xml:space="preserve">Psychological Review, 97</w:t>
-      </w:r>
-      <w:r>
-        <w:rPr>
-          <w:rFonts w:ascii="Times New Roman" w:cs="Times New Roman" w:eastAsia="Times New Roman" w:hAnsi="Times New Roman"/>
-          <w:sz w:val="24"/>
-          <w:szCs w:val="24"/>
-        </w:rPr>
-        <w:t xml:space="preserve">(1), 19–35.</w:t>
-      </w:r>
-      <w:r>
-        <w:rPr>
-          <w:rFonts w:ascii="Times New Roman" w:cs="Times New Roman" w:eastAsia="Times New Roman" w:hAnsi="Times New Roman"/>
-          <w:color w:val="1A56DB"/>
-          <w:sz w:val="24"/>
-          <w:szCs w:val="24"/>
-          <w:u w:val="single"/>
-        </w:rPr>
-        <w:t xml:space="preserve"> https://doi.org/10.1037/0033-295X.97.1.19</w:t>
+        <w:t xml:space="preserve">On the self-regulation of behavior</w:t>
+      </w:r>
+      <w:r>
+        <w:rPr>
+          <w:rFonts w:ascii="Times New Roman" w:cs="Times New Roman" w:eastAsia="Times New Roman" w:hAnsi="Times New Roman"/>
+          <w:sz w:val="24"/>
+          <w:szCs w:val="24"/>
+        </w:rPr>
+        <w:t xml:space="preserve">. Cambridge University Press.</w:t>
       </w:r>
     </w:p>
     <w:p>
@@ -5122,7 +5003,7 @@
           <w:sz w:val="24"/>
           <w:szCs w:val="24"/>
         </w:rPr>
-        <w:t xml:space="preserve">Carver, C. S., &amp; Scheier, M. F. (1998). </w:t>
+        <w:t xml:space="preserve">Conner, T. S., &amp; Reid, K. A. (2012). Effects of intensive mobile happiness reporting in daily life. </w:t>
       </w:r>
       <w:r>
         <w:rPr>
@@ -5132,15 +5013,25 @@
           <w:sz w:val="24"/>
           <w:szCs w:val="24"/>
         </w:rPr>
-        <w:t xml:space="preserve">On the self-regulation of behavior</w:t>
-      </w:r>
-      <w:r>
-        <w:rPr>
-          <w:rFonts w:ascii="Times New Roman" w:cs="Times New Roman" w:eastAsia="Times New Roman" w:hAnsi="Times New Roman"/>
-          <w:sz w:val="24"/>
-          <w:szCs w:val="24"/>
-        </w:rPr>
-        <w:t xml:space="preserve">. Cambridge University Press.</w:t>
+        <w:t xml:space="preserve">Social Psychological and Personality Science, 3</w:t>
+      </w:r>
+      <w:r>
+        <w:rPr>
+          <w:rFonts w:ascii="Times New Roman" w:cs="Times New Roman" w:eastAsia="Times New Roman" w:hAnsi="Times New Roman"/>
+          <w:sz w:val="24"/>
+          <w:szCs w:val="24"/>
+        </w:rPr>
+        <w:t xml:space="preserve">(3), 315–323.</w:t>
+      </w:r>
+      <w:r>
+        <w:rPr>
+          <w:rFonts w:ascii="Times New Roman" w:cs="Times New Roman" w:eastAsia="Times New Roman" w:hAnsi="Times New Roman"/>
+          <w:color w:val="1A56DB"/>
+          <w:sz w:val="24"/>
+          <w:szCs w:val="24"/>
+          <w:u w:val="single"/>
+        </w:rPr>
+        <w:t xml:space="preserve"> https://doi.org/10.1177/1948550611419677</w:t>
       </w:r>
     </w:p>
     <w:p>
@@ -5154,7 +5045,7 @@
           <w:sz w:val="24"/>
           <w:szCs w:val="24"/>
         </w:rPr>
-        <w:t xml:space="preserve">Conner, T. S., &amp; Reid, K. A. (2012). Effects of intensive mobile happiness reporting in daily life. </w:t>
+        <w:t xml:space="preserve">Dejonckheere, E., Demeyer, F., Geusens, B., Piot, M., Tuerlinckx, F., Verdonck, S., &amp; Mestdagh, M. (2022). Assessing the reliability of single-item momentary affective measurements in experience sampling. </w:t>
       </w:r>
       <w:r>
         <w:rPr>
@@ -5164,15 +5055,15 @@
           <w:sz w:val="24"/>
           <w:szCs w:val="24"/>
         </w:rPr>
-        <w:t xml:space="preserve">Social Psychological and Personality Science, 3</w:t>
-      </w:r>
-      <w:r>
-        <w:rPr>
-          <w:rFonts w:ascii="Times New Roman" w:cs="Times New Roman" w:eastAsia="Times New Roman" w:hAnsi="Times New Roman"/>
-          <w:sz w:val="24"/>
-          <w:szCs w:val="24"/>
-        </w:rPr>
-        <w:t xml:space="preserve">(3), 315–323.</w:t>
+        <w:t xml:space="preserve">Psychological Assessment, 34</w:t>
+      </w:r>
+      <w:r>
+        <w:rPr>
+          <w:rFonts w:ascii="Times New Roman" w:cs="Times New Roman" w:eastAsia="Times New Roman" w:hAnsi="Times New Roman"/>
+          <w:sz w:val="24"/>
+          <w:szCs w:val="24"/>
+        </w:rPr>
+        <w:t xml:space="preserve">(12), 1138–1154.</w:t>
       </w:r>
       <w:r>
         <w:rPr>
@@ -5182,7 +5073,7 @@
           <w:szCs w:val="24"/>
           <w:u w:val="single"/>
         </w:rPr>
-        <w:t xml:space="preserve"> https://doi.org/10.1177/1948550611419677</w:t>
+        <w:t xml:space="preserve"> https://doi.org/10.1037/pas0001178</w:t>
       </w:r>
     </w:p>
     <w:p>
@@ -5196,7 +5087,7 @@
           <w:sz w:val="24"/>
           <w:szCs w:val="24"/>
         </w:rPr>
-        <w:t xml:space="preserve">Dejonckheere, E., Demeyer, F., Geusens, B., Piot, M., Tuerlinckx, F., Verdonck, S., &amp; Mestdagh, M. (2022). Assessing the reliability of single-item momentary affective measurements in experience sampling. </w:t>
+        <w:t xml:space="preserve">Efklides, A. (2008). Metacognition: Defining its facets and levels of functioning in relation to self-regulation and co-regulation. </w:t>
       </w:r>
       <w:r>
         <w:rPr>
@@ -5206,15 +5097,15 @@
           <w:sz w:val="24"/>
           <w:szCs w:val="24"/>
         </w:rPr>
-        <w:t xml:space="preserve">Psychological Assessment, 34</w:t>
-      </w:r>
-      <w:r>
-        <w:rPr>
-          <w:rFonts w:ascii="Times New Roman" w:cs="Times New Roman" w:eastAsia="Times New Roman" w:hAnsi="Times New Roman"/>
-          <w:sz w:val="24"/>
-          <w:szCs w:val="24"/>
-        </w:rPr>
-        <w:t xml:space="preserve">(12), 1138–1154.</w:t>
+        <w:t xml:space="preserve">European Psychologist, 13</w:t>
+      </w:r>
+      <w:r>
+        <w:rPr>
+          <w:rFonts w:ascii="Times New Roman" w:cs="Times New Roman" w:eastAsia="Times New Roman" w:hAnsi="Times New Roman"/>
+          <w:sz w:val="24"/>
+          <w:szCs w:val="24"/>
+        </w:rPr>
+        <w:t xml:space="preserve">(4), 277–287.</w:t>
       </w:r>
       <w:r>
         <w:rPr>
@@ -5224,7 +5115,7 @@
           <w:szCs w:val="24"/>
           <w:u w:val="single"/>
         </w:rPr>
-        <w:t xml:space="preserve"> https://doi.org/10.1037/pas0001178</w:t>
+        <w:t xml:space="preserve"> https://doi.org/10.1027/1016-9040.13.4.277</w:t>
       </w:r>
     </w:p>
     <w:p>
@@ -5238,7 +5129,7 @@
           <w:sz w:val="24"/>
           <w:szCs w:val="24"/>
         </w:rPr>
-        <w:t xml:space="preserve">Efklides, A. (2008). Metacognition: Defining its facets and levels of functioning in relation to self-regulation and co-regulation. </w:t>
+        <w:t xml:space="preserve">Eisele, G., Vachon, H., Lafit, G., Kuppens, P., Houben, M., Myin-Germeys, I., &amp; Viechtbauer, W. (2022). The effects of sampling frequency and questionnaire length on perceived burden, compliance, and careless responding in experience sampling data in a student population. </w:t>
       </w:r>
       <w:r>
         <w:rPr>
@@ -5248,15 +5139,15 @@
           <w:sz w:val="24"/>
           <w:szCs w:val="24"/>
         </w:rPr>
-        <w:t xml:space="preserve">European Psychologist, 13</w:t>
-      </w:r>
-      <w:r>
-        <w:rPr>
-          <w:rFonts w:ascii="Times New Roman" w:cs="Times New Roman" w:eastAsia="Times New Roman" w:hAnsi="Times New Roman"/>
-          <w:sz w:val="24"/>
-          <w:szCs w:val="24"/>
-        </w:rPr>
-        <w:t xml:space="preserve">(4), 277–287.</w:t>
+        <w:t xml:space="preserve">Assessment, 29</w:t>
+      </w:r>
+      <w:r>
+        <w:rPr>
+          <w:rFonts w:ascii="Times New Roman" w:cs="Times New Roman" w:eastAsia="Times New Roman" w:hAnsi="Times New Roman"/>
+          <w:sz w:val="24"/>
+          <w:szCs w:val="24"/>
+        </w:rPr>
+        <w:t xml:space="preserve">(2), 136–151.</w:t>
       </w:r>
       <w:r>
         <w:rPr>
@@ -5266,7 +5157,7 @@
           <w:szCs w:val="24"/>
           <w:u w:val="single"/>
         </w:rPr>
-        <w:t xml:space="preserve"> https://doi.org/10.1027/1016-9040.13.4.277</w:t>
+        <w:t xml:space="preserve"> https://doi.org/10.1177/1073191120957102</w:t>
       </w:r>
     </w:p>
     <w:p>
@@ -5280,7 +5171,7 @@
           <w:sz w:val="24"/>
           <w:szCs w:val="24"/>
         </w:rPr>
-        <w:t xml:space="preserve">Eisele, G., Vachon, H., Lafit, G., Kuppens, P., Houben, M., Myin-Germeys, I., &amp; Viechtbauer, W. (2022). The effects of sampling frequency and questionnaire length on perceived burden, compliance, and careless responding in experience sampling data in a student population. </w:t>
+        <w:t xml:space="preserve">Flavell, J. H. (1979). Metacognition and cognitive monitoring: A new area of cognitive–developmental inquiry. </w:t>
       </w:r>
       <w:r>
         <w:rPr>
@@ -5290,15 +5181,15 @@
           <w:sz w:val="24"/>
           <w:szCs w:val="24"/>
         </w:rPr>
-        <w:t xml:space="preserve">Assessment, 29</w:t>
-      </w:r>
-      <w:r>
-        <w:rPr>
-          <w:rFonts w:ascii="Times New Roman" w:cs="Times New Roman" w:eastAsia="Times New Roman" w:hAnsi="Times New Roman"/>
-          <w:sz w:val="24"/>
-          <w:szCs w:val="24"/>
-        </w:rPr>
-        <w:t xml:space="preserve">(2), 136–151.</w:t>
+        <w:t xml:space="preserve">American Psychologist, 34</w:t>
+      </w:r>
+      <w:r>
+        <w:rPr>
+          <w:rFonts w:ascii="Times New Roman" w:cs="Times New Roman" w:eastAsia="Times New Roman" w:hAnsi="Times New Roman"/>
+          <w:sz w:val="24"/>
+          <w:szCs w:val="24"/>
+        </w:rPr>
+        <w:t xml:space="preserve">(10), 906–911.</w:t>
       </w:r>
       <w:r>
         <w:rPr>
@@ -5308,7 +5199,7 @@
           <w:szCs w:val="24"/>
           <w:u w:val="single"/>
         </w:rPr>
-        <w:t xml:space="preserve"> https://doi.org/10.1177/1073191120957102</w:t>
+        <w:t xml:space="preserve"> https://doi.org/10.1037/0003-066X.34.10.906</w:t>
       </w:r>
     </w:p>
     <w:p>
@@ -5322,7 +5213,7 @@
           <w:sz w:val="24"/>
           <w:szCs w:val="24"/>
         </w:rPr>
-        <w:t xml:space="preserve">Flavell, J. H. (1979). Metacognition and cognitive monitoring: A new area of cognitive–developmental inquiry. </w:t>
+        <w:t xml:space="preserve">Hamaker, E. L. (2012). Why researchers should think “within-person”: A paradigmatic rationale. In M. R. Mehl &amp; T. S. Conner (Eds.), </w:t>
       </w:r>
       <w:r>
         <w:rPr>
@@ -5332,25 +5223,15 @@
           <w:sz w:val="24"/>
           <w:szCs w:val="24"/>
         </w:rPr>
-        <w:t xml:space="preserve">American Psychologist, 34</w:t>
-      </w:r>
-      <w:r>
-        <w:rPr>
-          <w:rFonts w:ascii="Times New Roman" w:cs="Times New Roman" w:eastAsia="Times New Roman" w:hAnsi="Times New Roman"/>
-          <w:sz w:val="24"/>
-          <w:szCs w:val="24"/>
-        </w:rPr>
-        <w:t xml:space="preserve">(10), 906–911.</w:t>
-      </w:r>
-      <w:r>
-        <w:rPr>
-          <w:rFonts w:ascii="Times New Roman" w:cs="Times New Roman" w:eastAsia="Times New Roman" w:hAnsi="Times New Roman"/>
-          <w:color w:val="1A56DB"/>
-          <w:sz w:val="24"/>
-          <w:szCs w:val="24"/>
-          <w:u w:val="single"/>
-        </w:rPr>
-        <w:t xml:space="preserve"> https://doi.org/10.1037/0003-066X.34.10.906</w:t>
+        <w:t xml:space="preserve">Handbook of research methods for studying daily life</w:t>
+      </w:r>
+      <w:r>
+        <w:rPr>
+          <w:rFonts w:ascii="Times New Roman" w:cs="Times New Roman" w:eastAsia="Times New Roman" w:hAnsi="Times New Roman"/>
+          <w:sz w:val="24"/>
+          <w:szCs w:val="24"/>
+        </w:rPr>
+        <w:t xml:space="preserve"> (pp. 43–61). Guilford Press.</w:t>
       </w:r>
     </w:p>
     <w:p>
@@ -5364,7 +5245,7 @@
           <w:sz w:val="24"/>
           <w:szCs w:val="24"/>
         </w:rPr>
-        <w:t xml:space="preserve">Hamaker, E. L. (2012). Why researchers should think “within-person”: A paradigmatic rationale. In M. R. Mehl &amp; T. S. Conner (Eds.), </w:t>
+        <w:t xml:space="preserve">Houben, M., Van Den Noortgate, W., &amp; Kuppens, P. (2015). The relation between short-term emotion dynamics and psychological well-being: A meta-analysis. </w:t>
       </w:r>
       <w:r>
         <w:rPr>
@@ -5374,15 +5255,25 @@
           <w:sz w:val="24"/>
           <w:szCs w:val="24"/>
         </w:rPr>
-        <w:t xml:space="preserve">Handbook of research methods for studying daily life</w:t>
-      </w:r>
-      <w:r>
-        <w:rPr>
-          <w:rFonts w:ascii="Times New Roman" w:cs="Times New Roman" w:eastAsia="Times New Roman" w:hAnsi="Times New Roman"/>
-          <w:sz w:val="24"/>
-          <w:szCs w:val="24"/>
-        </w:rPr>
-        <w:t xml:space="preserve"> (pp. 43–61). Guilford Press.</w:t>
+        <w:t xml:space="preserve">Psychological Bulletin, 141</w:t>
+      </w:r>
+      <w:r>
+        <w:rPr>
+          <w:rFonts w:ascii="Times New Roman" w:cs="Times New Roman" w:eastAsia="Times New Roman" w:hAnsi="Times New Roman"/>
+          <w:sz w:val="24"/>
+          <w:szCs w:val="24"/>
+        </w:rPr>
+        <w:t xml:space="preserve">(4), 901–930.</w:t>
+      </w:r>
+      <w:r>
+        <w:rPr>
+          <w:rFonts w:ascii="Times New Roman" w:cs="Times New Roman" w:eastAsia="Times New Roman" w:hAnsi="Times New Roman"/>
+          <w:color w:val="1A56DB"/>
+          <w:sz w:val="24"/>
+          <w:szCs w:val="24"/>
+          <w:u w:val="single"/>
+        </w:rPr>
+        <w:t xml:space="preserve"> https://doi.org/10.1037/a0038822</w:t>
       </w:r>
     </w:p>
     <w:p>
@@ -5396,7 +5287,7 @@
           <w:sz w:val="24"/>
           <w:szCs w:val="24"/>
         </w:rPr>
-        <w:t xml:space="preserve">Houben, M., Van Den Noortgate, W., &amp; Kuppens, P. (2015). The relation between short-term emotion dynamics and psychological well-being: A meta-analysis. </w:t>
+        <w:t xml:space="preserve">Jahng, S., Wood, P. K., &amp; Trull, T. J. (2008). Analysis of affective instability in ecological momentary assessment: Indices using successive difference and group comparison via multilevel modeling. </w:t>
       </w:r>
       <w:r>
         <w:rPr>
@@ -5406,15 +5297,15 @@
           <w:sz w:val="24"/>
           <w:szCs w:val="24"/>
         </w:rPr>
-        <w:t xml:space="preserve">Psychological Bulletin, 141</w:t>
-      </w:r>
-      <w:r>
-        <w:rPr>
-          <w:rFonts w:ascii="Times New Roman" w:cs="Times New Roman" w:eastAsia="Times New Roman" w:hAnsi="Times New Roman"/>
-          <w:sz w:val="24"/>
-          <w:szCs w:val="24"/>
-        </w:rPr>
-        <w:t xml:space="preserve">(4), 901–930.</w:t>
+        <w:t xml:space="preserve">Psychological Methods, 13</w:t>
+      </w:r>
+      <w:r>
+        <w:rPr>
+          <w:rFonts w:ascii="Times New Roman" w:cs="Times New Roman" w:eastAsia="Times New Roman" w:hAnsi="Times New Roman"/>
+          <w:sz w:val="24"/>
+          <w:szCs w:val="24"/>
+        </w:rPr>
+        <w:t xml:space="preserve">(4), 354–375.</w:t>
       </w:r>
       <w:r>
         <w:rPr>
@@ -5424,7 +5315,7 @@
           <w:szCs w:val="24"/>
           <w:u w:val="single"/>
         </w:rPr>
-        <w:t xml:space="preserve"> https://doi.org/10.1037/a0038822</w:t>
+        <w:t xml:space="preserve"> https://doi.org/10.1037/a0014173</w:t>
       </w:r>
     </w:p>
     <w:p>
@@ -5438,7 +5329,21 @@
           <w:sz w:val="24"/>
           <w:szCs w:val="24"/>
         </w:rPr>
-        <w:t xml:space="preserve">Jahng, S., Wood, P. K., &amp; Trull, T. J. (2008). Analysis of affective instability in ecological momentary assessment: Indices using successive difference and group comparison via multilevel modeling. </w:t>
+        <w:t xml:space="preserve">Knapen, S. E., Snippe, E., Smit, A. C., Schoevers, R. A., &amp; Riemersma-van der Lek, R. F. (2025). Sleep disturbances in the prodromal phase of mood episodes in patients with bipolar disorder: A replicated single-case design. Journal for Person-Oriented Research, 11(3), 142-168. https://doi.org/10.17505/jpor.2025.28202</w:t>
+      </w:r>
+    </w:p>
+    <w:p>
+      <w:pPr>
+        <w:spacing w:after="120" w:before="0" w:line="480"/>
+        <w:ind w:left="720" w:hanging="720"/>
+      </w:pPr>
+      <w:r>
+        <w:rPr>
+          <w:rFonts w:ascii="Times New Roman" w:cs="Times New Roman" w:eastAsia="Times New Roman" w:hAnsi="Times New Roman"/>
+          <w:sz w:val="24"/>
+          <w:szCs w:val="24"/>
+        </w:rPr>
+        <w:t xml:space="preserve">Koval, P., &amp; Kuppens, P. (2012). Changing emotion dynamics: Individual differences in the effect of anticipatory social stress on emotional inertia. </w:t>
       </w:r>
       <w:r>
         <w:rPr>
@@ -5448,15 +5353,15 @@
           <w:sz w:val="24"/>
           <w:szCs w:val="24"/>
         </w:rPr>
-        <w:t xml:space="preserve">Psychological Methods, 13</w:t>
-      </w:r>
-      <w:r>
-        <w:rPr>
-          <w:rFonts w:ascii="Times New Roman" w:cs="Times New Roman" w:eastAsia="Times New Roman" w:hAnsi="Times New Roman"/>
-          <w:sz w:val="24"/>
-          <w:szCs w:val="24"/>
-        </w:rPr>
-        <w:t xml:space="preserve">(4), 354–375.</w:t>
+        <w:t xml:space="preserve">Emotion, 12</w:t>
+      </w:r>
+      <w:r>
+        <w:rPr>
+          <w:rFonts w:ascii="Times New Roman" w:cs="Times New Roman" w:eastAsia="Times New Roman" w:hAnsi="Times New Roman"/>
+          <w:sz w:val="24"/>
+          <w:szCs w:val="24"/>
+        </w:rPr>
+        <w:t xml:space="preserve">(2), 256–267.</w:t>
       </w:r>
       <w:r>
         <w:rPr>
@@ -5466,7 +5371,7 @@
           <w:szCs w:val="24"/>
           <w:u w:val="single"/>
         </w:rPr>
-        <w:t xml:space="preserve"> https://doi.org/10.1037/a0014173</w:t>
+        <w:t xml:space="preserve"> https://doi.org/10.1037/a0024756</w:t>
       </w:r>
     </w:p>
     <w:p>
@@ -5480,21 +5385,7 @@
           <w:sz w:val="24"/>
           <w:szCs w:val="24"/>
         </w:rPr>
-        <w:t xml:space="preserve">Knapen, S. E., Snippe, E., Smit, A. C., Schoevers, R. A., &amp; Riemersma-van der Lek, R. F. (2025). Sleep disturbances in the prodromal phase of mood episodes in patients with bipolar disorder: A replicated single-case design. Journal for Person-Oriented Research, 11(3), 142-168. https://doi.org/10.17505/jpor.2025.28202</w:t>
-      </w:r>
-    </w:p>
-    <w:p>
-      <w:pPr>
-        <w:spacing w:after="120" w:before="0" w:line="480"/>
-        <w:ind w:left="720" w:hanging="720"/>
-      </w:pPr>
-      <w:r>
-        <w:rPr>
-          <w:rFonts w:ascii="Times New Roman" w:cs="Times New Roman" w:eastAsia="Times New Roman" w:hAnsi="Times New Roman"/>
-          <w:sz w:val="24"/>
-          <w:szCs w:val="24"/>
-        </w:rPr>
-        <w:t xml:space="preserve">Koval, P., &amp; Kuppens, P. (2012). Changing emotion dynamics: Individual differences in the effect of anticipatory social stress on emotional inertia. </w:t>
+        <w:t xml:space="preserve">Kuppens, P., Allen, N. B., &amp; Sheeber, L. B. (2010). Emotional inertia and psychological maladjustment. </w:t>
       </w:r>
       <w:r>
         <w:rPr>
@@ -5504,15 +5395,15 @@
           <w:sz w:val="24"/>
           <w:szCs w:val="24"/>
         </w:rPr>
-        <w:t xml:space="preserve">Emotion, 12</w:t>
-      </w:r>
-      <w:r>
-        <w:rPr>
-          <w:rFonts w:ascii="Times New Roman" w:cs="Times New Roman" w:eastAsia="Times New Roman" w:hAnsi="Times New Roman"/>
-          <w:sz w:val="24"/>
-          <w:szCs w:val="24"/>
-        </w:rPr>
-        <w:t xml:space="preserve">(2), 256–267.</w:t>
+        <w:t xml:space="preserve">Psychological Science, 21</w:t>
+      </w:r>
+      <w:r>
+        <w:rPr>
+          <w:rFonts w:ascii="Times New Roman" w:cs="Times New Roman" w:eastAsia="Times New Roman" w:hAnsi="Times New Roman"/>
+          <w:sz w:val="24"/>
+          <w:szCs w:val="24"/>
+        </w:rPr>
+        <w:t xml:space="preserve">(7), 984–991.</w:t>
       </w:r>
       <w:r>
         <w:rPr>
@@ -5522,21 +5413,21 @@
           <w:szCs w:val="24"/>
           <w:u w:val="single"/>
         </w:rPr>
-        <w:t xml:space="preserve"> https://doi.org/10.1037/a0024756</w:t>
-      </w:r>
-    </w:p>
-    <w:p>
-      <w:pPr>
-        <w:spacing w:after="120" w:before="0" w:line="480"/>
-        <w:ind w:left="720" w:hanging="720"/>
-      </w:pPr>
-      <w:r>
-        <w:rPr>
-          <w:rFonts w:ascii="Times New Roman" w:cs="Times New Roman" w:eastAsia="Times New Roman" w:hAnsi="Times New Roman"/>
-          <w:sz w:val="24"/>
-          <w:szCs w:val="24"/>
-        </w:rPr>
-        <w:t xml:space="preserve">Kuppens, P., Allen, N. B., &amp; Sheeber, L. B. (2010). Emotional inertia and psychological maladjustment. </w:t>
+        <w:t xml:space="preserve"> https://doi.org/10.1177/0956797610372634</w:t>
+      </w:r>
+    </w:p>
+    <w:p>
+      <w:pPr>
+        <w:spacing w:after="120" w:before="0" w:line="480"/>
+        <w:jc w:val="both"/>
+      </w:pPr>
+      <w:r>
+        <w:rPr>
+          <w:rFonts w:ascii="Times New Roman" w:cs="Times New Roman" w:eastAsia="Times New Roman" w:hAnsi="Times New Roman"/>
+          <w:sz w:val="24"/>
+          <w:szCs w:val="24"/>
+        </w:rPr>
+        <w:t xml:space="preserve">Kuznetsova, A., Brockhoff, P. B., &amp; Christensen, R. H. B. (2017). lmerTest package: Tests in linear mixed effects models. </w:t>
       </w:r>
       <w:r>
         <w:rPr>
@@ -5546,39 +5437,29 @@
           <w:sz w:val="24"/>
           <w:szCs w:val="24"/>
         </w:rPr>
-        <w:t xml:space="preserve">Psychological Science, 21</w:t>
-      </w:r>
-      <w:r>
-        <w:rPr>
-          <w:rFonts w:ascii="Times New Roman" w:cs="Times New Roman" w:eastAsia="Times New Roman" w:hAnsi="Times New Roman"/>
-          <w:sz w:val="24"/>
-          <w:szCs w:val="24"/>
-        </w:rPr>
-        <w:t xml:space="preserve">(7), 984–991.</w:t>
-      </w:r>
-      <w:r>
-        <w:rPr>
-          <w:rFonts w:ascii="Times New Roman" w:cs="Times New Roman" w:eastAsia="Times New Roman" w:hAnsi="Times New Roman"/>
-          <w:color w:val="1A56DB"/>
-          <w:sz w:val="24"/>
-          <w:szCs w:val="24"/>
-          <w:u w:val="single"/>
-        </w:rPr>
-        <w:t xml:space="preserve"> https://doi.org/10.1177/0956797610372634</w:t>
-      </w:r>
-    </w:p>
-    <w:p>
-      <w:pPr>
-        <w:spacing w:after="120" w:before="0" w:line="480"/>
-        <w:jc w:val="both"/>
-      </w:pPr>
-      <w:r>
-        <w:rPr>
-          <w:rFonts w:ascii="Times New Roman" w:cs="Times New Roman" w:eastAsia="Times New Roman" w:hAnsi="Times New Roman"/>
-          <w:sz w:val="24"/>
-          <w:szCs w:val="24"/>
-        </w:rPr>
-        <w:t xml:space="preserve">Kuznetsova, A., Brockhoff, P. B., &amp; Christensen, R. H. B. (2017). lmerTest package: Tests in linear mixed effects models. </w:t>
+        <w:t xml:space="preserve">Journal of Statistical Software, 82</w:t>
+      </w:r>
+      <w:r>
+        <w:rPr>
+          <w:rFonts w:ascii="Times New Roman" w:cs="Times New Roman" w:eastAsia="Times New Roman" w:hAnsi="Times New Roman"/>
+          <w:sz w:val="24"/>
+          <w:szCs w:val="24"/>
+        </w:rPr>
+        <w:t xml:space="preserve">(13), 1–26. https://doi.org/10.18637/jss.v082.i13</w:t>
+      </w:r>
+    </w:p>
+    <w:p>
+      <w:pPr>
+        <w:spacing w:after="120" w:before="0" w:line="480"/>
+        <w:ind w:left="720" w:hanging="720"/>
+      </w:pPr>
+      <w:r>
+        <w:rPr>
+          <w:rFonts w:ascii="Times New Roman" w:cs="Times New Roman" w:eastAsia="Times New Roman" w:hAnsi="Times New Roman"/>
+          <w:sz w:val="24"/>
+          <w:szCs w:val="24"/>
+        </w:rPr>
+        <w:t xml:space="preserve">Lakens, D. (2017). Equivalence tests: A practical primer for </w:t>
       </w:r>
       <w:r>
         <w:rPr>
@@ -5588,29 +5469,15 @@
           <w:sz w:val="24"/>
           <w:szCs w:val="24"/>
         </w:rPr>
-        <w:t xml:space="preserve">Journal of Statistical Software, 82</w:t>
-      </w:r>
-      <w:r>
-        <w:rPr>
-          <w:rFonts w:ascii="Times New Roman" w:cs="Times New Roman" w:eastAsia="Times New Roman" w:hAnsi="Times New Roman"/>
-          <w:sz w:val="24"/>
-          <w:szCs w:val="24"/>
-        </w:rPr>
-        <w:t xml:space="preserve">(13), 1–26. https://doi.org/10.18637/jss.v082.i13</w:t>
-      </w:r>
-    </w:p>
-    <w:p>
-      <w:pPr>
-        <w:spacing w:after="120" w:before="0" w:line="480"/>
-        <w:ind w:left="720" w:hanging="720"/>
-      </w:pPr>
-      <w:r>
-        <w:rPr>
-          <w:rFonts w:ascii="Times New Roman" w:cs="Times New Roman" w:eastAsia="Times New Roman" w:hAnsi="Times New Roman"/>
-          <w:sz w:val="24"/>
-          <w:szCs w:val="24"/>
-        </w:rPr>
-        <w:t xml:space="preserve">Lakens, D. (2017). Equivalence tests: A practical primer for </w:t>
+        <w:t xml:space="preserve">t</w:t>
+      </w:r>
+      <w:r>
+        <w:rPr>
+          <w:rFonts w:ascii="Times New Roman" w:cs="Times New Roman" w:eastAsia="Times New Roman" w:hAnsi="Times New Roman"/>
+          <w:sz w:val="24"/>
+          <w:szCs w:val="24"/>
+        </w:rPr>
+        <w:t xml:space="preserve"> tests, correlations, and meta-analyses. </w:t>
       </w:r>
       <w:r>
         <w:rPr>
@@ -5620,15 +5487,40 @@
           <w:sz w:val="24"/>
           <w:szCs w:val="24"/>
         </w:rPr>
-        <w:t xml:space="preserve">t</w:t>
-      </w:r>
-      <w:r>
-        <w:rPr>
-          <w:rFonts w:ascii="Times New Roman" w:cs="Times New Roman" w:eastAsia="Times New Roman" w:hAnsi="Times New Roman"/>
-          <w:sz w:val="24"/>
-          <w:szCs w:val="24"/>
-        </w:rPr>
-        <w:t xml:space="preserve"> tests, correlations, and meta-analyses. </w:t>
+        <w:t xml:space="preserve">Social Psychological and Personality Science, 8</w:t>
+      </w:r>
+      <w:r>
+        <w:rPr>
+          <w:rFonts w:ascii="Times New Roman" w:cs="Times New Roman" w:eastAsia="Times New Roman" w:hAnsi="Times New Roman"/>
+          <w:sz w:val="24"/>
+          <w:szCs w:val="24"/>
+        </w:rPr>
+        <w:t xml:space="preserve">(4), 355–362.</w:t>
+      </w:r>
+      <w:r>
+        <w:rPr>
+          <w:rFonts w:ascii="Times New Roman" w:cs="Times New Roman" w:eastAsia="Times New Roman" w:hAnsi="Times New Roman"/>
+          <w:color w:val="1A56DB"/>
+          <w:sz w:val="24"/>
+          <w:szCs w:val="24"/>
+          <w:u w:val="single"/>
+        </w:rPr>
+        <w:t xml:space="preserve"> https://doi.org/10.1177/1948550617697177</w:t>
+      </w:r>
+    </w:p>
+    <w:p>
+      <w:pPr>
+        <w:spacing w:after="120" w:before="0" w:line="480"/>
+        <w:ind w:left="720" w:hanging="720"/>
+      </w:pPr>
+      <w:r>
+        <w:rPr>
+          <w:rFonts w:ascii="Times New Roman" w:cs="Times New Roman" w:eastAsia="Times New Roman" w:hAnsi="Times New Roman"/>
+          <w:i w:val="0"/>
+          <w:sz w:val="24"/>
+          <w:szCs w:val="24"/>
+        </w:rPr>
+        <w:t xml:space="preserve">Meng, M. (2026). </w:t>
       </w:r>
       <w:r>
         <w:rPr>
@@ -5638,39 +5530,13 @@
           <w:sz w:val="24"/>
           <w:szCs w:val="24"/>
         </w:rPr>
-        <w:t xml:space="preserve">Social Psychological and Personality Science, 8</w:t>
-      </w:r>
-      <w:r>
-        <w:rPr>
-          <w:rFonts w:ascii="Times New Roman" w:cs="Times New Roman" w:eastAsia="Times New Roman" w:hAnsi="Times New Roman"/>
-          <w:sz w:val="24"/>
-          <w:szCs w:val="24"/>
-        </w:rPr>
-        <w:t xml:space="preserve">(4), 355–362.</w:t>
-      </w:r>
-      <w:r>
-        <w:rPr>
-          <w:rFonts w:ascii="Times New Roman" w:cs="Times New Roman" w:eastAsia="Times New Roman" w:hAnsi="Times New Roman"/>
-          <w:color w:val="1A56DB"/>
-          <w:sz w:val="24"/>
-          <w:szCs w:val="24"/>
-          <w:u w:val="single"/>
-        </w:rPr>
-        <w:t xml:space="preserve"> https://doi.org/10.1177/1948550617697177</w:t>
-      </w:r>
-    </w:p>
-    <w:p>
-      <w:pPr>
-        <w:spacing w:after="120" w:before="0" w:line="480"/>
-        <w:ind w:left="720" w:hanging="720"/>
-      </w:pPr>
-      <w:r>
-        <w:rPr>
-          <w:rFonts w:ascii="Times New Roman" w:cs="Times New Roman" w:eastAsia="Times New Roman" w:hAnsi="Times New Roman"/>
-          <w:sz w:val="24"/>
-          <w:szCs w:val="24"/>
-        </w:rPr>
-        <w:t xml:space="preserve">Metcalfe, J., &amp; Greene, M. J. (2007). Metacognition of agency. </w:t>
+      </w:r>
+      <w:r>
+        <w:rPr>
+          <w:rFonts w:ascii="Times New Roman" w:cs="Times New Roman" w:eastAsia="Times New Roman" w:hAnsi="Times New Roman"/>
+          <w:sz w:val="24"/>
+          <w:szCs w:val="24"/>
+        </w:rPr>
       </w:r>
       <w:r>
         <w:rPr>
@@ -5680,15 +5546,13 @@
           <w:sz w:val="24"/>
           <w:szCs w:val="24"/>
         </w:rPr>
-        <w:t xml:space="preserve">Journal of Experimental Psychology: General, 136</w:t>
-      </w:r>
-      <w:r>
-        <w:rPr>
-          <w:rFonts w:ascii="Times New Roman" w:cs="Times New Roman" w:eastAsia="Times New Roman" w:hAnsi="Times New Roman"/>
-          <w:sz w:val="24"/>
-          <w:szCs w:val="24"/>
-        </w:rPr>
-        <w:t xml:space="preserve">(2), 184–199.</w:t>
+      </w:r>
+      <w:r>
+        <w:rPr>
+          <w:rFonts w:ascii="Times New Roman" w:cs="Times New Roman" w:eastAsia="Times New Roman" w:hAnsi="Times New Roman"/>
+          <w:sz w:val="24"/>
+          <w:szCs w:val="24"/>
+        </w:rPr>
       </w:r>
       <w:r>
         <w:rPr>
@@ -5698,7 +5562,18 @@
           <w:szCs w:val="24"/>
           <w:u w:val="single"/>
         </w:rPr>
-        <w:t xml:space="preserve"> https://doi.org/10.1037/0096-3445.136.2.184</w:t>
+      </w:r>
+      <w:r>
+        <w:rPr>
+          <w:i/>
+        </w:rPr>
+        <w:t>nof1kit: Design, monitor, and analyze single-case (N-of-1) intensive longitudinal studies</w:t>
+      </w:r>
+      <w:r>
+        <w:rPr>
+          <w:i w:val="0"/>
+        </w:rPr>
+        <w:t xml:space="preserve"> (Version 0.1.0) [Computer software]. Comprehensive R Archive Network. https://doi.org/10.32614/CRAN.package.nof1kit</w:t>
       </w:r>
     </w:p>
     <w:p>
@@ -5712,7 +5587,7 @@
           <w:sz w:val="24"/>
           <w:szCs w:val="24"/>
         </w:rPr>
-        <w:t xml:space="preserve">Molenaar, P. C. M. (2004). A manifesto on psychology as idiographic science: Bringing the person back into scientific psychology, this time forever. </w:t>
+        <w:t xml:space="preserve">Metcalfe, J., &amp; Greene, M. J. (2007). Metacognition of agency. </w:t>
       </w:r>
       <w:r>
         <w:rPr>
@@ -5722,15 +5597,15 @@
           <w:sz w:val="24"/>
           <w:szCs w:val="24"/>
         </w:rPr>
-        <w:t xml:space="preserve">Measurement: Interdisciplinary Research and Perspectives, 2</w:t>
-      </w:r>
-      <w:r>
-        <w:rPr>
-          <w:rFonts w:ascii="Times New Roman" w:cs="Times New Roman" w:eastAsia="Times New Roman" w:hAnsi="Times New Roman"/>
-          <w:sz w:val="24"/>
-          <w:szCs w:val="24"/>
-        </w:rPr>
-        <w:t xml:space="preserve">(4), 201–218.</w:t>
+        <w:t xml:space="preserve">Journal of Experimental Psychology: General, 136</w:t>
+      </w:r>
+      <w:r>
+        <w:rPr>
+          <w:rFonts w:ascii="Times New Roman" w:cs="Times New Roman" w:eastAsia="Times New Roman" w:hAnsi="Times New Roman"/>
+          <w:sz w:val="24"/>
+          <w:szCs w:val="24"/>
+        </w:rPr>
+        <w:t xml:space="preserve">(2), 184–199.</w:t>
       </w:r>
       <w:r>
         <w:rPr>
@@ -5740,7 +5615,7 @@
           <w:szCs w:val="24"/>
           <w:u w:val="single"/>
         </w:rPr>
-        <w:t xml:space="preserve"> https://doi.org/10.1207/s15366359mea0204_1</w:t>
+        <w:t xml:space="preserve"> https://doi.org/10.1037/0096-3445.136.2.184</w:t>
       </w:r>
     </w:p>
     <w:p>
@@ -5754,7 +5629,7 @@
           <w:sz w:val="24"/>
           <w:szCs w:val="24"/>
         </w:rPr>
-        <w:t xml:space="preserve">Molenaar, P. C. M., &amp; Campbell, C. G. (2009). The new person-specific paradigm in psychology. </w:t>
+        <w:t xml:space="preserve">Molenaar, P. C. M. (2004). A manifesto on psychology as idiographic science: Bringing the person back into scientific psychology, this time forever. </w:t>
       </w:r>
       <w:r>
         <w:rPr>
@@ -5764,15 +5639,15 @@
           <w:sz w:val="24"/>
           <w:szCs w:val="24"/>
         </w:rPr>
-        <w:t xml:space="preserve">Current Directions in Psychological Science, 18</w:t>
-      </w:r>
-      <w:r>
-        <w:rPr>
-          <w:rFonts w:ascii="Times New Roman" w:cs="Times New Roman" w:eastAsia="Times New Roman" w:hAnsi="Times New Roman"/>
-          <w:sz w:val="24"/>
-          <w:szCs w:val="24"/>
-        </w:rPr>
-        <w:t xml:space="preserve">(2), 112–117.</w:t>
+        <w:t xml:space="preserve">Measurement: Interdisciplinary Research and Perspectives, 2</w:t>
+      </w:r>
+      <w:r>
+        <w:rPr>
+          <w:rFonts w:ascii="Times New Roman" w:cs="Times New Roman" w:eastAsia="Times New Roman" w:hAnsi="Times New Roman"/>
+          <w:sz w:val="24"/>
+          <w:szCs w:val="24"/>
+        </w:rPr>
+        <w:t xml:space="preserve">(4), 201–218.</w:t>
       </w:r>
       <w:r>
         <w:rPr>
@@ -5782,7 +5657,7 @@
           <w:szCs w:val="24"/>
           <w:u w:val="single"/>
         </w:rPr>
-        <w:t xml:space="preserve"> https://doi.org/10.1111/j.1467-8721.2009.01619.x</w:t>
+        <w:t xml:space="preserve"> https://doi.org/10.1207/s15366359mea0204_1</w:t>
       </w:r>
     </w:p>
     <w:p>
@@ -5796,7 +5671,7 @@
           <w:sz w:val="24"/>
           <w:szCs w:val="24"/>
         </w:rPr>
-        <w:t xml:space="preserve">Myin-Germeys, I., &amp; Kuppens, P. (Eds.). (2022). </w:t>
+        <w:t xml:space="preserve">Molenaar, P. C. M., &amp; Campbell, C. G. (2009). The new person-specific paradigm in psychology. </w:t>
       </w:r>
       <w:r>
         <w:rPr>
@@ -5806,15 +5681,25 @@
           <w:sz w:val="24"/>
           <w:szCs w:val="24"/>
         </w:rPr>
-        <w:t xml:space="preserve">The open handbook of experience sampling methodology</w:t>
-      </w:r>
-      <w:r>
-        <w:rPr>
-          <w:rFonts w:ascii="Times New Roman" w:cs="Times New Roman" w:eastAsia="Times New Roman" w:hAnsi="Times New Roman"/>
-          <w:sz w:val="24"/>
-          <w:szCs w:val="24"/>
-        </w:rPr>
-        <w:t xml:space="preserve"> (2nd ed.). Center for Research on Experience Sampling and Ambulatory Methods Leuven.</w:t>
+        <w:t xml:space="preserve">Current Directions in Psychological Science, 18</w:t>
+      </w:r>
+      <w:r>
+        <w:rPr>
+          <w:rFonts w:ascii="Times New Roman" w:cs="Times New Roman" w:eastAsia="Times New Roman" w:hAnsi="Times New Roman"/>
+          <w:sz w:val="24"/>
+          <w:szCs w:val="24"/>
+        </w:rPr>
+        <w:t xml:space="preserve">(2), 112–117.</w:t>
+      </w:r>
+      <w:r>
+        <w:rPr>
+          <w:rFonts w:ascii="Times New Roman" w:cs="Times New Roman" w:eastAsia="Times New Roman" w:hAnsi="Times New Roman"/>
+          <w:color w:val="1A56DB"/>
+          <w:sz w:val="24"/>
+          <w:szCs w:val="24"/>
+          <w:u w:val="single"/>
+        </w:rPr>
+        <w:t xml:space="preserve"> https://doi.org/10.1111/j.1467-8721.2009.01619.x</w:t>
       </w:r>
     </w:p>
     <w:p>
@@ -5828,7 +5713,7 @@
           <w:sz w:val="24"/>
           <w:szCs w:val="24"/>
         </w:rPr>
-        <w:t xml:space="preserve">Nelson, T. O., &amp; Narens, L. (1990). Metamemory: A theoretical framework and new findings. In G. H. Bower (Ed.), </w:t>
+        <w:t xml:space="preserve">Myin-Germeys, I., &amp; Kuppens, P. (Eds.). (2022). </w:t>
       </w:r>
       <w:r>
         <w:rPr>
@@ -5838,15 +5723,15 @@
           <w:sz w:val="24"/>
           <w:szCs w:val="24"/>
         </w:rPr>
-        <w:t xml:space="preserve">The psychology of learning and motivation</w:t>
-      </w:r>
-      <w:r>
-        <w:rPr>
-          <w:rFonts w:ascii="Times New Roman" w:cs="Times New Roman" w:eastAsia="Times New Roman" w:hAnsi="Times New Roman"/>
-          <w:sz w:val="24"/>
-          <w:szCs w:val="24"/>
-        </w:rPr>
-        <w:t xml:space="preserve"> (Vol. 26, pp. 125–173). Academic Press.</w:t>
+        <w:t xml:space="preserve">The open handbook of experience sampling methodology</w:t>
+      </w:r>
+      <w:r>
+        <w:rPr>
+          <w:rFonts w:ascii="Times New Roman" w:cs="Times New Roman" w:eastAsia="Times New Roman" w:hAnsi="Times New Roman"/>
+          <w:sz w:val="24"/>
+          <w:szCs w:val="24"/>
+        </w:rPr>
+        <w:t xml:space="preserve"> (2nd ed.). Center for Research on Experience Sampling and Ambulatory Methods Leuven.</w:t>
       </w:r>
     </w:p>
     <w:p>
@@ -5860,7 +5745,7 @@
           <w:sz w:val="24"/>
           <w:szCs w:val="24"/>
         </w:rPr>
-        <w:t xml:space="preserve">Seabold, S., &amp; Perktold, J. (2010). statsmodels: Econometric and statistical modeling with Python. In </w:t>
+        <w:t xml:space="preserve">Nelson, T. O., &amp; Narens, L. (1990). Metamemory: A theoretical framework and new findings. In G. H. Bower (Ed.), </w:t>
       </w:r>
       <w:r>
         <w:rPr>
@@ -5870,6 +5755,41 @@
           <w:sz w:val="24"/>
           <w:szCs w:val="24"/>
         </w:rPr>
+        <w:t xml:space="preserve">The psychology of learning and motivation</w:t>
+      </w:r>
+      <w:r>
+        <w:rPr>
+          <w:rFonts w:ascii="Times New Roman" w:cs="Times New Roman" w:eastAsia="Times New Roman" w:hAnsi="Times New Roman"/>
+          <w:sz w:val="24"/>
+          <w:szCs w:val="24"/>
+        </w:rPr>
+        <w:t xml:space="preserve"> (Vol. 26, pp. 125–173). Academic Press.</w:t>
+      </w:r>
+      <w:r>
+        <w:t xml:space="preserve"> https://doi.org/10.1016/S0079-7421(08)60053-5</w:t>
+      </w:r>
+    </w:p>
+    <w:p>
+      <w:pPr>
+        <w:spacing w:after="120" w:before="0" w:line="480"/>
+        <w:ind w:left="720" w:hanging="720"/>
+      </w:pPr>
+      <w:r>
+        <w:rPr>
+          <w:rFonts w:ascii="Times New Roman" w:cs="Times New Roman" w:eastAsia="Times New Roman" w:hAnsi="Times New Roman"/>
+          <w:sz w:val="24"/>
+          <w:szCs w:val="24"/>
+        </w:rPr>
+        <w:t xml:space="preserve">Seabold, S., &amp; Perktold, J. (2010). statsmodels: Econometric and statistical modeling with Python. In </w:t>
+      </w:r>
+      <w:r>
+        <w:rPr>
+          <w:rFonts w:ascii="Times New Roman" w:cs="Times New Roman" w:eastAsia="Times New Roman" w:hAnsi="Times New Roman"/>
+          <w:i/>
+          <w:iCs/>
+          <w:sz w:val="24"/>
+          <w:szCs w:val="24"/>
+        </w:rPr>
         <w:t xml:space="preserve">Proceedings of the 9th Python in Science Conference</w:t>
       </w:r>
       <w:r>
@@ -5879,6 +5799,9 @@
           <w:szCs w:val="24"/>
         </w:rPr>
         <w:t xml:space="preserve"> (pp. 92–96).</w:t>
+      </w:r>
+      <w:r>
+        <w:t xml:space="preserve"> https://doi.org/10.25080/Majora-92bf1922-011</w:t>
       </w:r>
     </w:p>
     <w:p>
@@ -5950,63 +5873,7 @@
           <w:sz w:val="24"/>
           <w:szCs w:val="24"/>
         </w:rPr>
-        <w:t xml:space="preserve">This appendix reports the analyses that characterize the dynamic structure of the daily mood series: emotional inertia at two sampling resolutions, the implied impulse response and half-life, and a local-level state-space decomposition. All use the same data as the primary models.</w:t>
-      </w:r>
-    </w:p>
-    <w:p>
-      <w:pPr>
-        <w:spacing w:after="120" w:before="0" w:line="480"/>
-        <w:jc w:val="both"/>
-      </w:pPr>
-      <w:r>
-        <w:rPr>
-          <w:rFonts w:ascii="Times New Roman" w:cs="Times New Roman" w:eastAsia="Times New Roman" w:hAnsi="Times New Roman"/>
-          <w:sz w:val="24"/>
-          <w:szCs w:val="24"/>
-        </w:rPr>
-        <w:t xml:space="preserve">Method</w:t>
-      </w:r>
-    </w:p>
-    <w:p>
-      <w:pPr>
-        <w:spacing w:after="120" w:before="0" w:line="480"/>
-        <w:jc w:val="both"/>
-      </w:pPr>
-      <w:r>
-        <w:rPr>
-          <w:rFonts w:ascii="Times New Roman" w:cs="Times New Roman" w:eastAsia="Times New Roman" w:hAnsi="Times New Roman"/>
-          <w:sz w:val="24"/>
-          <w:szCs w:val="24"/>
-        </w:rPr>
-        <w:t xml:space="preserve">A local-level (random-walk-plus-noise) state-space model was fit to the daily mood series by maximum-likelihood Kalman filtering, with observation equation yₜ = xₜ + vₜ, vₜ ~ N(0, σ²_v), and state equation xₜ = xₜ₋₁ + wₜ, wₜ ~ N(0, σ²_w). The model decomposes observed daily mood into an unobserved latent trajectory and observation noise, yielding a smoothed estimate of the underlying affective state with a 95% confidence band. The signal-to-noise ratio σ²_w / σ²_v summarizes how much of the observed daily variation is attributable to latent change rather than to measurement and sampling noise.</w:t>
-      </w:r>
-    </w:p>
-    <w:p>
-      <w:pPr>
-        <w:spacing w:after="120" w:before="0" w:line="480"/>
-        <w:jc w:val="both"/>
-      </w:pPr>
-      <w:r>
-        <w:rPr>
-          <w:rFonts w:ascii="Times New Roman" w:cs="Times New Roman" w:eastAsia="Times New Roman" w:hAnsi="Times New Roman"/>
-          <w:sz w:val="24"/>
-          <w:szCs w:val="24"/>
-        </w:rPr>
-        <w:t xml:space="preserve">The impulse response function for an AR(1) process is IRF(h) = φʰ, and the half-life of an affective perturbation follows as log(0.5) / log(φ). The IRF was computed at both the daily and the observation level. The daily-level estimate used the AR(1) coefficient fit on the full 70-day sample, which is more stable than the Day 18–70 nested-model coefficient reported as M0. The observation-level estimate was fit on all 195 EMA pings ordered by timestamp, and its half-life was converted to physical time using the median between-prompt interval.</w:t>
-      </w:r>
-    </w:p>
-    <w:p>
-      <w:pPr>
-        <w:spacing w:after="120" w:before="0" w:line="480"/>
-        <w:jc w:val="both"/>
-      </w:pPr>
-      <w:r>
-        <w:rPr>
-          <w:rFonts w:ascii="Times New Roman" w:cs="Times New Roman" w:eastAsia="Times New Roman" w:hAnsi="Times New Roman"/>
-          <w:sz w:val="24"/>
-          <w:szCs w:val="24"/>
-        </w:rPr>
-        <w:t xml:space="preserve">Results</w:t>
+        <w:t>This appendix reports the analyses that characterize the dynamic structure of the daily mood series: emotional inertia at two sampling resolutions, the implied impulse response and half-life, and a local-level state-space decomposition. The methods are given in Sections 2.5.2 and 2.5.3, and all analyses use the same data as the primary models.</w:t>
       </w:r>
     </w:p>
     <w:p>
@@ -6084,17 +5951,7 @@
           <w:sz w:val="22"/>
           <w:szCs w:val="22"/>
         </w:rPr>
-        <w:t xml:space="preserve">Figure A1. </w:t>
-      </w:r>
-      <w:r>
-        <w:rPr>
-          <w:rFonts w:ascii="Times New Roman" w:cs="Times New Roman" w:eastAsia="Times New Roman" w:hAnsi="Times New Roman"/>
-          <w:i/>
-          <w:iCs/>
-          <w:sz w:val="22"/>
-          <w:szCs w:val="22"/>
-        </w:rPr>
-        <w:t xml:space="preserve">Lag-1 autocorrelation of daily mood across the 70-day sample.</w:t>
+        <w:t>Figure A.1. Lag-1 autocorrelation of daily mood across the 70-day sample.</w:t>
       </w:r>
     </w:p>
     <w:p>
@@ -6179,17 +6036,7 @@
           <w:sz w:val="22"/>
           <w:szCs w:val="22"/>
         </w:rPr>
-        <w:t xml:space="preserve">Figure A2. </w:t>
-      </w:r>
-      <w:r>
-        <w:rPr>
-          <w:rFonts w:ascii="Times New Roman" w:cs="Times New Roman" w:eastAsia="Times New Roman" w:hAnsi="Times New Roman"/>
-          <w:i/>
-          <w:iCs/>
-          <w:sz w:val="22"/>
-          <w:szCs w:val="22"/>
-        </w:rPr>
-        <w:t xml:space="preserve">Impulse response and half-life of an affective perturbation.</w:t>
+        <w:t>Figure A.2. Impulse response and half-life of an affective perturbation.</w:t>
       </w:r>
     </w:p>
     <w:p>
@@ -6288,17 +6135,7 @@
           <w:sz w:val="22"/>
           <w:szCs w:val="22"/>
         </w:rPr>
-        <w:t xml:space="preserve">Figure A3. </w:t>
-      </w:r>
-      <w:r>
-        <w:rPr>
-          <w:rFonts w:ascii="Times New Roman" w:cs="Times New Roman" w:eastAsia="Times New Roman" w:hAnsi="Times New Roman"/>
-          <w:i/>
-          <w:iCs/>
-          <w:sz w:val="22"/>
-          <w:szCs w:val="22"/>
-        </w:rPr>
-        <w:t xml:space="preserve">Kalman-smoothed latent affective state across the 70-day window.</w:t>
+        <w:t>Figure A.3. Kalman-smoothed latent affective state across the 70-day window.</w:t>
       </w:r>
     </w:p>
     <w:p>
@@ -6338,93 +6175,35 @@
           <w:sz w:val="28"/>
           <w:szCs w:val="28"/>
         </w:rPr>
-        <w:t xml:space="preserve">Appendix B. Robustness Re-estimation</w:t>
-      </w:r>
-    </w:p>
-    <w:p>
-      <w:pPr>
-        <w:spacing w:after="120" w:before="0" w:line="480"/>
-        <w:jc w:val="both"/>
-      </w:pPr>
-      <w:r>
-        <w:rPr>
-          <w:rFonts w:ascii="Times New Roman" w:cs="Times New Roman" w:eastAsia="Times New Roman" w:hAnsi="Times New Roman"/>
-          <w:sz w:val="24"/>
-          <w:szCs w:val="24"/>
-        </w:rPr>
-        <w:t xml:space="preserve">This appendix reports the two alternative estimation frameworks summarized in Section 3.4: a Bayesian re-estimation of M2 and a multilevel model fit to the momentary observations without daily aggregation.</w:t>
-      </w:r>
-    </w:p>
-    <w:p>
-      <w:pPr>
-        <w:pStyle w:val="Heading2"/>
-        <w:spacing w:after="120" w:before="240" w:line="480"/>
-      </w:pPr>
-      <w:r>
-        <w:rPr>
-          <w:rFonts w:ascii="Times New Roman" w:cs="Times New Roman" w:eastAsia="Times New Roman" w:hAnsi="Times New Roman"/>
-          <w:b/>
-          <w:bCs/>
-          <w:sz w:val="26"/>
-          <w:szCs w:val="26"/>
-        </w:rPr>
-        <w:t xml:space="preserve">B.1 Bayesian re-estimation</w:t>
-      </w:r>
-    </w:p>
-    <w:p>
-      <w:pPr>
-        <w:spacing w:after="120" w:before="0" w:line="480"/>
-        <w:jc w:val="both"/>
-      </w:pPr>
-      <w:r>
-        <w:rPr>
-          <w:rFonts w:ascii="Times New Roman" w:cs="Times New Roman" w:eastAsia="Times New Roman" w:hAnsi="Times New Roman"/>
-          <w:sz w:val="24"/>
-          <w:szCs w:val="24"/>
-        </w:rPr>
-        <w:t xml:space="preserve">Method</w:t>
-      </w:r>
-    </w:p>
-    <w:p>
-      <w:pPr>
-        <w:spacing w:after="120" w:before="0" w:line="480"/>
-        <w:jc w:val="both"/>
-      </w:pPr>
-      <w:r>
-        <w:rPr>
-          <w:rFonts w:ascii="Times New Roman" w:cs="Times New Roman" w:eastAsia="Times New Roman" w:hAnsi="Times New Roman"/>
-          <w:sz w:val="24"/>
-          <w:szCs w:val="24"/>
-        </w:rPr>
-        <w:t xml:space="preserve">The primary M2 regression was re-estimated in a Bayesian framework using brms (Bürkner, 2017) with Stan for MCMC sampling. Continuous variables were standardized before fitting and the melatonin indicator was retained on its 0/1 scale. Weakly informative priors were placed on the regression coefficients (Normal(0, 1)), the intercept (Student-t(3, 0, 2.5)), and the residual standard deviation (Exponential(1)). Four chains were run for 4,000 iterations each with 1,000 warmup iterations and adapt_delta = 0.95, yielding 12,000 post-warmup draws per parameter. A secondary model added a melatonin × metacognition interaction as a Bayesian counterpart of the metacontrol test reported in Appendix C.</w:t>
-      </w:r>
-    </w:p>
-    <w:p>
-      <w:pPr>
-        <w:spacing w:after="120" w:before="0" w:line="480"/>
-        <w:jc w:val="both"/>
-      </w:pPr>
-      <w:r>
-        <w:rPr>
-          <w:rFonts w:ascii="Times New Roman" w:cs="Times New Roman" w:eastAsia="Times New Roman" w:hAnsi="Times New Roman"/>
-          <w:sz w:val="24"/>
-          <w:szCs w:val="24"/>
-        </w:rPr>
-        <w:t xml:space="preserve">Results</w:t>
-      </w:r>
-    </w:p>
-    <w:p>
-      <w:pPr>
-        <w:spacing w:after="120" w:before="0" w:line="480"/>
-        <w:jc w:val="both"/>
-      </w:pPr>
-      <w:r>
-        <w:rPr>
-          <w:rFonts w:ascii="Times New Roman" w:cs="Times New Roman" w:eastAsia="Times New Roman" w:hAnsi="Times New Roman"/>
-          <w:sz w:val="24"/>
-          <w:szCs w:val="24"/>
-        </w:rPr>
-        <w:t xml:space="preserve">The posterior pattern reproduced the frequentist result under different inferential assumptions (Table B1). The agency and metacognition effects were clearly positive in standardized units, with both credible intervals above zero and posterior probabilities of exceeding zero of essentially 1. The melatonin coefficient was centered near zero with a credible interval spanning it. The lagged-mood coefficient was attenuated with a credible interval including zero, consistent with the frequentist M2. All R-hat values were ≤ 1.001 and effective sample sizes exceeded 8,000 for every parameter.</w:t>
+        <w:t>Appendix B. Multilevel Re-estimation</w:t>
+      </w:r>
+    </w:p>
+    <w:p>
+      <w:pPr>
+        <w:spacing w:after="120" w:before="0" w:line="480"/>
+        <w:jc w:val="both"/>
+      </w:pPr>
+      <w:r>
+        <w:rPr>
+          <w:rFonts w:ascii="Times New Roman" w:cs="Times New Roman" w:eastAsia="Times New Roman" w:hAnsi="Times New Roman"/>
+          <w:sz w:val="24"/>
+          <w:szCs w:val="24"/>
+        </w:rPr>
+        <w:t>This appendix reports the multilevel model summarized in Section 3.4, fit to the momentary observations without daily aggregation. The method is given in Section 2.5.9.</w:t>
+      </w:r>
+    </w:p>
+    <w:p>
+      <w:pPr>
+        <w:spacing w:after="120" w:before="0" w:line="480"/>
+        <w:jc w:val="both"/>
+      </w:pPr>
+      <w:r>
+        <w:rPr>
+          <w:rFonts w:ascii="Times New Roman" w:cs="Times New Roman" w:eastAsia="Times New Roman" w:hAnsi="Times New Roman"/>
+          <w:sz w:val="24"/>
+          <w:szCs w:val="24"/>
+        </w:rPr>
+        <w:t>Both internal drivers remained reliably positive predictors of momentary mood and the probe remained indistinguishable from zero (Table B.1). The fixed effects jointly accounted for half of the variance in momentary mood (marginal R² = .50); adding the day-level random intercept changed this little (conditional R² = .52), indicating that the internal drivers rather than stable day-level offsets carry most of the explained variance. The momentary coefficients differ in magnitude from the daily-aggregated M2 estimates because the mixed-effects coefficients blend within-day and between-day association, whereas the daily-mean analysis estimated a purely between-day relation. A full within/between decomposition by person-mean centering is left to future work.</w:t>
       </w:r>
     </w:p>
     <w:p>
@@ -6439,17 +6218,7 @@
           <w:sz w:val="22"/>
           <w:szCs w:val="22"/>
         </w:rPr>
-        <w:t xml:space="preserve">Table B1. </w:t>
-      </w:r>
-      <w:r>
-        <w:rPr>
-          <w:rFonts w:ascii="Times New Roman" w:cs="Times New Roman" w:eastAsia="Times New Roman" w:hAnsi="Times New Roman"/>
-          <w:i/>
-          <w:iCs/>
-          <w:sz w:val="22"/>
-          <w:szCs w:val="22"/>
-        </w:rPr>
-        <w:t xml:space="preserve">Posterior summaries for the Bayesian re-estimation of M2.</w:t>
+        <w:t>Table B.1. Fixed-effect estimates for the multilevel model of momentary mood.</w:t>
       </w:r>
     </w:p>
     <w:tbl>
@@ -6502,7 +6271,7 @@
                 <w:sz w:val="20"/>
                 <w:szCs w:val="20"/>
               </w:rPr>
-              <w:t xml:space="preserve">Parameter</w:t>
+              <w:t xml:space="preserve">Term</w:t>
             </w:r>
           </w:p>
         </w:tc>
@@ -6536,7 +6305,7 @@
                 <w:sz w:val="20"/>
                 <w:szCs w:val="20"/>
               </w:rPr>
-              <w:t xml:space="preserve">Posterior M</w:t>
+              <w:t xml:space="preserve">β</w:t>
             </w:r>
           </w:p>
         </w:tc>
@@ -6570,7 +6339,7 @@
                 <w:sz w:val="20"/>
                 <w:szCs w:val="20"/>
               </w:rPr>
-              <w:t xml:space="preserve">95% CrI</w:t>
+              <w:t xml:space="preserve">SE</w:t>
             </w:r>
           </w:p>
         </w:tc>
@@ -6604,7 +6373,7 @@
                 <w:sz w:val="20"/>
                 <w:szCs w:val="20"/>
               </w:rPr>
-              <w:t xml:space="preserve">Pr(β &gt; 0)</w:t>
+              <w:t xml:space="preserve">95% CI</w:t>
             </w:r>
           </w:p>
         </w:tc>
@@ -6638,7 +6407,7 @@
                 <w:sz w:val="20"/>
                 <w:szCs w:val="20"/>
               </w:rPr>
-              <w:t xml:space="preserve">R̂ / ESS_bulk</w:t>
+              <w:t xml:space="preserve">p</w:t>
             </w:r>
           </w:p>
         </w:tc>
@@ -6702,7 +6471,7 @@
                 <w:sz w:val="20"/>
                 <w:szCs w:val="20"/>
               </w:rPr>
-              <w:t xml:space="preserve">−0.01</w:t>
+              <w:t xml:space="preserve">78.47</w:t>
             </w:r>
           </w:p>
         </w:tc>
@@ -6733,7 +6502,7 @@
                 <w:sz w:val="20"/>
                 <w:szCs w:val="20"/>
               </w:rPr>
-              <w:t xml:space="preserve">[−0.26, +0.23]</w:t>
+              <w:t xml:space="preserve">0.45</w:t>
             </w:r>
           </w:p>
         </w:tc>
@@ -6764,7 +6533,7 @@
                 <w:sz w:val="20"/>
                 <w:szCs w:val="20"/>
               </w:rPr>
-              <w:t xml:space="preserve">.47</w:t>
+              <w:t xml:space="preserve">[77.59, 79.34]</w:t>
             </w:r>
           </w:p>
         </w:tc>
@@ -6795,7 +6564,7 @@
                 <w:sz w:val="20"/>
                 <w:szCs w:val="20"/>
               </w:rPr>
-              <w:t xml:space="preserve">1.00 / 11177</w:t>
+              <w:t xml:space="preserve">&lt; .001</w:t>
             </w:r>
           </w:p>
         </w:tc>
@@ -6828,7 +6597,7 @@
                 <w:sz w:val="20"/>
                 <w:szCs w:val="20"/>
               </w:rPr>
-              <w:t xml:space="preserve">mood_t−1 (z)</w:t>
+              <w:t xml:space="preserve">Agency (centered)</w:t>
             </w:r>
           </w:p>
         </w:tc>
@@ -6859,7 +6628,7 @@
                 <w:sz w:val="20"/>
                 <w:szCs w:val="20"/>
               </w:rPr>
-              <w:t xml:space="preserve">−0.12</w:t>
+              <w:t xml:space="preserve">0.34</w:t>
             </w:r>
           </w:p>
         </w:tc>
@@ -6890,7 +6659,7 @@
                 <w:sz w:val="20"/>
                 <w:szCs w:val="20"/>
               </w:rPr>
-              <w:t xml:space="preserve">[−0.33, +0.08]</w:t>
+              <w:t xml:space="preserve">0.06</w:t>
             </w:r>
           </w:p>
         </w:tc>
@@ -6921,7 +6690,7 @@
                 <w:sz w:val="20"/>
                 <w:szCs w:val="20"/>
               </w:rPr>
-              <w:t xml:space="preserve">.12</w:t>
+              <w:t xml:space="preserve">[0.22, 0.47]</w:t>
             </w:r>
           </w:p>
         </w:tc>
@@ -6952,7 +6721,7 @@
                 <w:sz w:val="20"/>
                 <w:szCs w:val="20"/>
               </w:rPr>
-              <w:t xml:space="preserve">1.00 / 9763</w:t>
+              <w:t xml:space="preserve">&lt; .001</w:t>
             </w:r>
           </w:p>
         </w:tc>
@@ -6985,7 +6754,7 @@
                 <w:sz w:val="20"/>
                 <w:szCs w:val="20"/>
               </w:rPr>
-              <w:t xml:space="preserve">melatonin</w:t>
+              <w:t xml:space="preserve">Metacognition (centered)</w:t>
             </w:r>
           </w:p>
         </w:tc>
@@ -7016,7 +6785,7 @@
                 <w:sz w:val="20"/>
                 <w:szCs w:val="20"/>
               </w:rPr>
-              <w:t xml:space="preserve">+0.02</w:t>
+              <w:t xml:space="preserve">0.48</w:t>
             </w:r>
           </w:p>
         </w:tc>
@@ -7047,7 +6816,7 @@
                 <w:sz w:val="20"/>
                 <w:szCs w:val="20"/>
               </w:rPr>
-              <w:t xml:space="preserve">[−0.32, +0.35]</w:t>
+              <w:t xml:space="preserve">0.07</w:t>
             </w:r>
           </w:p>
         </w:tc>
@@ -7078,7 +6847,7 @@
                 <w:sz w:val="20"/>
                 <w:szCs w:val="20"/>
               </w:rPr>
-              <w:t xml:space="preserve">.54</w:t>
+              <w:t xml:space="preserve">[0.34, 0.62]</w:t>
             </w:r>
           </w:p>
         </w:tc>
@@ -7109,7 +6878,7 @@
                 <w:sz w:val="20"/>
                 <w:szCs w:val="20"/>
               </w:rPr>
-              <w:t xml:space="preserve">1.00 / 11204</w:t>
+              <w:t xml:space="preserve">&lt; .001</w:t>
             </w:r>
           </w:p>
         </w:tc>
@@ -7142,7 +6911,7 @@
                 <w:sz w:val="20"/>
                 <w:szCs w:val="20"/>
               </w:rPr>
-              <w:t xml:space="preserve">agency (z)</w:t>
+              <w:t xml:space="preserve">Melatonin</w:t>
             </w:r>
           </w:p>
         </w:tc>
@@ -7173,7 +6942,7 @@
                 <w:sz w:val="20"/>
                 <w:szCs w:val="20"/>
               </w:rPr>
-              <w:t xml:space="preserve">+0.55</w:t>
+              <w:t xml:space="preserve">0.04</w:t>
             </w:r>
           </w:p>
         </w:tc>
@@ -7204,7 +6973,7 @@
                 <w:sz w:val="20"/>
                 <w:szCs w:val="20"/>
               </w:rPr>
-              <w:t xml:space="preserve">[+0.34, +0.76]</w:t>
+              <w:t xml:space="preserve">0.64</w:t>
             </w:r>
           </w:p>
         </w:tc>
@@ -7235,7 +7004,7 @@
                 <w:sz w:val="20"/>
                 <w:szCs w:val="20"/>
               </w:rPr>
-              <w:t xml:space="preserve">1.00</w:t>
+              <w:t xml:space="preserve">[−1.22, 1.31]</w:t>
             </w:r>
           </w:p>
         </w:tc>
@@ -7266,321 +7035,7 @@
                 <w:sz w:val="20"/>
                 <w:szCs w:val="20"/>
               </w:rPr>
-              <w:t xml:space="preserve">1.00 / 9894</w:t>
-            </w:r>
-          </w:p>
-        </w:tc>
-      </w:tr>
-      <w:tr>
-        <w:tc>
-          <w:tcPr>
-            <w:tcW w:type="dxa" w:w="2400"/>
-            <w:tcBorders>
-              <w:top w:val="single" w:color="888888" w:sz="1"/>
-              <w:left w:val="single" w:color="888888" w:sz="1"/>
-              <w:bottom w:val="single" w:color="888888" w:sz="1"/>
-              <w:right w:val="single" w:color="888888" w:sz="1"/>
-            </w:tcBorders>
-            <w:tcMar>
-              <w:top w:type="dxa" w:w="60"/>
-              <w:left w:type="dxa" w:w="100"/>
-              <w:bottom w:type="dxa" w:w="60"/>
-              <w:right w:type="dxa" w:w="100"/>
-            </w:tcMar>
-          </w:tcPr>
-          <w:p>
-            <w:pPr>
-              <w:spacing w:after="0" w:before="0" w:line="240"/>
-              <w:jc w:val="left"/>
-            </w:pPr>
-            <w:r>
-              <w:rPr>
-                <w:rFonts w:ascii="Times New Roman" w:cs="Times New Roman" w:eastAsia="Times New Roman" w:hAnsi="Times New Roman"/>
-                <w:sz w:val="20"/>
-                <w:szCs w:val="20"/>
-              </w:rPr>
-              <w:t xml:space="preserve">metacognition (z)</w:t>
-            </w:r>
-          </w:p>
-        </w:tc>
-        <w:tc>
-          <w:tcPr>
-            <w:tcW w:type="dxa" w:w="1300"/>
-            <w:tcBorders>
-              <w:top w:val="single" w:color="888888" w:sz="1"/>
-              <w:left w:val="single" w:color="888888" w:sz="1"/>
-              <w:bottom w:val="single" w:color="888888" w:sz="1"/>
-              <w:right w:val="single" w:color="888888" w:sz="1"/>
-            </w:tcBorders>
-            <w:tcMar>
-              <w:top w:type="dxa" w:w="60"/>
-              <w:left w:type="dxa" w:w="100"/>
-              <w:bottom w:type="dxa" w:w="60"/>
-              <w:right w:type="dxa" w:w="100"/>
-            </w:tcMar>
-          </w:tcPr>
-          <w:p>
-            <w:pPr>
-              <w:spacing w:after="0" w:before="0" w:line="240"/>
-              <w:jc w:val="center"/>
-            </w:pPr>
-            <w:r>
-              <w:rPr>
-                <w:rFonts w:ascii="Times New Roman" w:cs="Times New Roman" w:eastAsia="Times New Roman" w:hAnsi="Times New Roman"/>
-                <w:sz w:val="20"/>
-                <w:szCs w:val="20"/>
-              </w:rPr>
-              <w:t xml:space="preserve">+0.42</w:t>
-            </w:r>
-          </w:p>
-        </w:tc>
-        <w:tc>
-          <w:tcPr>
-            <w:tcW w:type="dxa" w:w="2100"/>
-            <w:tcBorders>
-              <w:top w:val="single" w:color="888888" w:sz="1"/>
-              <w:left w:val="single" w:color="888888" w:sz="1"/>
-              <w:bottom w:val="single" w:color="888888" w:sz="1"/>
-              <w:right w:val="single" w:color="888888" w:sz="1"/>
-            </w:tcBorders>
-            <w:tcMar>
-              <w:top w:type="dxa" w:w="60"/>
-              <w:left w:type="dxa" w:w="100"/>
-              <w:bottom w:type="dxa" w:w="60"/>
-              <w:right w:type="dxa" w:w="100"/>
-            </w:tcMar>
-          </w:tcPr>
-          <w:p>
-            <w:pPr>
-              <w:spacing w:after="0" w:before="0" w:line="240"/>
-              <w:jc w:val="center"/>
-            </w:pPr>
-            <w:r>
-              <w:rPr>
-                <w:rFonts w:ascii="Times New Roman" w:cs="Times New Roman" w:eastAsia="Times New Roman" w:hAnsi="Times New Roman"/>
-                <w:sz w:val="20"/>
-                <w:szCs w:val="20"/>
-              </w:rPr>
-              <w:t xml:space="preserve">[+0.20, +0.64]</w:t>
-            </w:r>
-          </w:p>
-        </w:tc>
-        <w:tc>
-          <w:tcPr>
-            <w:tcW w:type="dxa" w:w="1300"/>
-            <w:tcBorders>
-              <w:top w:val="single" w:color="888888" w:sz="1"/>
-              <w:left w:val="single" w:color="888888" w:sz="1"/>
-              <w:bottom w:val="single" w:color="888888" w:sz="1"/>
-              <w:right w:val="single" w:color="888888" w:sz="1"/>
-            </w:tcBorders>
-            <w:tcMar>
-              <w:top w:type="dxa" w:w="60"/>
-              <w:left w:type="dxa" w:w="100"/>
-              <w:bottom w:type="dxa" w:w="60"/>
-              <w:right w:type="dxa" w:w="100"/>
-            </w:tcMar>
-          </w:tcPr>
-          <w:p>
-            <w:pPr>
-              <w:spacing w:after="0" w:before="0" w:line="240"/>
-              <w:jc w:val="center"/>
-            </w:pPr>
-            <w:r>
-              <w:rPr>
-                <w:rFonts w:ascii="Times New Roman" w:cs="Times New Roman" w:eastAsia="Times New Roman" w:hAnsi="Times New Roman"/>
-                <w:sz w:val="20"/>
-                <w:szCs w:val="20"/>
-              </w:rPr>
-              <w:t xml:space="preserve">1.00</w:t>
-            </w:r>
-          </w:p>
-        </w:tc>
-        <w:tc>
-          <w:tcPr>
-            <w:tcW w:type="dxa" w:w="2260"/>
-            <w:tcBorders>
-              <w:top w:val="single" w:color="888888" w:sz="1"/>
-              <w:left w:val="single" w:color="888888" w:sz="1"/>
-              <w:bottom w:val="single" w:color="888888" w:sz="1"/>
-              <w:right w:val="single" w:color="888888" w:sz="1"/>
-            </w:tcBorders>
-            <w:tcMar>
-              <w:top w:type="dxa" w:w="60"/>
-              <w:left w:type="dxa" w:w="100"/>
-              <w:bottom w:type="dxa" w:w="60"/>
-              <w:right w:type="dxa" w:w="100"/>
-            </w:tcMar>
-          </w:tcPr>
-          <w:p>
-            <w:pPr>
-              <w:spacing w:after="0" w:before="0" w:line="240"/>
-              <w:jc w:val="center"/>
-            </w:pPr>
-            <w:r>
-              <w:rPr>
-                <w:rFonts w:ascii="Times New Roman" w:cs="Times New Roman" w:eastAsia="Times New Roman" w:hAnsi="Times New Roman"/>
-                <w:sz w:val="20"/>
-                <w:szCs w:val="20"/>
-              </w:rPr>
-              <w:t xml:space="preserve">1.00 / 9306</w:t>
-            </w:r>
-          </w:p>
-        </w:tc>
-      </w:tr>
-      <w:tr>
-        <w:tc>
-          <w:tcPr>
-            <w:tcW w:type="dxa" w:w="2400"/>
-            <w:tcBorders>
-              <w:top w:val="single" w:color="888888" w:sz="1"/>
-              <w:left w:val="single" w:color="888888" w:sz="1"/>
-              <w:bottom w:val="single" w:color="888888" w:sz="1"/>
-              <w:right w:val="single" w:color="888888" w:sz="1"/>
-            </w:tcBorders>
-            <w:tcMar>
-              <w:top w:type="dxa" w:w="60"/>
-              <w:left w:type="dxa" w:w="100"/>
-              <w:bottom w:type="dxa" w:w="60"/>
-              <w:right w:type="dxa" w:w="100"/>
-            </w:tcMar>
-          </w:tcPr>
-          <w:p>
-            <w:pPr>
-              <w:spacing w:after="0" w:before="0" w:line="240"/>
-              <w:jc w:val="left"/>
-            </w:pPr>
-            <w:r>
-              <w:rPr>
-                <w:rFonts w:ascii="Times New Roman" w:cs="Times New Roman" w:eastAsia="Times New Roman" w:hAnsi="Times New Roman"/>
-                <w:sz w:val="20"/>
-                <w:szCs w:val="20"/>
-              </w:rPr>
-              <w:t xml:space="preserve">σ</w:t>
-            </w:r>
-          </w:p>
-        </w:tc>
-        <w:tc>
-          <w:tcPr>
-            <w:tcW w:type="dxa" w:w="1300"/>
-            <w:tcBorders>
-              <w:top w:val="single" w:color="888888" w:sz="1"/>
-              <w:left w:val="single" w:color="888888" w:sz="1"/>
-              <w:bottom w:val="single" w:color="888888" w:sz="1"/>
-              <w:right w:val="single" w:color="888888" w:sz="1"/>
-            </w:tcBorders>
-            <w:tcMar>
-              <w:top w:type="dxa" w:w="60"/>
-              <w:left w:type="dxa" w:w="100"/>
-              <w:bottom w:type="dxa" w:w="60"/>
-              <w:right w:type="dxa" w:w="100"/>
-            </w:tcMar>
-          </w:tcPr>
-          <w:p>
-            <w:pPr>
-              <w:spacing w:after="0" w:before="0" w:line="240"/>
-              <w:jc w:val="center"/>
-            </w:pPr>
-            <w:r>
-              <w:rPr>
-                <w:rFonts w:ascii="Times New Roman" w:cs="Times New Roman" w:eastAsia="Times New Roman" w:hAnsi="Times New Roman"/>
-                <w:sz w:val="20"/>
-                <w:szCs w:val="20"/>
-              </w:rPr>
-              <w:t xml:space="preserve">+0.64</w:t>
-            </w:r>
-          </w:p>
-        </w:tc>
-        <w:tc>
-          <w:tcPr>
-            <w:tcW w:type="dxa" w:w="2100"/>
-            <w:tcBorders>
-              <w:top w:val="single" w:color="888888" w:sz="1"/>
-              <w:left w:val="single" w:color="888888" w:sz="1"/>
-              <w:bottom w:val="single" w:color="888888" w:sz="1"/>
-              <w:right w:val="single" w:color="888888" w:sz="1"/>
-            </w:tcBorders>
-            <w:tcMar>
-              <w:top w:type="dxa" w:w="60"/>
-              <w:left w:type="dxa" w:w="100"/>
-              <w:bottom w:type="dxa" w:w="60"/>
-              <w:right w:type="dxa" w:w="100"/>
-            </w:tcMar>
-          </w:tcPr>
-          <w:p>
-            <w:pPr>
-              <w:spacing w:after="0" w:before="0" w:line="240"/>
-              <w:jc w:val="center"/>
-            </w:pPr>
-            <w:r>
-              <w:rPr>
-                <w:rFonts w:ascii="Times New Roman" w:cs="Times New Roman" w:eastAsia="Times New Roman" w:hAnsi="Times New Roman"/>
-                <w:sz w:val="20"/>
-                <w:szCs w:val="20"/>
-              </w:rPr>
-              <w:t xml:space="preserve">[+0.52, +0.78]</w:t>
-            </w:r>
-          </w:p>
-        </w:tc>
-        <w:tc>
-          <w:tcPr>
-            <w:tcW w:type="dxa" w:w="1300"/>
-            <w:tcBorders>
-              <w:top w:val="single" w:color="888888" w:sz="1"/>
-              <w:left w:val="single" w:color="888888" w:sz="1"/>
-              <w:bottom w:val="single" w:color="888888" w:sz="1"/>
-              <w:right w:val="single" w:color="888888" w:sz="1"/>
-            </w:tcBorders>
-            <w:tcMar>
-              <w:top w:type="dxa" w:w="60"/>
-              <w:left w:type="dxa" w:w="100"/>
-              <w:bottom w:type="dxa" w:w="60"/>
-              <w:right w:type="dxa" w:w="100"/>
-            </w:tcMar>
-          </w:tcPr>
-          <w:p>
-            <w:pPr>
-              <w:spacing w:after="0" w:before="0" w:line="240"/>
-              <w:jc w:val="center"/>
-            </w:pPr>
-            <w:r>
-              <w:rPr>
-                <w:rFonts w:ascii="Times New Roman" w:cs="Times New Roman" w:eastAsia="Times New Roman" w:hAnsi="Times New Roman"/>
-                <w:sz w:val="20"/>
-                <w:szCs w:val="20"/>
-              </w:rPr>
-              <w:t xml:space="preserve">n/a</w:t>
-            </w:r>
-          </w:p>
-        </w:tc>
-        <w:tc>
-          <w:tcPr>
-            <w:tcW w:type="dxa" w:w="2260"/>
-            <w:tcBorders>
-              <w:top w:val="single" w:color="888888" w:sz="1"/>
-              <w:left w:val="single" w:color="888888" w:sz="1"/>
-              <w:bottom w:val="single" w:color="888888" w:sz="1"/>
-              <w:right w:val="single" w:color="888888" w:sz="1"/>
-            </w:tcBorders>
-            <w:tcMar>
-              <w:top w:type="dxa" w:w="60"/>
-              <w:left w:type="dxa" w:w="100"/>
-              <w:bottom w:type="dxa" w:w="60"/>
-              <w:right w:type="dxa" w:w="100"/>
-            </w:tcMar>
-          </w:tcPr>
-          <w:p>
-            <w:pPr>
-              <w:spacing w:after="0" w:before="0" w:line="240"/>
-              <w:jc w:val="center"/>
-            </w:pPr>
-            <w:r>
-              <w:rPr>
-                <w:rFonts w:ascii="Times New Roman" w:cs="Times New Roman" w:eastAsia="Times New Roman" w:hAnsi="Times New Roman"/>
-                <w:sz w:val="20"/>
-                <w:szCs w:val="20"/>
-              </w:rPr>
-              <w:t xml:space="preserve">1.00 / 10011</w:t>
+              <w:t xml:space="preserve">.946</w:t>
             </w:r>
           </w:p>
         </w:tc>
@@ -7607,21 +7062,37 @@
           <w:sz w:val="20"/>
           <w:szCs w:val="20"/>
         </w:rPr>
-        <w:t xml:space="preserve">Day 18–70 subsample (n = 53). Continuous variables standardized; melatonin retained as 0/1. Priors: coefficients ~ Normal(0, 1); intercept ~ Student-t(3, 0, 2.5); σ ~ Exponential(1). Four chains yielded 12,000 post-warmup draws. CrI = equal-tailed credible interval. All R̂ ≤ 1.001; all ESS_tail exceeded 7,000.</w:t>
-      </w:r>
-    </w:p>
-    <w:p>
-      <w:pPr>
-        <w:spacing w:after="120" w:before="0" w:line="480"/>
-        <w:jc w:val="both"/>
-      </w:pPr>
-      <w:r>
-        <w:rPr>
-          <w:rFonts w:ascii="Times New Roman" w:cs="Times New Roman" w:eastAsia="Times New Roman" w:hAnsi="Times New Roman"/>
-          <w:sz w:val="24"/>
-          <w:szCs w:val="24"/>
-        </w:rPr>
-        <w:t xml:space="preserve">The Bayesian metacontrol model yielded a negative posterior mean for the melatonin × metacognition interaction (β = −0.04, 95% CrI [−0.39, +0.31], Pr(β &lt; 0) = .59), consistent in direction with metacognitive buffering but with a credible interval clearly spanning zero.</w:t>
+        <w:t xml:space="preserve">n = 144 momentary observations nested within 53 days (Day 18–70; 27 control, 26 melatonin). Random intercept for day: variance = 0.74; within-day residual variance = 12.71. Marginal R² = .50; conditional R² = .52. Agency and metacognition centered at their sample means (77.98 and 79.57). Fit by REML in lme4; 95% CIs are Wald intervals; p-values use the Satterthwaite approximation.</w:t>
+      </w:r>
+    </w:p>
+    <w:p>
+      <w:pPr>
+        <w:pStyle w:val="Heading1"/>
+        <w:spacing w:after="240" w:before="360" w:line="480"/>
+      </w:pPr>
+      <w:r>
+        <w:rPr>
+          <w:rFonts w:ascii="Times New Roman" w:cs="Times New Roman" w:eastAsia="Times New Roman" w:hAnsi="Times New Roman"/>
+          <w:b/>
+          <w:bCs/>
+          <w:sz w:val="28"/>
+          <w:szCs w:val="28"/>
+        </w:rPr>
+        <w:t xml:space="preserve">Appendix C. Secondary Analyses</w:t>
+      </w:r>
+    </w:p>
+    <w:p>
+      <w:pPr>
+        <w:spacing w:after="120" w:before="0" w:line="480"/>
+        <w:jc w:val="both"/>
+      </w:pPr>
+      <w:r>
+        <w:rPr>
+          <w:rFonts w:ascii="Times New Roman" w:cs="Times New Roman" w:eastAsia="Times New Roman" w:hAnsi="Times New Roman"/>
+          <w:sz w:val="24"/>
+          <w:szCs w:val="24"/>
+        </w:rPr>
+        <w:t xml:space="preserve">This appendix reports the analyses referred to in Sections 3.3 and 4.1 as secondary or exploratory: the full variability statistics, the state-dependent decay check, and the metacontrol interaction.</w:t>
       </w:r>
     </w:p>
     <w:p>
@@ -7637,962 +7108,35 @@
           <w:sz w:val="26"/>
           <w:szCs w:val="26"/>
         </w:rPr>
-        <w:t xml:space="preserve">B.2 Multilevel re-estimation</w:t>
-      </w:r>
-    </w:p>
-    <w:p>
-      <w:pPr>
-        <w:spacing w:after="120" w:before="0" w:line="480"/>
-        <w:jc w:val="both"/>
-      </w:pPr>
-      <w:r>
-        <w:rPr>
-          <w:rFonts w:ascii="Times New Roman" w:cs="Times New Roman" w:eastAsia="Times New Roman" w:hAnsi="Times New Roman"/>
-          <w:sz w:val="24"/>
-          <w:szCs w:val="24"/>
-        </w:rPr>
-        <w:t xml:space="preserve">Method</w:t>
-      </w:r>
-    </w:p>
-    <w:p>
-      <w:pPr>
-        <w:spacing w:after="120" w:before="0" w:line="480"/>
-        <w:jc w:val="both"/>
-      </w:pPr>
-      <w:r>
-        <w:rPr>
-          <w:rFonts w:ascii="Times New Roman" w:cs="Times New Roman" w:eastAsia="Times New Roman" w:hAnsi="Times New Roman"/>
-          <w:sz w:val="24"/>
-          <w:szCs w:val="24"/>
-        </w:rPr>
-        <w:t xml:space="preserve">The primary models were fit to daily mean mood, which discards within-day variation. As a robustness check the relation among the internal drivers, the probe, and mood was re-estimated at the momentary level with a linear mixed-effects model retaining every EMA observation and accounting for its nesting within days: moodᵢⱼ = γ₀₀ + γ₁₀ · agencyᵢⱼ + γ₂₀ · metacognitionᵢⱼ + γ₃₀ · melatoninⱼ + u₀ⱼ + eᵢⱼ, where i indexes the momentary observation within day j, u₀ⱼ ~ N(0, τ₀₀) is the day-level random intercept, and eᵢⱼ ~ N(0, σ²) is the within-day residual. Agency and metacognition were grand-mean-centered. Models were fit by restricted maximum likelihood in R 4.5 using lme4 (Bates et al., 2015) with Satterthwaite-approximated p-values from lmerTest (Kuznetsova et al., 2017). This analysis is restricted to the Day 18–70 window.</w:t>
-      </w:r>
-    </w:p>
-    <w:p>
-      <w:pPr>
-        <w:spacing w:after="120" w:before="0" w:line="480"/>
-        <w:jc w:val="both"/>
-      </w:pPr>
-      <w:r>
-        <w:rPr>
-          <w:rFonts w:ascii="Times New Roman" w:cs="Times New Roman" w:eastAsia="Times New Roman" w:hAnsi="Times New Roman"/>
-          <w:sz w:val="24"/>
-          <w:szCs w:val="24"/>
-        </w:rPr>
-        <w:t xml:space="preserve">Results</w:t>
-      </w:r>
-    </w:p>
-    <w:p>
-      <w:pPr>
-        <w:spacing w:after="120" w:before="0" w:line="480"/>
-        <w:jc w:val="both"/>
-      </w:pPr>
-      <w:r>
-        <w:rPr>
-          <w:rFonts w:ascii="Times New Roman" w:cs="Times New Roman" w:eastAsia="Times New Roman" w:hAnsi="Times New Roman"/>
-          <w:sz w:val="24"/>
-          <w:szCs w:val="24"/>
-        </w:rPr>
-        <w:t xml:space="preserve">Both internal drivers remained reliably positive predictors of momentary mood and the probe remained indistinguishable from zero (Table B2). The fixed effects jointly accounted for half of the variance in momentary mood (marginal R² = .50); adding the day-level random intercept changed this little (conditional R² = .52), indicating that the internal drivers rather than stable day-level offsets carry most of the explained variance. The momentary coefficients differ in magnitude from the daily-aggregated M2 estimates because the mixed-effects coefficients blend within-day and between-day association, whereas the daily-mean analysis estimated a purely between-day relation. A full within/between decomposition by person-mean centering is left to future work.</w:t>
-      </w:r>
-    </w:p>
-    <w:p>
-      <w:pPr>
-        <w:spacing w:after="60" w:before="60" w:line="480"/>
-      </w:pPr>
-      <w:r>
-        <w:rPr>
-          <w:rFonts w:ascii="Times New Roman" w:cs="Times New Roman" w:eastAsia="Times New Roman" w:hAnsi="Times New Roman"/>
-          <w:b/>
-          <w:bCs/>
-          <w:sz w:val="22"/>
-          <w:szCs w:val="22"/>
-        </w:rPr>
-        <w:t xml:space="preserve">Table B2. </w:t>
-      </w:r>
-      <w:r>
-        <w:rPr>
-          <w:rFonts w:ascii="Times New Roman" w:cs="Times New Roman" w:eastAsia="Times New Roman" w:hAnsi="Times New Roman"/>
-          <w:i/>
-          <w:iCs/>
-          <w:sz w:val="22"/>
-          <w:szCs w:val="22"/>
-        </w:rPr>
-        <w:t xml:space="preserve">Fixed-effect estimates for the multilevel model of momentary mood.</w:t>
-      </w:r>
-    </w:p>
-    <w:tbl>
-      <w:tblPr>
-        <w:tblW w:type="dxa" w:w="9360"/>
-        <w:tblBorders>
-          <w:top w:val="single" w:color="auto" w:sz="4"/>
-          <w:left w:val="single" w:color="auto" w:sz="4"/>
-          <w:bottom w:val="single" w:color="auto" w:sz="4"/>
-          <w:right w:val="single" w:color="auto" w:sz="4"/>
-          <w:insideH w:val="single" w:color="auto" w:sz="4"/>
-          <w:insideV w:val="single" w:color="auto" w:sz="4"/>
-        </w:tblBorders>
-      </w:tblPr>
-      <w:tblGrid>
-        <w:gridCol w:w="2400"/>
-        <w:gridCol w:w="1300"/>
-        <w:gridCol w:w="2100"/>
-        <w:gridCol w:w="1300"/>
-        <w:gridCol w:w="2260"/>
-      </w:tblGrid>
-      <w:tr>
-        <w:tc>
-          <w:tcPr>
-            <w:tcW w:type="dxa" w:w="2400"/>
-            <w:tcBorders>
-              <w:top w:val="single" w:color="888888" w:sz="1"/>
-              <w:left w:val="single" w:color="888888" w:sz="1"/>
-              <w:bottom w:val="single" w:color="888888" w:sz="1"/>
-              <w:right w:val="single" w:color="888888" w:sz="1"/>
-            </w:tcBorders>
-            <w:shd w:fill="E8ECEF" w:val="clear"/>
-            <w:tcMar>
-              <w:top w:type="dxa" w:w="60"/>
-              <w:left w:type="dxa" w:w="100"/>
-              <w:bottom w:type="dxa" w:w="60"/>
-              <w:right w:type="dxa" w:w="100"/>
-            </w:tcMar>
-          </w:tcPr>
-          <w:p>
-            <w:pPr>
-              <w:spacing w:after="0" w:before="0" w:line="240"/>
-              <w:jc w:val="left"/>
-            </w:pPr>
-            <w:r>
-              <w:rPr>
-                <w:rFonts w:ascii="Times New Roman" w:cs="Times New Roman" w:eastAsia="Times New Roman" w:hAnsi="Times New Roman"/>
-                <w:b/>
-                <w:bCs/>
-                <w:sz w:val="20"/>
-                <w:szCs w:val="20"/>
-              </w:rPr>
-              <w:t xml:space="preserve">Term</w:t>
-            </w:r>
-          </w:p>
-        </w:tc>
-        <w:tc>
-          <w:tcPr>
-            <w:tcW w:type="dxa" w:w="1300"/>
-            <w:tcBorders>
-              <w:top w:val="single" w:color="888888" w:sz="1"/>
-              <w:left w:val="single" w:color="888888" w:sz="1"/>
-              <w:bottom w:val="single" w:color="888888" w:sz="1"/>
-              <w:right w:val="single" w:color="888888" w:sz="1"/>
-            </w:tcBorders>
-            <w:shd w:fill="E8ECEF" w:val="clear"/>
-            <w:tcMar>
-              <w:top w:type="dxa" w:w="60"/>
-              <w:left w:type="dxa" w:w="100"/>
-              <w:bottom w:type="dxa" w:w="60"/>
-              <w:right w:type="dxa" w:w="100"/>
-            </w:tcMar>
-          </w:tcPr>
-          <w:p>
-            <w:pPr>
-              <w:spacing w:after="0" w:before="0" w:line="240"/>
-              <w:jc w:val="center"/>
-            </w:pPr>
-            <w:r>
-              <w:rPr>
-                <w:rFonts w:ascii="Times New Roman" w:cs="Times New Roman" w:eastAsia="Times New Roman" w:hAnsi="Times New Roman"/>
-                <w:b/>
-                <w:bCs/>
-                <w:sz w:val="20"/>
-                <w:szCs w:val="20"/>
-              </w:rPr>
-              <w:t xml:space="preserve">β</w:t>
-            </w:r>
-          </w:p>
-        </w:tc>
-        <w:tc>
-          <w:tcPr>
-            <w:tcW w:type="dxa" w:w="2100"/>
-            <w:tcBorders>
-              <w:top w:val="single" w:color="888888" w:sz="1"/>
-              <w:left w:val="single" w:color="888888" w:sz="1"/>
-              <w:bottom w:val="single" w:color="888888" w:sz="1"/>
-              <w:right w:val="single" w:color="888888" w:sz="1"/>
-            </w:tcBorders>
-            <w:shd w:fill="E8ECEF" w:val="clear"/>
-            <w:tcMar>
-              <w:top w:type="dxa" w:w="60"/>
-              <w:left w:type="dxa" w:w="100"/>
-              <w:bottom w:type="dxa" w:w="60"/>
-              <w:right w:type="dxa" w:w="100"/>
-            </w:tcMar>
-          </w:tcPr>
-          <w:p>
-            <w:pPr>
-              <w:spacing w:after="0" w:before="0" w:line="240"/>
-              <w:jc w:val="center"/>
-            </w:pPr>
-            <w:r>
-              <w:rPr>
-                <w:rFonts w:ascii="Times New Roman" w:cs="Times New Roman" w:eastAsia="Times New Roman" w:hAnsi="Times New Roman"/>
-                <w:b/>
-                <w:bCs/>
-                <w:sz w:val="20"/>
-                <w:szCs w:val="20"/>
-              </w:rPr>
-              <w:t xml:space="preserve">SE</w:t>
-            </w:r>
-          </w:p>
-        </w:tc>
-        <w:tc>
-          <w:tcPr>
-            <w:tcW w:type="dxa" w:w="1300"/>
-            <w:tcBorders>
-              <w:top w:val="single" w:color="888888" w:sz="1"/>
-              <w:left w:val="single" w:color="888888" w:sz="1"/>
-              <w:bottom w:val="single" w:color="888888" w:sz="1"/>
-              <w:right w:val="single" w:color="888888" w:sz="1"/>
-            </w:tcBorders>
-            <w:shd w:fill="E8ECEF" w:val="clear"/>
-            <w:tcMar>
-              <w:top w:type="dxa" w:w="60"/>
-              <w:left w:type="dxa" w:w="100"/>
-              <w:bottom w:type="dxa" w:w="60"/>
-              <w:right w:type="dxa" w:w="100"/>
-            </w:tcMar>
-          </w:tcPr>
-          <w:p>
-            <w:pPr>
-              <w:spacing w:after="0" w:before="0" w:line="240"/>
-              <w:jc w:val="center"/>
-            </w:pPr>
-            <w:r>
-              <w:rPr>
-                <w:rFonts w:ascii="Times New Roman" w:cs="Times New Roman" w:eastAsia="Times New Roman" w:hAnsi="Times New Roman"/>
-                <w:b/>
-                <w:bCs/>
-                <w:sz w:val="20"/>
-                <w:szCs w:val="20"/>
-              </w:rPr>
-              <w:t xml:space="preserve">95% CI</w:t>
-            </w:r>
-          </w:p>
-        </w:tc>
-        <w:tc>
-          <w:tcPr>
-            <w:tcW w:type="dxa" w:w="2260"/>
-            <w:tcBorders>
-              <w:top w:val="single" w:color="888888" w:sz="1"/>
-              <w:left w:val="single" w:color="888888" w:sz="1"/>
-              <w:bottom w:val="single" w:color="888888" w:sz="1"/>
-              <w:right w:val="single" w:color="888888" w:sz="1"/>
-            </w:tcBorders>
-            <w:shd w:fill="E8ECEF" w:val="clear"/>
-            <w:tcMar>
-              <w:top w:type="dxa" w:w="60"/>
-              <w:left w:type="dxa" w:w="100"/>
-              <w:bottom w:type="dxa" w:w="60"/>
-              <w:right w:type="dxa" w:w="100"/>
-            </w:tcMar>
-          </w:tcPr>
-          <w:p>
-            <w:pPr>
-              <w:spacing w:after="0" w:before="0" w:line="240"/>
-              <w:jc w:val="center"/>
-            </w:pPr>
-            <w:r>
-              <w:rPr>
-                <w:rFonts w:ascii="Times New Roman" w:cs="Times New Roman" w:eastAsia="Times New Roman" w:hAnsi="Times New Roman"/>
-                <w:b/>
-                <w:bCs/>
-                <w:sz w:val="20"/>
-                <w:szCs w:val="20"/>
-              </w:rPr>
-              <w:t xml:space="preserve">p</w:t>
-            </w:r>
-          </w:p>
-        </w:tc>
-      </w:tr>
-      <w:tr>
-        <w:tc>
-          <w:tcPr>
-            <w:tcW w:type="dxa" w:w="2400"/>
-            <w:tcBorders>
-              <w:top w:val="single" w:color="888888" w:sz="1"/>
-              <w:left w:val="single" w:color="888888" w:sz="1"/>
-              <w:bottom w:val="single" w:color="888888" w:sz="1"/>
-              <w:right w:val="single" w:color="888888" w:sz="1"/>
-            </w:tcBorders>
-            <w:tcMar>
-              <w:top w:type="dxa" w:w="60"/>
-              <w:left w:type="dxa" w:w="100"/>
-              <w:bottom w:type="dxa" w:w="60"/>
-              <w:right w:type="dxa" w:w="100"/>
-            </w:tcMar>
-          </w:tcPr>
-          <w:p>
-            <w:pPr>
-              <w:spacing w:after="0" w:before="0" w:line="240"/>
-              <w:jc w:val="left"/>
-            </w:pPr>
-            <w:r>
-              <w:rPr>
-                <w:rFonts w:ascii="Times New Roman" w:cs="Times New Roman" w:eastAsia="Times New Roman" w:hAnsi="Times New Roman"/>
-                <w:sz w:val="20"/>
-                <w:szCs w:val="20"/>
-              </w:rPr>
-              <w:t xml:space="preserve">Intercept</w:t>
-            </w:r>
-          </w:p>
-        </w:tc>
-        <w:tc>
-          <w:tcPr>
-            <w:tcW w:type="dxa" w:w="1300"/>
-            <w:tcBorders>
-              <w:top w:val="single" w:color="888888" w:sz="1"/>
-              <w:left w:val="single" w:color="888888" w:sz="1"/>
-              <w:bottom w:val="single" w:color="888888" w:sz="1"/>
-              <w:right w:val="single" w:color="888888" w:sz="1"/>
-            </w:tcBorders>
-            <w:tcMar>
-              <w:top w:type="dxa" w:w="60"/>
-              <w:left w:type="dxa" w:w="100"/>
-              <w:bottom w:type="dxa" w:w="60"/>
-              <w:right w:type="dxa" w:w="100"/>
-            </w:tcMar>
-          </w:tcPr>
-          <w:p>
-            <w:pPr>
-              <w:spacing w:after="0" w:before="0" w:line="240"/>
-              <w:jc w:val="center"/>
-            </w:pPr>
-            <w:r>
-              <w:rPr>
-                <w:rFonts w:ascii="Times New Roman" w:cs="Times New Roman" w:eastAsia="Times New Roman" w:hAnsi="Times New Roman"/>
-                <w:sz w:val="20"/>
-                <w:szCs w:val="20"/>
-              </w:rPr>
-              <w:t xml:space="preserve">78.47</w:t>
-            </w:r>
-          </w:p>
-        </w:tc>
-        <w:tc>
-          <w:tcPr>
-            <w:tcW w:type="dxa" w:w="2100"/>
-            <w:tcBorders>
-              <w:top w:val="single" w:color="888888" w:sz="1"/>
-              <w:left w:val="single" w:color="888888" w:sz="1"/>
-              <w:bottom w:val="single" w:color="888888" w:sz="1"/>
-              <w:right w:val="single" w:color="888888" w:sz="1"/>
-            </w:tcBorders>
-            <w:tcMar>
-              <w:top w:type="dxa" w:w="60"/>
-              <w:left w:type="dxa" w:w="100"/>
-              <w:bottom w:type="dxa" w:w="60"/>
-              <w:right w:type="dxa" w:w="100"/>
-            </w:tcMar>
-          </w:tcPr>
-          <w:p>
-            <w:pPr>
-              <w:spacing w:after="0" w:before="0" w:line="240"/>
-              <w:jc w:val="center"/>
-            </w:pPr>
-            <w:r>
-              <w:rPr>
-                <w:rFonts w:ascii="Times New Roman" w:cs="Times New Roman" w:eastAsia="Times New Roman" w:hAnsi="Times New Roman"/>
-                <w:sz w:val="20"/>
-                <w:szCs w:val="20"/>
-              </w:rPr>
-              <w:t xml:space="preserve">0.45</w:t>
-            </w:r>
-          </w:p>
-        </w:tc>
-        <w:tc>
-          <w:tcPr>
-            <w:tcW w:type="dxa" w:w="1300"/>
-            <w:tcBorders>
-              <w:top w:val="single" w:color="888888" w:sz="1"/>
-              <w:left w:val="single" w:color="888888" w:sz="1"/>
-              <w:bottom w:val="single" w:color="888888" w:sz="1"/>
-              <w:right w:val="single" w:color="888888" w:sz="1"/>
-            </w:tcBorders>
-            <w:tcMar>
-              <w:top w:type="dxa" w:w="60"/>
-              <w:left w:type="dxa" w:w="100"/>
-              <w:bottom w:type="dxa" w:w="60"/>
-              <w:right w:type="dxa" w:w="100"/>
-            </w:tcMar>
-          </w:tcPr>
-          <w:p>
-            <w:pPr>
-              <w:spacing w:after="0" w:before="0" w:line="240"/>
-              <w:jc w:val="center"/>
-            </w:pPr>
-            <w:r>
-              <w:rPr>
-                <w:rFonts w:ascii="Times New Roman" w:cs="Times New Roman" w:eastAsia="Times New Roman" w:hAnsi="Times New Roman"/>
-                <w:sz w:val="20"/>
-                <w:szCs w:val="20"/>
-              </w:rPr>
-              <w:t xml:space="preserve">[77.59, 79.34]</w:t>
-            </w:r>
-          </w:p>
-        </w:tc>
-        <w:tc>
-          <w:tcPr>
-            <w:tcW w:type="dxa" w:w="2260"/>
-            <w:tcBorders>
-              <w:top w:val="single" w:color="888888" w:sz="1"/>
-              <w:left w:val="single" w:color="888888" w:sz="1"/>
-              <w:bottom w:val="single" w:color="888888" w:sz="1"/>
-              <w:right w:val="single" w:color="888888" w:sz="1"/>
-            </w:tcBorders>
-            <w:tcMar>
-              <w:top w:type="dxa" w:w="60"/>
-              <w:left w:type="dxa" w:w="100"/>
-              <w:bottom w:type="dxa" w:w="60"/>
-              <w:right w:type="dxa" w:w="100"/>
-            </w:tcMar>
-          </w:tcPr>
-          <w:p>
-            <w:pPr>
-              <w:spacing w:after="0" w:before="0" w:line="240"/>
-              <w:jc w:val="center"/>
-            </w:pPr>
-            <w:r>
-              <w:rPr>
-                <w:rFonts w:ascii="Times New Roman" w:cs="Times New Roman" w:eastAsia="Times New Roman" w:hAnsi="Times New Roman"/>
-                <w:sz w:val="20"/>
-                <w:szCs w:val="20"/>
-              </w:rPr>
-              <w:t xml:space="preserve">&lt; .001</w:t>
-            </w:r>
-          </w:p>
-        </w:tc>
-      </w:tr>
-      <w:tr>
-        <w:tc>
-          <w:tcPr>
-            <w:tcW w:type="dxa" w:w="2400"/>
-            <w:tcBorders>
-              <w:top w:val="single" w:color="888888" w:sz="1"/>
-              <w:left w:val="single" w:color="888888" w:sz="1"/>
-              <w:bottom w:val="single" w:color="888888" w:sz="1"/>
-              <w:right w:val="single" w:color="888888" w:sz="1"/>
-            </w:tcBorders>
-            <w:tcMar>
-              <w:top w:type="dxa" w:w="60"/>
-              <w:left w:type="dxa" w:w="100"/>
-              <w:bottom w:type="dxa" w:w="60"/>
-              <w:right w:type="dxa" w:w="100"/>
-            </w:tcMar>
-          </w:tcPr>
-          <w:p>
-            <w:pPr>
-              <w:spacing w:after="0" w:before="0" w:line="240"/>
-              <w:jc w:val="left"/>
-            </w:pPr>
-            <w:r>
-              <w:rPr>
-                <w:rFonts w:ascii="Times New Roman" w:cs="Times New Roman" w:eastAsia="Times New Roman" w:hAnsi="Times New Roman"/>
-                <w:sz w:val="20"/>
-                <w:szCs w:val="20"/>
-              </w:rPr>
-              <w:t xml:space="preserve">Agency (centered)</w:t>
-            </w:r>
-          </w:p>
-        </w:tc>
-        <w:tc>
-          <w:tcPr>
-            <w:tcW w:type="dxa" w:w="1300"/>
-            <w:tcBorders>
-              <w:top w:val="single" w:color="888888" w:sz="1"/>
-              <w:left w:val="single" w:color="888888" w:sz="1"/>
-              <w:bottom w:val="single" w:color="888888" w:sz="1"/>
-              <w:right w:val="single" w:color="888888" w:sz="1"/>
-            </w:tcBorders>
-            <w:tcMar>
-              <w:top w:type="dxa" w:w="60"/>
-              <w:left w:type="dxa" w:w="100"/>
-              <w:bottom w:type="dxa" w:w="60"/>
-              <w:right w:type="dxa" w:w="100"/>
-            </w:tcMar>
-          </w:tcPr>
-          <w:p>
-            <w:pPr>
-              <w:spacing w:after="0" w:before="0" w:line="240"/>
-              <w:jc w:val="center"/>
-            </w:pPr>
-            <w:r>
-              <w:rPr>
-                <w:rFonts w:ascii="Times New Roman" w:cs="Times New Roman" w:eastAsia="Times New Roman" w:hAnsi="Times New Roman"/>
-                <w:sz w:val="20"/>
-                <w:szCs w:val="20"/>
-              </w:rPr>
-              <w:t xml:space="preserve">0.34</w:t>
-            </w:r>
-          </w:p>
-        </w:tc>
-        <w:tc>
-          <w:tcPr>
-            <w:tcW w:type="dxa" w:w="2100"/>
-            <w:tcBorders>
-              <w:top w:val="single" w:color="888888" w:sz="1"/>
-              <w:left w:val="single" w:color="888888" w:sz="1"/>
-              <w:bottom w:val="single" w:color="888888" w:sz="1"/>
-              <w:right w:val="single" w:color="888888" w:sz="1"/>
-            </w:tcBorders>
-            <w:tcMar>
-              <w:top w:type="dxa" w:w="60"/>
-              <w:left w:type="dxa" w:w="100"/>
-              <w:bottom w:type="dxa" w:w="60"/>
-              <w:right w:type="dxa" w:w="100"/>
-            </w:tcMar>
-          </w:tcPr>
-          <w:p>
-            <w:pPr>
-              <w:spacing w:after="0" w:before="0" w:line="240"/>
-              <w:jc w:val="center"/>
-            </w:pPr>
-            <w:r>
-              <w:rPr>
-                <w:rFonts w:ascii="Times New Roman" w:cs="Times New Roman" w:eastAsia="Times New Roman" w:hAnsi="Times New Roman"/>
-                <w:sz w:val="20"/>
-                <w:szCs w:val="20"/>
-              </w:rPr>
-              <w:t xml:space="preserve">0.06</w:t>
-            </w:r>
-          </w:p>
-        </w:tc>
-        <w:tc>
-          <w:tcPr>
-            <w:tcW w:type="dxa" w:w="1300"/>
-            <w:tcBorders>
-              <w:top w:val="single" w:color="888888" w:sz="1"/>
-              <w:left w:val="single" w:color="888888" w:sz="1"/>
-              <w:bottom w:val="single" w:color="888888" w:sz="1"/>
-              <w:right w:val="single" w:color="888888" w:sz="1"/>
-            </w:tcBorders>
-            <w:tcMar>
-              <w:top w:type="dxa" w:w="60"/>
-              <w:left w:type="dxa" w:w="100"/>
-              <w:bottom w:type="dxa" w:w="60"/>
-              <w:right w:type="dxa" w:w="100"/>
-            </w:tcMar>
-          </w:tcPr>
-          <w:p>
-            <w:pPr>
-              <w:spacing w:after="0" w:before="0" w:line="240"/>
-              <w:jc w:val="center"/>
-            </w:pPr>
-            <w:r>
-              <w:rPr>
-                <w:rFonts w:ascii="Times New Roman" w:cs="Times New Roman" w:eastAsia="Times New Roman" w:hAnsi="Times New Roman"/>
-                <w:sz w:val="20"/>
-                <w:szCs w:val="20"/>
-              </w:rPr>
-              <w:t xml:space="preserve">[0.22, 0.47]</w:t>
-            </w:r>
-          </w:p>
-        </w:tc>
-        <w:tc>
-          <w:tcPr>
-            <w:tcW w:type="dxa" w:w="2260"/>
-            <w:tcBorders>
-              <w:top w:val="single" w:color="888888" w:sz="1"/>
-              <w:left w:val="single" w:color="888888" w:sz="1"/>
-              <w:bottom w:val="single" w:color="888888" w:sz="1"/>
-              <w:right w:val="single" w:color="888888" w:sz="1"/>
-            </w:tcBorders>
-            <w:tcMar>
-              <w:top w:type="dxa" w:w="60"/>
-              <w:left w:type="dxa" w:w="100"/>
-              <w:bottom w:type="dxa" w:w="60"/>
-              <w:right w:type="dxa" w:w="100"/>
-            </w:tcMar>
-          </w:tcPr>
-          <w:p>
-            <w:pPr>
-              <w:spacing w:after="0" w:before="0" w:line="240"/>
-              <w:jc w:val="center"/>
-            </w:pPr>
-            <w:r>
-              <w:rPr>
-                <w:rFonts w:ascii="Times New Roman" w:cs="Times New Roman" w:eastAsia="Times New Roman" w:hAnsi="Times New Roman"/>
-                <w:sz w:val="20"/>
-                <w:szCs w:val="20"/>
-              </w:rPr>
-              <w:t xml:space="preserve">&lt; .001</w:t>
-            </w:r>
-          </w:p>
-        </w:tc>
-      </w:tr>
-      <w:tr>
-        <w:tc>
-          <w:tcPr>
-            <w:tcW w:type="dxa" w:w="2400"/>
-            <w:tcBorders>
-              <w:top w:val="single" w:color="888888" w:sz="1"/>
-              <w:left w:val="single" w:color="888888" w:sz="1"/>
-              <w:bottom w:val="single" w:color="888888" w:sz="1"/>
-              <w:right w:val="single" w:color="888888" w:sz="1"/>
-            </w:tcBorders>
-            <w:tcMar>
-              <w:top w:type="dxa" w:w="60"/>
-              <w:left w:type="dxa" w:w="100"/>
-              <w:bottom w:type="dxa" w:w="60"/>
-              <w:right w:type="dxa" w:w="100"/>
-            </w:tcMar>
-          </w:tcPr>
-          <w:p>
-            <w:pPr>
-              <w:spacing w:after="0" w:before="0" w:line="240"/>
-              <w:jc w:val="left"/>
-            </w:pPr>
-            <w:r>
-              <w:rPr>
-                <w:rFonts w:ascii="Times New Roman" w:cs="Times New Roman" w:eastAsia="Times New Roman" w:hAnsi="Times New Roman"/>
-                <w:sz w:val="20"/>
-                <w:szCs w:val="20"/>
-              </w:rPr>
-              <w:t xml:space="preserve">Metacognition (centered)</w:t>
-            </w:r>
-          </w:p>
-        </w:tc>
-        <w:tc>
-          <w:tcPr>
-            <w:tcW w:type="dxa" w:w="1300"/>
-            <w:tcBorders>
-              <w:top w:val="single" w:color="888888" w:sz="1"/>
-              <w:left w:val="single" w:color="888888" w:sz="1"/>
-              <w:bottom w:val="single" w:color="888888" w:sz="1"/>
-              <w:right w:val="single" w:color="888888" w:sz="1"/>
-            </w:tcBorders>
-            <w:tcMar>
-              <w:top w:type="dxa" w:w="60"/>
-              <w:left w:type="dxa" w:w="100"/>
-              <w:bottom w:type="dxa" w:w="60"/>
-              <w:right w:type="dxa" w:w="100"/>
-            </w:tcMar>
-          </w:tcPr>
-          <w:p>
-            <w:pPr>
-              <w:spacing w:after="0" w:before="0" w:line="240"/>
-              <w:jc w:val="center"/>
-            </w:pPr>
-            <w:r>
-              <w:rPr>
-                <w:rFonts w:ascii="Times New Roman" w:cs="Times New Roman" w:eastAsia="Times New Roman" w:hAnsi="Times New Roman"/>
-                <w:sz w:val="20"/>
-                <w:szCs w:val="20"/>
-              </w:rPr>
-              <w:t xml:space="preserve">0.48</w:t>
-            </w:r>
-          </w:p>
-        </w:tc>
-        <w:tc>
-          <w:tcPr>
-            <w:tcW w:type="dxa" w:w="2100"/>
-            <w:tcBorders>
-              <w:top w:val="single" w:color="888888" w:sz="1"/>
-              <w:left w:val="single" w:color="888888" w:sz="1"/>
-              <w:bottom w:val="single" w:color="888888" w:sz="1"/>
-              <w:right w:val="single" w:color="888888" w:sz="1"/>
-            </w:tcBorders>
-            <w:tcMar>
-              <w:top w:type="dxa" w:w="60"/>
-              <w:left w:type="dxa" w:w="100"/>
-              <w:bottom w:type="dxa" w:w="60"/>
-              <w:right w:type="dxa" w:w="100"/>
-            </w:tcMar>
-          </w:tcPr>
-          <w:p>
-            <w:pPr>
-              <w:spacing w:after="0" w:before="0" w:line="240"/>
-              <w:jc w:val="center"/>
-            </w:pPr>
-            <w:r>
-              <w:rPr>
-                <w:rFonts w:ascii="Times New Roman" w:cs="Times New Roman" w:eastAsia="Times New Roman" w:hAnsi="Times New Roman"/>
-                <w:sz w:val="20"/>
-                <w:szCs w:val="20"/>
-              </w:rPr>
-              <w:t xml:space="preserve">0.07</w:t>
-            </w:r>
-          </w:p>
-        </w:tc>
-        <w:tc>
-          <w:tcPr>
-            <w:tcW w:type="dxa" w:w="1300"/>
-            <w:tcBorders>
-              <w:top w:val="single" w:color="888888" w:sz="1"/>
-              <w:left w:val="single" w:color="888888" w:sz="1"/>
-              <w:bottom w:val="single" w:color="888888" w:sz="1"/>
-              <w:right w:val="single" w:color="888888" w:sz="1"/>
-            </w:tcBorders>
-            <w:tcMar>
-              <w:top w:type="dxa" w:w="60"/>
-              <w:left w:type="dxa" w:w="100"/>
-              <w:bottom w:type="dxa" w:w="60"/>
-              <w:right w:type="dxa" w:w="100"/>
-            </w:tcMar>
-          </w:tcPr>
-          <w:p>
-            <w:pPr>
-              <w:spacing w:after="0" w:before="0" w:line="240"/>
-              <w:jc w:val="center"/>
-            </w:pPr>
-            <w:r>
-              <w:rPr>
-                <w:rFonts w:ascii="Times New Roman" w:cs="Times New Roman" w:eastAsia="Times New Roman" w:hAnsi="Times New Roman"/>
-                <w:sz w:val="20"/>
-                <w:szCs w:val="20"/>
-              </w:rPr>
-              <w:t xml:space="preserve">[0.34, 0.62]</w:t>
-            </w:r>
-          </w:p>
-        </w:tc>
-        <w:tc>
-          <w:tcPr>
-            <w:tcW w:type="dxa" w:w="2260"/>
-            <w:tcBorders>
-              <w:top w:val="single" w:color="888888" w:sz="1"/>
-              <w:left w:val="single" w:color="888888" w:sz="1"/>
-              <w:bottom w:val="single" w:color="888888" w:sz="1"/>
-              <w:right w:val="single" w:color="888888" w:sz="1"/>
-            </w:tcBorders>
-            <w:tcMar>
-              <w:top w:type="dxa" w:w="60"/>
-              <w:left w:type="dxa" w:w="100"/>
-              <w:bottom w:type="dxa" w:w="60"/>
-              <w:right w:type="dxa" w:w="100"/>
-            </w:tcMar>
-          </w:tcPr>
-          <w:p>
-            <w:pPr>
-              <w:spacing w:after="0" w:before="0" w:line="240"/>
-              <w:jc w:val="center"/>
-            </w:pPr>
-            <w:r>
-              <w:rPr>
-                <w:rFonts w:ascii="Times New Roman" w:cs="Times New Roman" w:eastAsia="Times New Roman" w:hAnsi="Times New Roman"/>
-                <w:sz w:val="20"/>
-                <w:szCs w:val="20"/>
-              </w:rPr>
-              <w:t xml:space="preserve">&lt; .001</w:t>
-            </w:r>
-          </w:p>
-        </w:tc>
-      </w:tr>
-      <w:tr>
-        <w:tc>
-          <w:tcPr>
-            <w:tcW w:type="dxa" w:w="2400"/>
-            <w:tcBorders>
-              <w:top w:val="single" w:color="888888" w:sz="1"/>
-              <w:left w:val="single" w:color="888888" w:sz="1"/>
-              <w:bottom w:val="single" w:color="888888" w:sz="1"/>
-              <w:right w:val="single" w:color="888888" w:sz="1"/>
-            </w:tcBorders>
-            <w:tcMar>
-              <w:top w:type="dxa" w:w="60"/>
-              <w:left w:type="dxa" w:w="100"/>
-              <w:bottom w:type="dxa" w:w="60"/>
-              <w:right w:type="dxa" w:w="100"/>
-            </w:tcMar>
-          </w:tcPr>
-          <w:p>
-            <w:pPr>
-              <w:spacing w:after="0" w:before="0" w:line="240"/>
-              <w:jc w:val="left"/>
-            </w:pPr>
-            <w:r>
-              <w:rPr>
-                <w:rFonts w:ascii="Times New Roman" w:cs="Times New Roman" w:eastAsia="Times New Roman" w:hAnsi="Times New Roman"/>
-                <w:sz w:val="20"/>
-                <w:szCs w:val="20"/>
-              </w:rPr>
-              <w:t xml:space="preserve">Melatonin</w:t>
-            </w:r>
-          </w:p>
-        </w:tc>
-        <w:tc>
-          <w:tcPr>
-            <w:tcW w:type="dxa" w:w="1300"/>
-            <w:tcBorders>
-              <w:top w:val="single" w:color="888888" w:sz="1"/>
-              <w:left w:val="single" w:color="888888" w:sz="1"/>
-              <w:bottom w:val="single" w:color="888888" w:sz="1"/>
-              <w:right w:val="single" w:color="888888" w:sz="1"/>
-            </w:tcBorders>
-            <w:tcMar>
-              <w:top w:type="dxa" w:w="60"/>
-              <w:left w:type="dxa" w:w="100"/>
-              <w:bottom w:type="dxa" w:w="60"/>
-              <w:right w:type="dxa" w:w="100"/>
-            </w:tcMar>
-          </w:tcPr>
-          <w:p>
-            <w:pPr>
-              <w:spacing w:after="0" w:before="0" w:line="240"/>
-              <w:jc w:val="center"/>
-            </w:pPr>
-            <w:r>
-              <w:rPr>
-                <w:rFonts w:ascii="Times New Roman" w:cs="Times New Roman" w:eastAsia="Times New Roman" w:hAnsi="Times New Roman"/>
-                <w:sz w:val="20"/>
-                <w:szCs w:val="20"/>
-              </w:rPr>
-              <w:t xml:space="preserve">0.04</w:t>
-            </w:r>
-          </w:p>
-        </w:tc>
-        <w:tc>
-          <w:tcPr>
-            <w:tcW w:type="dxa" w:w="2100"/>
-            <w:tcBorders>
-              <w:top w:val="single" w:color="888888" w:sz="1"/>
-              <w:left w:val="single" w:color="888888" w:sz="1"/>
-              <w:bottom w:val="single" w:color="888888" w:sz="1"/>
-              <w:right w:val="single" w:color="888888" w:sz="1"/>
-            </w:tcBorders>
-            <w:tcMar>
-              <w:top w:type="dxa" w:w="60"/>
-              <w:left w:type="dxa" w:w="100"/>
-              <w:bottom w:type="dxa" w:w="60"/>
-              <w:right w:type="dxa" w:w="100"/>
-            </w:tcMar>
-          </w:tcPr>
-          <w:p>
-            <w:pPr>
-              <w:spacing w:after="0" w:before="0" w:line="240"/>
-              <w:jc w:val="center"/>
-            </w:pPr>
-            <w:r>
-              <w:rPr>
-                <w:rFonts w:ascii="Times New Roman" w:cs="Times New Roman" w:eastAsia="Times New Roman" w:hAnsi="Times New Roman"/>
-                <w:sz w:val="20"/>
-                <w:szCs w:val="20"/>
-              </w:rPr>
-              <w:t xml:space="preserve">0.64</w:t>
-            </w:r>
-          </w:p>
-        </w:tc>
-        <w:tc>
-          <w:tcPr>
-            <w:tcW w:type="dxa" w:w="1300"/>
-            <w:tcBorders>
-              <w:top w:val="single" w:color="888888" w:sz="1"/>
-              <w:left w:val="single" w:color="888888" w:sz="1"/>
-              <w:bottom w:val="single" w:color="888888" w:sz="1"/>
-              <w:right w:val="single" w:color="888888" w:sz="1"/>
-            </w:tcBorders>
-            <w:tcMar>
-              <w:top w:type="dxa" w:w="60"/>
-              <w:left w:type="dxa" w:w="100"/>
-              <w:bottom w:type="dxa" w:w="60"/>
-              <w:right w:type="dxa" w:w="100"/>
-            </w:tcMar>
-          </w:tcPr>
-          <w:p>
-            <w:pPr>
-              <w:spacing w:after="0" w:before="0" w:line="240"/>
-              <w:jc w:val="center"/>
-            </w:pPr>
-            <w:r>
-              <w:rPr>
-                <w:rFonts w:ascii="Times New Roman" w:cs="Times New Roman" w:eastAsia="Times New Roman" w:hAnsi="Times New Roman"/>
-                <w:sz w:val="20"/>
-                <w:szCs w:val="20"/>
-              </w:rPr>
-              <w:t xml:space="preserve">[−1.22, 1.31]</w:t>
-            </w:r>
-          </w:p>
-        </w:tc>
-        <w:tc>
-          <w:tcPr>
-            <w:tcW w:type="dxa" w:w="2260"/>
-            <w:tcBorders>
-              <w:top w:val="single" w:color="888888" w:sz="1"/>
-              <w:left w:val="single" w:color="888888" w:sz="1"/>
-              <w:bottom w:val="single" w:color="888888" w:sz="1"/>
-              <w:right w:val="single" w:color="888888" w:sz="1"/>
-            </w:tcBorders>
-            <w:tcMar>
-              <w:top w:type="dxa" w:w="60"/>
-              <w:left w:type="dxa" w:w="100"/>
-              <w:bottom w:type="dxa" w:w="60"/>
-              <w:right w:type="dxa" w:w="100"/>
-            </w:tcMar>
-          </w:tcPr>
-          <w:p>
-            <w:pPr>
-              <w:spacing w:after="0" w:before="0" w:line="240"/>
-              <w:jc w:val="center"/>
-            </w:pPr>
-            <w:r>
-              <w:rPr>
-                <w:rFonts w:ascii="Times New Roman" w:cs="Times New Roman" w:eastAsia="Times New Roman" w:hAnsi="Times New Roman"/>
-                <w:sz w:val="20"/>
-                <w:szCs w:val="20"/>
-              </w:rPr>
-              <w:t xml:space="preserve">.946</w:t>
-            </w:r>
-          </w:p>
-        </w:tc>
-      </w:tr>
-    </w:tbl>
-    <w:p>
-      <w:pPr>
-        <w:spacing w:after="180" w:before="0" w:line="480"/>
-        <w:jc w:val="both"/>
-      </w:pPr>
-      <w:r>
-        <w:rPr>
-          <w:rFonts w:ascii="Times New Roman" w:cs="Times New Roman" w:eastAsia="Times New Roman" w:hAnsi="Times New Roman"/>
-          <w:i/>
-          <w:iCs/>
-          <w:sz w:val="20"/>
-          <w:szCs w:val="20"/>
-        </w:rPr>
-        <w:t xml:space="preserve">Note. </w:t>
-      </w:r>
-      <w:r>
-        <w:rPr>
-          <w:rFonts w:ascii="Times New Roman" w:cs="Times New Roman" w:eastAsia="Times New Roman" w:hAnsi="Times New Roman"/>
-          <w:sz w:val="20"/>
-          <w:szCs w:val="20"/>
-        </w:rPr>
-        <w:t xml:space="preserve">n = 144 momentary observations nested within 53 days (Day 18–70; 27 control, 26 melatonin). Random intercept for day: variance = 0.74; within-day residual variance = 12.71. Marginal R² = .50; conditional R² = .52. Agency and metacognition centered at their sample means (77.98 and 79.57). Fit by REML in lme4; 95% CIs are Wald intervals; p-values use the Satterthwaite approximation.</w:t>
-      </w:r>
-    </w:p>
-    <w:p>
-      <w:pPr>
-        <w:pStyle w:val="Heading1"/>
-        <w:spacing w:after="240" w:before="360" w:line="480"/>
-      </w:pPr>
-      <w:r>
-        <w:rPr>
-          <w:rFonts w:ascii="Times New Roman" w:cs="Times New Roman" w:eastAsia="Times New Roman" w:hAnsi="Times New Roman"/>
-          <w:b/>
-          <w:bCs/>
-          <w:sz w:val="28"/>
-          <w:szCs w:val="28"/>
-        </w:rPr>
-        <w:t xml:space="preserve">Appendix C. Secondary Analyses</w:t>
-      </w:r>
-    </w:p>
-    <w:p>
-      <w:pPr>
-        <w:spacing w:after="120" w:before="0" w:line="480"/>
-        <w:jc w:val="both"/>
-      </w:pPr>
-      <w:r>
-        <w:rPr>
-          <w:rFonts w:ascii="Times New Roman" w:cs="Times New Roman" w:eastAsia="Times New Roman" w:hAnsi="Times New Roman"/>
-          <w:sz w:val="24"/>
-          <w:szCs w:val="24"/>
-        </w:rPr>
-        <w:t xml:space="preserve">This appendix reports the analyses referred to in Sections 3.3 and 4.1 as secondary or exploratory: the full variability statistics, the state-dependent decay check, and the metacontrol interaction.</w:t>
+        <w:t xml:space="preserve">C.1 Full variability statistics</w:t>
+      </w:r>
+    </w:p>
+    <w:p>
+      <w:pPr>
+        <w:spacing w:after="120" w:before="0" w:line="480"/>
+        <w:jc w:val="both"/>
+      </w:pPr>
+      <w:r>
+        <w:rPr>
+          <w:rFonts w:ascii="Times New Roman" w:cs="Times New Roman" w:eastAsia="Times New Roman" w:hAnsi="Times New Roman"/>
+          <w:sz w:val="24"/>
+          <w:szCs w:val="24"/>
+        </w:rPr>
+        <w:t xml:space="preserve">Four indices of mood variability were computed. Three descriptive indices pointed in the same direction, with melatonin days showing lower variability than control days: daily mood SD was 4.45 against 6.41; MSSD across within-condition runs was 57.35 against 88.26; and observation-level mood SD was 6.54 against 8.26. The two univariate tests did not reach conventional significance: the Brown-Forsythe Levene test of homogeneity of variance gave W = 1.94, p = .168, and the MSSD comparison gave Welch t = −0.94, p = .355. The heteroskedasticity model regressing log-squared M2 residuals on the melatonin indicator yielded a negative coefficient that also fell short of conventional significance (α₁ = −1.11, 95% CI [−2.31, +0.10], p = .071), with the point estimate indicating smaller model residual variance on melatonin days.</w:t>
+      </w:r>
+    </w:p>
+    <w:p>
+      <w:pPr>
+        <w:spacing w:after="120" w:before="0" w:line="480"/>
+        <w:jc w:val="both"/>
+      </w:pPr>
+      <w:r>
+        <w:rPr>
+          <w:rFonts w:ascii="Times New Roman" w:cs="Times New Roman" w:eastAsia="Times New Roman" w:hAnsi="Times New Roman"/>
+          <w:sz w:val="24"/>
+          <w:szCs w:val="24"/>
+        </w:rPr>
+        <w:t xml:space="preserve">The collective pattern is direction-consistent across the indices without any single test reaching conventional significance. It is suggestive of a stability-enhancing effect of the probe on the trajectory without a shift in its level, but the inferential support for any single test is modest, and the analysis cannot rule out that the heteroskedasticity result is a chance product of multiple testing.</w:t>
       </w:r>
     </w:p>
     <w:p>
@@ -8608,35 +7152,35 @@
           <w:sz w:val="26"/>
           <w:szCs w:val="26"/>
         </w:rPr>
-        <w:t xml:space="preserve">C.1 Full variability statistics</w:t>
-      </w:r>
-    </w:p>
-    <w:p>
-      <w:pPr>
-        <w:spacing w:after="120" w:before="0" w:line="480"/>
-        <w:jc w:val="both"/>
-      </w:pPr>
-      <w:r>
-        <w:rPr>
-          <w:rFonts w:ascii="Times New Roman" w:cs="Times New Roman" w:eastAsia="Times New Roman" w:hAnsi="Times New Roman"/>
-          <w:sz w:val="24"/>
-          <w:szCs w:val="24"/>
-        </w:rPr>
-        <w:t xml:space="preserve">Four indices of mood variability were computed. Three descriptive indices pointed in the same direction, with melatonin days showing lower variability than control days: daily mood SD was 4.45 against 6.41; MSSD across within-condition runs was 57.35 against 88.26; and observation-level mood SD was 6.54 against 8.26. The two univariate tests did not reach conventional significance: the Brown-Forsythe Levene test of homogeneity of variance gave W = 1.94, p = .168, and the MSSD comparison gave Welch t = −0.94, p = .355. The heteroskedasticity model regressing log-squared M2 residuals on the melatonin indicator yielded a negative coefficient that also fell short of conventional significance (α₁ = −1.11, 95% CI [−2.31, +0.10], p = .071), with the point estimate indicating smaller model residual variance on melatonin days.</w:t>
-      </w:r>
-    </w:p>
-    <w:p>
-      <w:pPr>
-        <w:spacing w:after="120" w:before="0" w:line="480"/>
-        <w:jc w:val="both"/>
-      </w:pPr>
-      <w:r>
-        <w:rPr>
-          <w:rFonts w:ascii="Times New Roman" w:cs="Times New Roman" w:eastAsia="Times New Roman" w:hAnsi="Times New Roman"/>
-          <w:sz w:val="24"/>
-          <w:szCs w:val="24"/>
-        </w:rPr>
-        <w:t xml:space="preserve">The collective pattern is direction-consistent across the indices without any single test reaching conventional significance. It is suggestive of a stability-enhancing effect of the probe on the trajectory without a shift in its level, but the inferential support for any single test is modest, and the analysis cannot rule out that the heteroskedasticity result is a chance product of multiple testing.</w:t>
+        <w:t xml:space="preserve">C.2 State-dependent decay</w:t>
+      </w:r>
+    </w:p>
+    <w:p>
+      <w:pPr>
+        <w:spacing w:after="120" w:before="0" w:line="480"/>
+        <w:jc w:val="both"/>
+      </w:pPr>
+      <w:r>
+        <w:rPr>
+          <w:rFonts w:ascii="Times New Roman" w:cs="Times New Roman" w:eastAsia="Times New Roman" w:hAnsi="Times New Roman"/>
+          <w:sz w:val="24"/>
+          <w:szCs w:val="24"/>
+        </w:rPr>
+        <w:t>The method for this analysis is given in Section 2.5.7.</w:t>
+      </w:r>
+    </w:p>
+    <w:p>
+      <w:pPr>
+        <w:spacing w:after="120" w:before="0" w:line="480"/>
+        <w:jc w:val="both"/>
+      </w:pPr>
+      <w:r>
+        <w:rPr>
+          <w:rFonts w:ascii="Times New Roman" w:cs="Times New Roman" w:eastAsia="Times New Roman" w:hAnsi="Times New Roman"/>
+          <w:sz w:val="24"/>
+          <w:szCs w:val="24"/>
+        </w:rPr>
+        <w:t xml:space="preserve">The interaction-augmented AR(1) yielded φ_control = 0.48 and φ_melatonin = 0.22, with a lag-1 by melatonin interaction coefficient of δ = −0.25, 95% CI [−0.79, +0.28], p = .343. The coefficient is not statistically distinguishable from zero. Its direction, faster decay on melatonin days, is consistent with the variability pattern in C.1.</w:t>
       </w:r>
     </w:p>
     <w:p>
@@ -8652,78 +7196,6 @@
           <w:sz w:val="26"/>
           <w:szCs w:val="26"/>
         </w:rPr>
-        <w:t xml:space="preserve">C.2 State-dependent decay</w:t>
-      </w:r>
-    </w:p>
-    <w:p>
-      <w:pPr>
-        <w:spacing w:after="120" w:before="0" w:line="480"/>
-        <w:jc w:val="both"/>
-      </w:pPr>
-      <w:r>
-        <w:rPr>
-          <w:rFonts w:ascii="Times New Roman" w:cs="Times New Roman" w:eastAsia="Times New Roman" w:hAnsi="Times New Roman"/>
-          <w:sz w:val="24"/>
-          <w:szCs w:val="24"/>
-        </w:rPr>
-        <w:t xml:space="preserve">Method</w:t>
-      </w:r>
-    </w:p>
-    <w:p>
-      <w:pPr>
-        <w:spacing w:after="120" w:before="0" w:line="480"/>
-        <w:jc w:val="both"/>
-      </w:pPr>
-      <w:r>
-        <w:rPr>
-          <w:rFonts w:ascii="Times New Roman" w:cs="Times New Roman" w:eastAsia="Times New Roman" w:hAnsi="Times New Roman"/>
-          <w:sz w:val="24"/>
-          <w:szCs w:val="24"/>
-        </w:rPr>
-        <w:t xml:space="preserve">To examine whether the AR(1) decay rate itself differs by condition, the M0 specification was augmented with a melatonin × moodₜ₋₁ interaction: moodₜ = α + φ₀ · moodₜ₋₁ + β · melatoninₜ + δ · (melatoninₜ × moodₜ₋₁) + εₜ. The implied φ is φ₀ in the control condition and φ₀ + δ on melatonin days. A negative δ would indicate faster decay of perturbations on melatonin days. Given the sample size available for an interaction of this kind, this analysis is a sensitivity check rather than a primary test.</w:t>
-      </w:r>
-    </w:p>
-    <w:p>
-      <w:pPr>
-        <w:spacing w:after="120" w:before="0" w:line="480"/>
-        <w:jc w:val="both"/>
-      </w:pPr>
-      <w:r>
-        <w:rPr>
-          <w:rFonts w:ascii="Times New Roman" w:cs="Times New Roman" w:eastAsia="Times New Roman" w:hAnsi="Times New Roman"/>
-          <w:sz w:val="24"/>
-          <w:szCs w:val="24"/>
-        </w:rPr>
-        <w:t xml:space="preserve">Results</w:t>
-      </w:r>
-    </w:p>
-    <w:p>
-      <w:pPr>
-        <w:spacing w:after="120" w:before="0" w:line="480"/>
-        <w:jc w:val="both"/>
-      </w:pPr>
-      <w:r>
-        <w:rPr>
-          <w:rFonts w:ascii="Times New Roman" w:cs="Times New Roman" w:eastAsia="Times New Roman" w:hAnsi="Times New Roman"/>
-          <w:sz w:val="24"/>
-          <w:szCs w:val="24"/>
-        </w:rPr>
-        <w:t xml:space="preserve">The interaction-augmented AR(1) yielded φ_control = 0.48 and φ_melatonin = 0.22, with a lag-1 by melatonin interaction coefficient of δ = −0.25, 95% CI [−0.79, +0.28], p = .343. The coefficient is not statistically distinguishable from zero. Its direction, faster decay on melatonin days, is consistent with the variability pattern in C.1.</w:t>
-      </w:r>
-    </w:p>
-    <w:p>
-      <w:pPr>
-        <w:pStyle w:val="Heading2"/>
-        <w:spacing w:after="120" w:before="240" w:line="480"/>
-      </w:pPr>
-      <w:r>
-        <w:rPr>
-          <w:rFonts w:ascii="Times New Roman" w:cs="Times New Roman" w:eastAsia="Times New Roman" w:hAnsi="Times New Roman"/>
-          <w:b/>
-          <w:bCs/>
-          <w:sz w:val="26"/>
-          <w:szCs w:val="26"/>
-        </w:rPr>
         <w:t xml:space="preserve">C.3 Metacontrol interaction</w:t>
       </w:r>
     </w:p>
@@ -8738,63 +7210,21 @@
           <w:sz w:val="24"/>
           <w:szCs w:val="24"/>
         </w:rPr>
-        <w:t xml:space="preserve">Method</w:t>
-      </w:r>
-    </w:p>
-    <w:p>
-      <w:pPr>
-        <w:spacing w:after="120" w:before="0" w:line="480"/>
-        <w:jc w:val="both"/>
-      </w:pPr>
-      <w:r>
-        <w:rPr>
-          <w:rFonts w:ascii="Times New Roman" w:cs="Times New Roman" w:eastAsia="Times New Roman" w:hAnsi="Times New Roman"/>
-          <w:sz w:val="24"/>
-          <w:szCs w:val="24"/>
-        </w:rPr>
-        <w:t xml:space="preserve">The metacontrol hypothesis, that metacognitive awareness moderates the system’s responsiveness to external perturbation, was tested by adding a melatonin × metacognition interaction with metacognition mean-centered: moodₜ = α + φ · moodₜ₋₁ + β₁ · melatoninₜ + β₂ · meta_cₜ + β₃ · (melatoninₜ × meta_cₜ) + εₜ. A negative β₃ is predicted. Simple slopes for melatonin were computed at −1 SD, the mean, and +1 SD of metacognition.</w:t>
-      </w:r>
-    </w:p>
-    <w:p>
-      <w:pPr>
-        <w:spacing w:after="120" w:before="0" w:line="480"/>
-        <w:jc w:val="both"/>
-      </w:pPr>
-      <w:r>
-        <w:rPr>
-          <w:rFonts w:ascii="Times New Roman" w:cs="Times New Roman" w:eastAsia="Times New Roman" w:hAnsi="Times New Roman"/>
-          <w:sz w:val="24"/>
-          <w:szCs w:val="24"/>
-        </w:rPr>
-        <w:t xml:space="preserve">Results</w:t>
-      </w:r>
-    </w:p>
-    <w:p>
-      <w:pPr>
-        <w:spacing w:after="120" w:before="0" w:line="480"/>
-        <w:jc w:val="both"/>
-      </w:pPr>
-      <w:r>
-        <w:rPr>
-          <w:rFonts w:ascii="Times New Roman" w:cs="Times New Roman" w:eastAsia="Times New Roman" w:hAnsi="Times New Roman"/>
-          <w:sz w:val="24"/>
-          <w:szCs w:val="24"/>
-        </w:rPr>
-        <w:t xml:space="preserve">The interaction term was negative as predicted (β₃ = −0.13) but not reliably distinguishable from zero (95% CI [−0.59, +0.33], p = .564). Simple-slope decomposition placed the melatonin slope at +0.66 at one standard deviation below mean metacognition, +0.17 at the mean, and −0.31 at one standard deviation above. The qualitative pattern is consistent with the hypothesis, since the apparent direction of the melatonin effect reverses across the metacognition continuum, but the sample is underpowered to support this as an inferential claim. The Bayesian counterpart in Appendix B agrees in direction and is likewise inconclusive.</w:t>
-      </w:r>
-    </w:p>
-    <w:p>
-      <w:pPr>
-        <w:spacing w:after="120" w:before="0" w:line="480"/>
-        <w:jc w:val="both"/>
-      </w:pPr>
-      <w:r>
-        <w:rPr>
-          <w:rFonts w:ascii="Times New Roman" w:cs="Times New Roman" w:eastAsia="Times New Roman" w:hAnsi="Times New Roman"/>
-          <w:sz w:val="24"/>
-          <w:szCs w:val="24"/>
-        </w:rPr>
-        <w:t xml:space="preserve">The agency × melatonin robustness check yielded an interaction coefficient indistinguishable from zero (β = −0.05, 95% CI [−0.41, +0.31], p = .791), indicating that the agency-mood relation was statistically identical in the two conditions.</w:t>
+        <w:t>The method for this analysis is given in Section 2.5.5.</w:t>
+      </w:r>
+    </w:p>
+    <w:p>
+      <w:pPr>
+        <w:spacing w:after="120" w:before="0" w:line="480"/>
+        <w:jc w:val="both"/>
+      </w:pPr>
+      <w:r>
+        <w:rPr>
+          <w:rFonts w:ascii="Times New Roman" w:cs="Times New Roman" w:eastAsia="Times New Roman" w:hAnsi="Times New Roman"/>
+          <w:sz w:val="24"/>
+          <w:szCs w:val="24"/>
+        </w:rPr>
+        <w:t>The interaction term was negative as predicted (β₃ = −0.13) but not reliably distinguishable from zero (95% CI [−0.59, +0.33], p = .564). Simple-slope decomposition placed the melatonin slope at +0.66 at one standard deviation below mean metacognition, +0.17 at the mean, and −0.31 at one standard deviation above. The qualitative pattern is consistent with the hypothesis, since the apparent direction of the melatonin effect reverses across the metacognition continuum, but the sample is underpowered to support this as an inferential claim.</w:t>
       </w:r>
     </w:p>
     <w:sectPr>

</xml_diff>

<commit_message>
align the title page consistently
The affiliation and correspondence lines were the only paragraphs on the
title page still left-aligned and single-spaced, so they sat as a dense
slab under the centered title, name and date. Both now match their
neighbours in alignment and line spacing.

Also fixed a stray straight apostrophe in Section 3.1.
</commit_message>
<xml_diff>
--- a/paper/manuscript.docx
+++ b/paper/manuscript.docx
@@ -54,11 +54,19 @@
       </w:r>
     </w:p>
     <w:p>
+      <w:pPr>
+        <w:spacing w:line="480" w:lineRule="auto" w:after="120"/>
+        <w:jc w:val="center"/>
+      </w:pPr>
       <w:r>
         <w:t>Graduate School of Education, University of Pennsylvania, Philadelphia, Pennsylvania, United States</w:t>
       </w:r>
     </w:p>
     <w:p>
+      <w:pPr>
+        <w:spacing w:line="480" w:lineRule="auto" w:after="120"/>
+        <w:jc w:val="center"/>
+      </w:pPr>
       <w:r>
         <w:t>Correspondence: Miura Meng, Graduate School of Education, University of Pennsylvania, 3700 Walnut Street, Philadelphia, PA 19104, United States. Email: meng10@upenn.edu. Telephone: +1 (773) 406-8649.</w:t>
       </w:r>
@@ -1633,7 +1641,7 @@
           <w:sz w:val="24"/>
           <w:szCs w:val="24"/>
         </w:rPr>
-        <w:t>The raw EMA log contained 195 records. Of these, 193 filled one of the 210 prompt slots planned across the 70-day study window (2026-02-18 to 2026-04-29), a scheduled-response compliance of 91.9% (55 study days with three scheduled observations, 13 with two, and 2 with one). Two further records were entered on April 3, after that study day's three prompts had been completed the previous day; they remain in the archived raw log and were excluded from all analyses. As described in Section 2.3, the protocol’s 70-day randomized schedule yielded 35 control and 35 melatonin study days. Within the Day 18–70 window in which agency and metacognition were also collected, 27 control and 26 melatonin days yielded 142 complete observations.</w:t>
+        <w:t>The raw EMA log contained 195 records. Of these, 193 filled one of the 210 prompt slots planned across the 70-day study window (2026-02-18 to 2026-04-29), a scheduled-response compliance of 91.9% (55 study days with three scheduled observations, 13 with two, and 2 with one). Two further records were entered on April 3, after that study day’s three prompts had been completed the previous day; they remain in the archived raw log and were excluded from all analyses. As described in Section 2.3, the protocol’s 70-day randomized schedule yielded 35 control and 35 melatonin study days. Within the Day 18–70 window in which agency and metacognition were also collected, 27 control and 26 melatonin days yielded 142 complete observations.</w:t>
       </w:r>
     </w:p>
     <w:p>

</xml_diff>